<commit_message>
Lecture v2: graduate-level deck with avocado shelf-life running example
- 19 slides + 7 backup: Itô toolkit, pathwise vs score-function gradients,
  stochastic adjoint (Stratonovich drift), latent-SDE ELBO via Girsanov,
  diffusion as neural SDEs, open problems; derivations in backup
- Running example on the 'Hass' Avocado Ripening Photographic Dataset;
  placeholders for photos, encoder and results
- Speaker notes with timestamps and "if asked" answers
- Reading guide: equations in plain words, Q&A, placeholder to-do list

Co-Authored-By: Claude Opus 5.5 <noreply@anthropic.com>
Claude-Session: https://claude.ai/code/session_01D9oC41NzS6vwYLC8b14vHG
</commit_message>
<xml_diff>
--- a/lecture/neural_sde_reading_guide.docx
+++ b/lecture/neural_sde_reading_guide.docx
@@ -40,13 +40,13 @@
           <w:b/>
           <w:bCs/>
         </w:rPr>
-        <w:t xml:space="preserve">Backprop Through Continuous Time: Neural ODEs, Neural SDEs, and the Diffusion Models Built on Them</w:t>
-      </w:r>
-      <w:r>
-        <w:rPr>
-          <w:color w:val="6B7280"/>
-        </w:rPr>
-        <w:t xml:space="preserve">   ·   Nishad Wajge</w:t>
+        <w:t xml:space="preserve">Backprop Through Continuous Time: Neural SDEs: Modeling, Gradients, and Training</w:t>
+      </w:r>
+      <w:r>
+        <w:rPr>
+          <w:color w:val="6B7280"/>
+        </w:rPr>
+        <w:t xml:space="preserve">   ·   Running example: avocado shelf life   ·   Nishad Wajge</w:t>
       </w:r>
     </w:p>
     <w:p>
@@ -54,7 +54,7 @@
         <w:spacing w:after="120"/>
       </w:pPr>
       <w:r>
-        <w:t xml:space="preserve">Part 1 is the reading list for the class, ready to send to Prof. Lin and post with the slides. Part 2 is your own prep plan: what to read and watch, in order. Part 3 is the questions you should be able to answer cold.</w:t>
+        <w:t xml:space="preserve">Part 1 is the reading list for the class, ready to post with the slides. Part 2 is your prep plan, ordered to match the deck. Part 3 explains every equation on the slides in plain words. Part 4 is the questions you should be able to answer cold. Part 5 lists what's still a placeholder.</w:t>
       </w:r>
     </w:p>
     <w:p>
@@ -100,7 +100,7 @@
         <w:t xml:space="preserve">style and clarity 20%</w:t>
       </w:r>
       <w:r>
-        <w:t xml:space="preserve">. Length isn't stated; last year's schedule fit two or three talks into each 75-minute class, so the deck is built for about 20 minutes plus 5 of discussion.</w:t>
+        <w:t xml:space="preserve">. Length isn't stated; last year's schedule fit two or three talks per 75-minute class. The deck runs about 24 minutes plus 5 of discussion, and slides 14 and 17 can be skipped to fit 20.</w:t>
       </w:r>
     </w:p>
     <w:tbl>
@@ -232,7 +232,7 @@
                 <w:b/>
                 <w:bCs/>
               </w:rPr>
-              <w:t xml:space="preserve">Send topic + reading list to Prof. Lin</w:t>
+              <w:t xml:space="preserve">Topic + reading list to Prof. Lin</w:t>
             </w:r>
           </w:p>
         </w:tc>
@@ -254,12 +254,7 @@
           </w:tcPr>
           <w:p>
             <w:r>
-              <w:rPr>
-                <w:b/>
-                <w:bCs/>
-                <w:color w:val="C8102E"/>
-              </w:rPr>
-              <w:t xml:space="preserve">Oct 9 (passed)</w:t>
+              <w:t xml:space="preserve">Was due Oct 9</w:t>
             </w:r>
           </w:p>
         </w:tc>
@@ -281,7 +276,7 @@
           </w:tcPr>
           <w:p>
             <w:r>
-              <w:t xml:space="preserve">Send today. Paste Part 1 into the email.</w:t>
+              <w:t xml:space="preserve">If not already sent, send Part 1 now.</w:t>
             </w:r>
           </w:p>
         </w:tc>
@@ -417,7 +412,7 @@
           </w:tcPr>
           <w:p>
             <w:r>
-              <w:t xml:space="preserve">Send the .pptx. She gives feedback on this pre-talk.</w:t>
+              <w:t xml:space="preserve">Send the .pptx, placeholders and all; say the results slide is in progress.</w:t>
             </w:r>
           </w:p>
         </w:tc>
@@ -553,7 +548,7 @@
           </w:tcPr>
           <w:p>
             <w:r>
-              <w:t xml:space="preserve">Slides as PowerPoint, readings as PDF, in a public_html subfolder. Email her the exact location and wait for her confirmation.</w:t>
+              <w:t xml:space="preserve">Slides as PowerPoint, readings as PDF, in a public_html subfolder. Email her the exact location.</w:t>
             </w:r>
           </w:p>
         </w:tc>
@@ -566,50 +561,20 @@
     </w:p>
     <w:p>
       <w:pPr>
-        <w:spacing w:after="120"/>
-      </w:pPr>
-      <w:r>
-        <w:rPr>
-          <w:b/>
-          <w:bCs/>
-        </w:rPr>
-        <w:t xml:space="preserve">Short email to send now: </w:t>
-      </w:r>
-    </w:p>
-    <w:p>
-      <w:pPr>
-        <w:pBdr>
-          <w:left w:val="single" w:color="D1D5DB" w:sz="12" w:space="12"/>
-        </w:pBdr>
+        <w:pStyle w:val="Heading1"/>
+      </w:pPr>
+      <w:r>
+        <w:t xml:space="preserve">Part 1. Reading list for the class</w:t>
+      </w:r>
+    </w:p>
+    <w:p>
+      <w:pPr>
         <w:spacing w:after="160"/>
-        <w:ind w:left="360"/>
       </w:pPr>
       <w:r>
         <w:rPr>
           <w:i/>
           <w:iCs/>
-          <w:sz w:val="21"/>
-          <w:szCs w:val="21"/>
-        </w:rPr>
-        <w:t xml:space="preserve">Hi Professor Lin, apologies for missing the Oct 9 topic deadline. I'd like to present "Backprop Through Continuous Time: Neural ODEs, Neural SDEs, and Diffusion Models," focused on adjoint methods for differentiating through ODE/SDE solvers. Proposed readings: Chen et al. 2018 (Neural ODEs) and Li et al. 2020 (Scalable Gradients for SDEs), with Song et al. 2021 as optional. Could we find a time for the 1:1? Thanks, Nishad</w:t>
-      </w:r>
-    </w:p>
-    <w:p>
-      <w:pPr>
-        <w:pStyle w:val="Heading1"/>
-      </w:pPr>
-      <w:r>
-        <w:t xml:space="preserve">Part 1. Reading list for the class</w:t>
-      </w:r>
-    </w:p>
-    <w:p>
-      <w:pPr>
-        <w:spacing w:after="160"/>
-      </w:pPr>
-      <w:r>
-        <w:rPr>
-          <w:i/>
-          <w:iCs/>
           <w:color w:val="6B7280"/>
           <w:sz w:val="20"/>
           <w:szCs w:val="20"/>
@@ -637,7 +602,7 @@
         </w:numPr>
         <w:spacing w:after="20"/>
       </w:pPr>
-      <w:hyperlink w:history="1" r:id="rIdegolygkpzxxzfiveeirl-">
+      <w:hyperlink w:history="1" r:id="rIdmovrdfehzeev-svxpl9ns">
         <w:r>
           <w:rPr>
             <w:rStyle w:val="Hyperlink"/>
@@ -662,7 +627,7 @@
           <w:sz w:val="21"/>
           <w:szCs w:val="21"/>
         </w:rPr>
-        <w:t xml:space="preserve">Read Sections 1–3: the ResNet-to-ODE idea and the adjoint method. Skim the rest. This is the first half of the lecture.</w:t>
+        <w:t xml:space="preserve">Read Sections 1–3: the ResNet-to-ODE idea and the adjoint method. Skim the rest.</w:t>
       </w:r>
     </w:p>
     <w:p>
@@ -676,7 +641,7 @@
         </w:numPr>
         <w:spacing w:after="20"/>
       </w:pPr>
-      <w:hyperlink w:history="1" r:id="rIdn11q7l8sjnrzp9p9wk1ss">
+      <w:hyperlink w:history="1" r:id="rIdejihstkdgyabelbl8fbhs">
         <w:r>
           <w:rPr>
             <w:rStyle w:val="Hyperlink"/>
@@ -701,7 +666,7 @@
           <w:sz w:val="21"/>
           <w:szCs w:val="21"/>
         </w:rPr>
-        <w:t xml:space="preserve">Read the stochastic adjoint and the virtual Brownian tree. Skim the latent-SDE model and experiments. This is the second half of the lecture.</w:t>
+        <w:t xml:space="preserve">Read the stochastic adjoint, the virtual Brownian tree, and the latent SDE (ELBO via Girsanov). These are slides 11 and 13.</w:t>
       </w:r>
     </w:p>
     <w:p>
@@ -724,7 +689,46 @@
         </w:numPr>
         <w:spacing w:after="20"/>
       </w:pPr>
-      <w:hyperlink w:history="1" r:id="rIdlwvesp6jkjfhmsse3hke2">
+      <w:hyperlink w:history="1" r:id="rIdrc3vffbui87xufyh-sj5b">
+        <w:r>
+          <w:rPr>
+            <w:rStyle w:val="Hyperlink"/>
+          </w:rPr>
+          <w:t xml:space="preserve">Monte Carlo Gradient Estimation in Machine Learning</w:t>
+        </w:r>
+      </w:hyperlink>
+      <w:r>
+        <w:rPr>
+          <w:color w:val="6B7280"/>
+        </w:rPr>
+        <w:t xml:space="preserve">  ·  Mohamed, Rosca, Figurnov, Mnih · JMLR 2020</w:t>
+      </w:r>
+    </w:p>
+    <w:p>
+      <w:pPr>
+        <w:spacing w:after="120"/>
+        <w:ind w:left="720"/>
+      </w:pPr>
+      <w:r>
+        <w:rPr>
+          <w:sz w:val="21"/>
+          <w:szCs w:val="21"/>
+        </w:rPr>
+        <w:t xml:space="preserve">Sections on pathwise and score-function estimators. Background for slide 10.</w:t>
+      </w:r>
+    </w:p>
+    <w:p>
+      <w:pPr>
+        <w:pStyle w:val="ListParagraph"/>
+        <w:keepNext/>
+        <w:keepLines/>
+        <w:numPr>
+          <w:ilvl w:val="0"/>
+          <w:numId w:val="2"/>
+        </w:numPr>
+        <w:spacing w:after="20"/>
+      </w:pPr>
+      <w:hyperlink w:history="1" r:id="rIdta7o4s-wz_5xp9l8p-05t">
         <w:r>
           <w:rPr>
             <w:rStyle w:val="Hyperlink"/>
@@ -749,7 +753,7 @@
           <w:sz w:val="21"/>
           <w:szCs w:val="21"/>
         </w:rPr>
-        <w:t xml:space="preserve">Read the SDE framework and the probability-flow ODE section. Shows why diffusion models are neural SDEs.</w:t>
+        <w:t xml:space="preserve">The SDE framework and the probability-flow ODE. Slide 15.</w:t>
       </w:r>
     </w:p>
     <w:p>
@@ -763,7 +767,7 @@
         </w:numPr>
         <w:spacing w:after="20"/>
       </w:pPr>
-      <w:hyperlink w:history="1" r:id="rIdtthscx31zo9ddh8cmlm98">
+      <w:hyperlink w:history="1" r:id="rIda98z4ihsfkr6w7uovnmt2">
         <w:r>
           <w:rPr>
             <w:rStyle w:val="Hyperlink"/>
@@ -788,7 +792,16 @@
           <w:sz w:val="21"/>
           <w:szCs w:val="21"/>
         </w:rPr>
-        <w:t xml:space="preserve">Reversible Heun and the Brownian Interval: exact solver gradients at constant memory.</w:t>
+        <w:t xml:space="preserve">Reversible Heun and the Brownian Interval.</w:t>
+      </w:r>
+    </w:p>
+    <w:p>
+      <w:pPr>
+        <w:pStyle w:val="Heading2"/>
+        <w:keepNext/>
+      </w:pPr>
+      <w:r>
+        <w:t xml:space="preserve">Running-example data</w:t>
       </w:r>
     </w:p>
     <w:p>
@@ -802,19 +815,19 @@
         </w:numPr>
         <w:spacing w:after="20"/>
       </w:pPr>
-      <w:hyperlink w:history="1" r:id="rId1te9dtvn98e0zwzwuuksu">
+      <w:hyperlink w:history="1" r:id="rId9tvc3-cjjlddt_gm-modn">
         <w:r>
           <w:rPr>
             <w:rStyle w:val="Hyperlink"/>
           </w:rPr>
-          <w:t xml:space="preserve">Generative Modeling by Estimating Gradients of the Data Distribution (blog post)</w:t>
+          <w:t xml:space="preserve">'Hass' Avocado Ripening Photographic Dataset</w:t>
         </w:r>
       </w:hyperlink>
       <w:r>
         <w:rPr>
           <w:color w:val="6B7280"/>
         </w:rPr>
-        <w:t xml:space="preserve">  ·  Yang Song · 2021</w:t>
+        <w:t xml:space="preserve">  ·  Mendeley Data · 2024 · doi:10.17632/3xd9n945v8</w:t>
       </w:r>
     </w:p>
     <w:p>
@@ -827,7 +840,7 @@
           <w:sz w:val="21"/>
           <w:szCs w:val="21"/>
         </w:rPr>
-        <w:t xml:space="preserve">The gentlest way into score-based diffusion. Good for anyone without a probability background.</w:t>
+        <w:t xml:space="preserve">478 avocados photographed daily (14,710 images, two sides each), stored at 10 °C, 20 °C or ambient, labeled with a 5-stage ripening index; stage 4 is end of shelf life. Check the license on the page before posting images.</w:t>
       </w:r>
     </w:p>
     <w:p>
@@ -849,7 +862,7 @@
         <w:spacing w:after="80"/>
       </w:pPr>
       <w:r>
-        <w:t xml:space="preserve">When is the adjoint's memory saving worth its gradient error? Where would it matter in your own project?</w:t>
+        <w:t xml:space="preserve">Shelf life is a first-passage time. Smooth surrogate, Brownian-bridge correction, or score function: which would you train with, and why?</w:t>
       </w:r>
     </w:p>
     <w:p>
@@ -862,7 +875,7 @@
         <w:spacing w:after="80"/>
       </w:pPr>
       <w:r>
-        <w:t xml:space="preserve">Diffusion models fix the noise scale and learn only the score. What do we lose by not learning the noise?</w:t>
+        <w:t xml:space="preserve">Diffusion models fix σ; our model learns it. When is learning the noise worth the identifiability trouble?</w:t>
       </w:r>
     </w:p>
     <w:p>
@@ -875,7 +888,7 @@
         <w:spacing w:after="80"/>
       </w:pPr>
       <w:r>
-        <w:t xml:space="preserve">Could a differentiable simulator from this class be made stochastic? What would happen to its gradients?</w:t>
+        <w:t xml:space="preserve">Which differentiable simulator from this course would you make stochastic, and what would happen to its gradients?</w:t>
       </w:r>
     </w:p>
     <w:p>
@@ -891,15 +904,16 @@
         <w:spacing w:after="120"/>
       </w:pPr>
       <w:r>
-        <w:t xml:space="preserve">About 18 hours spread over two weeks. Each stage is something you'll present; the order matches the deck. Where a stage lists a video, watch it before the paper.</w:t>
+        <w:t xml:space="preserve">About 22 hours over two weeks, in deck order. Where a stage lists a video, watch it before the paper.</w:t>
       </w:r>
     </w:p>
     <w:p>
       <w:pPr>
         <w:pStyle w:val="Heading2"/>
-      </w:pPr>
-      <w:r>
-        <w:t xml:space="preserve">Stage 1. SDE basics</w:t>
+        <w:keepNext/>
+      </w:pPr>
+      <w:r>
+        <w:t xml:space="preserve">Stage 1. Neural ODEs and the adjoint</w:t>
       </w:r>
       <w:r>
         <w:rPr>
@@ -909,7 +923,7 @@
           <w:sz w:val="20"/>
           <w:szCs w:val="20"/>
         </w:rPr>
-        <w:t xml:space="preserve">   ~4 hr  ·  slides 7–9</w:t>
+        <w:t xml:space="preserve">   ~4 hr  ·  slides 5–7, A1</w:t>
       </w:r>
     </w:p>
     <w:p>
@@ -923,7 +937,236 @@
         </w:numPr>
         <w:spacing w:after="20"/>
       </w:pPr>
-      <w:hyperlink w:history="1" r:id="rIdpbszod_hnee1owcuzjsje">
+      <w:hyperlink w:history="1" r:id="rId_nemc_qpypud0idaahjai">
+        <w:r>
+          <w:rPr>
+            <w:rStyle w:val="Hyperlink"/>
+          </w:rPr>
+          <w:t xml:space="preserve">Deep Implicit Layers: Neural ODE chapter, with JAX code</w:t>
+        </w:r>
+      </w:hyperlink>
+      <w:r>
+        <w:rPr>
+          <w:color w:val="6B7280"/>
+        </w:rPr>
+        <w:t xml:space="preserve">  ·  Kolter, Duvenaud, Johnson · NeurIPS 2020 tutorial</w:t>
+      </w:r>
+    </w:p>
+    <w:p>
+      <w:pPr>
+        <w:spacing w:after="120"/>
+        <w:ind w:left="720"/>
+      </w:pPr>
+      <w:r>
+        <w:rPr>
+          <w:sz w:val="21"/>
+          <w:szCs w:val="21"/>
+        </w:rPr>
+        <w:t xml:space="preserve">Best hands-on intro to the adjoint for people who know autodiff. </w:t>
+      </w:r>
+      <w:hyperlink w:history="1" r:id="rIdmylirpooo8zkix5gfyzs3">
+        <w:r>
+          <w:rPr>
+            <w:rStyle w:val="Hyperlink"/>
+          </w:rPr>
+          <w:t xml:space="preserve">Tutorial video</w:t>
+        </w:r>
+      </w:hyperlink>
+      <w:r>
+        <w:rPr>
+          <w:sz w:val="21"/>
+          <w:szCs w:val="21"/>
+        </w:rPr>
+        <w:t xml:space="preserve">.</w:t>
+      </w:r>
+    </w:p>
+    <w:p>
+      <w:pPr>
+        <w:pStyle w:val="ListParagraph"/>
+        <w:keepNext/>
+        <w:keepLines/>
+        <w:numPr>
+          <w:ilvl w:val="0"/>
+          <w:numId w:val="2"/>
+        </w:numPr>
+        <w:spacing w:after="20"/>
+      </w:pPr>
+      <w:hyperlink w:history="1" r:id="rIdgcnoitspj-gcscinewhys">
+        <w:r>
+          <w:rPr>
+            <w:rStyle w:val="Hyperlink"/>
+          </w:rPr>
+          <w:t xml:space="preserve">Video: Neural Ordinary Differential Equations</w:t>
+        </w:r>
+      </w:hyperlink>
+      <w:r>
+        <w:rPr>
+          <w:color w:val="6B7280"/>
+        </w:rPr>
+        <w:t xml:space="preserve">  ·  David Duvenaud · Fields Institute</w:t>
+      </w:r>
+    </w:p>
+    <w:p>
+      <w:pPr>
+        <w:spacing w:after="120"/>
+        <w:ind w:left="720"/>
+      </w:pPr>
+      <w:r>
+        <w:rPr>
+          <w:sz w:val="21"/>
+          <w:szCs w:val="21"/>
+        </w:rPr>
+        <w:t xml:space="preserve">The author on the paper, including what didn't work.</w:t>
+      </w:r>
+    </w:p>
+    <w:p>
+      <w:pPr>
+        <w:pStyle w:val="ListParagraph"/>
+        <w:keepNext/>
+        <w:keepLines/>
+        <w:numPr>
+          <w:ilvl w:val="0"/>
+          <w:numId w:val="2"/>
+        </w:numPr>
+        <w:spacing w:after="20"/>
+      </w:pPr>
+      <w:hyperlink w:history="1" r:id="rIdztnbmcaazhnt97nutcb8n">
+        <w:r>
+          <w:rPr>
+            <w:rStyle w:val="Hyperlink"/>
+          </w:rPr>
+          <w:t xml:space="preserve">Neural Ordinary Differential Equations</w:t>
+        </w:r>
+      </w:hyperlink>
+      <w:r>
+        <w:rPr>
+          <w:color w:val="6B7280"/>
+        </w:rPr>
+        <w:t xml:space="preserve">  ·  Chen et al. · NeurIPS 2018</w:t>
+      </w:r>
+    </w:p>
+    <w:p>
+      <w:pPr>
+        <w:spacing w:after="120"/>
+        <w:ind w:left="720"/>
+      </w:pPr>
+      <w:r>
+        <w:rPr>
+          <w:sz w:val="21"/>
+          <w:szCs w:val="21"/>
+        </w:rPr>
+        <w:t xml:space="preserve">Class reading. Read the adjoint appendix too: it's the derivation on backup A1.</w:t>
+      </w:r>
+    </w:p>
+    <w:p>
+      <w:pPr>
+        <w:pStyle w:val="ListParagraph"/>
+        <w:keepNext/>
+        <w:keepLines/>
+        <w:numPr>
+          <w:ilvl w:val="0"/>
+          <w:numId w:val="2"/>
+        </w:numPr>
+        <w:spacing w:after="20"/>
+      </w:pPr>
+      <w:hyperlink w:history="1" r:id="rIdu3irsjqm6ctifjib2vl5i">
+        <w:r>
+          <w:rPr>
+            <w:rStyle w:val="Hyperlink"/>
+          </w:rPr>
+          <w:t xml:space="preserve">Latent ODEs for Irregularly-Sampled Time Series</w:t>
+        </w:r>
+      </w:hyperlink>
+      <w:r>
+        <w:rPr>
+          <w:color w:val="6B7280"/>
+        </w:rPr>
+        <w:t xml:space="preserve">  ·  Rubanova, Chen, Duvenaud · NeurIPS 2019</w:t>
+      </w:r>
+    </w:p>
+    <w:p>
+      <w:pPr>
+        <w:spacing w:after="120"/>
+        <w:ind w:left="720"/>
+      </w:pPr>
+      <w:r>
+        <w:rPr>
+          <w:sz w:val="21"/>
+          <w:szCs w:val="21"/>
+        </w:rPr>
+        <w:t xml:space="preserve">The deterministic version of the avocado model (slide 5) and the clinical-data baseline.</w:t>
+      </w:r>
+    </w:p>
+    <w:p>
+      <w:pPr>
+        <w:pStyle w:val="ListParagraph"/>
+        <w:keepNext/>
+        <w:keepLines/>
+        <w:numPr>
+          <w:ilvl w:val="0"/>
+          <w:numId w:val="2"/>
+        </w:numPr>
+        <w:spacing w:after="20"/>
+      </w:pPr>
+      <w:hyperlink w:history="1" r:id="rId_gngvtrp6yjedlsnbp8lm">
+        <w:r>
+          <w:rPr>
+            <w:rStyle w:val="Hyperlink"/>
+          </w:rPr>
+          <w:t xml:space="preserve">ANODE</w:t>
+        </w:r>
+      </w:hyperlink>
+      <w:r>
+        <w:rPr>
+          <w:color w:val="6B7280"/>
+        </w:rPr>
+        <w:t xml:space="preserve">  ·  Gholami, Keutzer, Biros · IJCAI 2019</w:t>
+      </w:r>
+    </w:p>
+    <w:p>
+      <w:pPr>
+        <w:spacing w:after="120"/>
+        <w:ind w:left="720"/>
+      </w:pPr>
+      <w:r>
+        <w:rPr>
+          <w:sz w:val="21"/>
+          <w:szCs w:val="21"/>
+        </w:rPr>
+        <w:t xml:space="preserve">When the adjoint gives wrong gradients (slide 18, point 1).</w:t>
+      </w:r>
+    </w:p>
+    <w:p>
+      <w:pPr>
+        <w:pStyle w:val="Heading2"/>
+        <w:keepNext/>
+      </w:pPr>
+      <w:r>
+        <w:t xml:space="preserve">Stage 2. Stochastic calculus</w:t>
+      </w:r>
+      <w:r>
+        <w:rPr>
+          <w:b w:val="false"/>
+          <w:bCs w:val="false"/>
+          <w:color w:val="6B7280"/>
+          <w:sz w:val="20"/>
+          <w:szCs w:val="20"/>
+        </w:rPr>
+        <w:t xml:space="preserve">   ~5 hr  ·  slides 8, A2, A4</w:t>
+      </w:r>
+    </w:p>
+    <w:p>
+      <w:pPr>
+        <w:pStyle w:val="ListParagraph"/>
+        <w:keepNext/>
+        <w:keepLines/>
+        <w:numPr>
+          <w:ilvl w:val="0"/>
+          <w:numId w:val="2"/>
+        </w:numPr>
+        <w:spacing w:after="20"/>
+      </w:pPr>
+      <w:hyperlink w:history="1" r:id="rIdhna1etr7fe4qvuwq5nidf">
         <w:r>
           <w:rPr>
             <w:rStyle w:val="Hyperlink"/>
@@ -948,7 +1191,7 @@
           <w:sz w:val="21"/>
           <w:szCs w:val="21"/>
         </w:rPr>
-        <w:t xml:space="preserve">Start here. Short, with runnable code: Brownian motion, Euler–Maruyama, Itô vs. Stratonovich. Covers the √Δt point on slide 8.</w:t>
+        <w:t xml:space="preserve">Start here. Euler–Maruyama, strong vs. weak convergence, Itô vs. Stratonovich, Milstein, with runnable code. Covers slide 8 and backup A4.</w:t>
       </w:r>
     </w:p>
     <w:p>
@@ -962,7 +1205,7 @@
         </w:numPr>
         <w:spacing w:after="20"/>
       </w:pPr>
-      <w:hyperlink w:history="1" r:id="rIdx7duh7azwhbixdkoi6qsw">
+      <w:hyperlink w:history="1" r:id="rIdzqwnb80gt4keibikamuye">
         <w:r>
           <w:rPr>
             <w:rStyle w:val="Hyperlink"/>
@@ -987,15 +1230,16 @@
           <w:sz w:val="21"/>
           <w:szCs w:val="21"/>
         </w:rPr>
-        <w:t xml:space="preserve">Use as a reference, not a cover-to-cover read. The Itô calculus and numerical-simulation chapters are the ones you need.</w:t>
+        <w:t xml:space="preserve">Read the Itô calculus chapter (Itô's lemma, Itô vs. Stratonovich) and the numerical-simulation chapter; look up Girsanov's theorem for backup A3.</w:t>
       </w:r>
     </w:p>
     <w:p>
       <w:pPr>
         <w:pStyle w:val="Heading2"/>
-      </w:pPr>
-      <w:r>
-        <w:t xml:space="preserve">Stage 2. Neural ODEs and the adjoint</w:t>
+        <w:keepNext/>
+      </w:pPr>
+      <w:r>
+        <w:t xml:space="preserve">Stage 3. Gradients through randomness</w:t>
       </w:r>
       <w:r>
         <w:rPr>
@@ -1005,7 +1249,7 @@
           <w:sz w:val="20"/>
           <w:szCs w:val="20"/>
         </w:rPr>
-        <w:t xml:space="preserve">   ~4 hr  ·  slides 3–6</w:t>
+        <w:t xml:space="preserve">   ~5 hr  ·  slides 9–12, A5</w:t>
       </w:r>
     </w:p>
     <w:p>
@@ -1019,19 +1263,19 @@
         </w:numPr>
         <w:spacing w:after="20"/>
       </w:pPr>
-      <w:hyperlink w:history="1" r:id="rIdvtssjmtnfqcdgv18jmtiu">
+      <w:hyperlink w:history="1" r:id="rIdnnuyijgcbbrtef_s7vziy">
         <w:r>
           <w:rPr>
             <w:rStyle w:val="Hyperlink"/>
           </w:rPr>
-          <w:t xml:space="preserve">Deep Implicit Layers: Neural ODE chapter, with JAX code</w:t>
+          <w:t xml:space="preserve">Monte Carlo Gradient Estimation in Machine Learning</w:t>
         </w:r>
       </w:hyperlink>
       <w:r>
         <w:rPr>
           <w:color w:val="6B7280"/>
         </w:rPr>
-        <w:t xml:space="preserve">  ·  Kolter, Duvenaud, Johnson · NeurIPS 2020 tutorial</w:t>
+        <w:t xml:space="preserve">  ·  Mohamed et al. · JMLR 2020</w:t>
       </w:r>
     </w:p>
     <w:p>
@@ -1044,22 +1288,7 @@
           <w:sz w:val="21"/>
           <w:szCs w:val="21"/>
         </w:rPr>
-        <w:t xml:space="preserve">Best hands-on intro to the adjoint, written for people who know autodiff. </w:t>
-      </w:r>
-      <w:hyperlink w:history="1" r:id="rIdtwux554wlgo3b0g7ybf2h">
-        <w:r>
-          <w:rPr>
-            <w:rStyle w:val="Hyperlink"/>
-          </w:rPr>
-          <w:t xml:space="preserve">Tutorial video</w:t>
-        </w:r>
-      </w:hyperlink>
-      <w:r>
-        <w:rPr>
-          <w:sz w:val="21"/>
-          <w:szCs w:val="21"/>
-        </w:rPr>
-        <w:t xml:space="preserve">.</w:t>
+        <w:t xml:space="preserve">Pathwise vs. score function, and why pathwise fails on discontinuous objectives. Slide 10.</w:t>
       </w:r>
     </w:p>
     <w:p>
@@ -1073,142 +1302,7 @@
         </w:numPr>
         <w:spacing w:after="20"/>
       </w:pPr>
-      <w:hyperlink w:history="1" r:id="rIdsqj5gsyc1vhrw-tjxla0s">
-        <w:r>
-          <w:rPr>
-            <w:rStyle w:val="Hyperlink"/>
-          </w:rPr>
-          <w:t xml:space="preserve">Video: Neural Ordinary Differential Equations</w:t>
-        </w:r>
-      </w:hyperlink>
-      <w:r>
-        <w:rPr>
-          <w:color w:val="6B7280"/>
-        </w:rPr>
-        <w:t xml:space="preserve">  ·  David Duvenaud · Fields Institute talk</w:t>
-      </w:r>
-    </w:p>
-    <w:p>
-      <w:pPr>
-        <w:spacing w:after="120"/>
-        <w:ind w:left="720"/>
-      </w:pPr>
-      <w:r>
-        <w:rPr>
-          <w:sz w:val="21"/>
-          <w:szCs w:val="21"/>
-        </w:rPr>
-        <w:t xml:space="preserve">The author explaining the paper, including what didn't work. Good source of honest caveats for the critique slide.</w:t>
-      </w:r>
-    </w:p>
-    <w:p>
-      <w:pPr>
-        <w:pStyle w:val="ListParagraph"/>
-        <w:keepNext/>
-        <w:keepLines/>
-        <w:numPr>
-          <w:ilvl w:val="0"/>
-          <w:numId w:val="2"/>
-        </w:numPr>
-        <w:spacing w:after="20"/>
-      </w:pPr>
-      <w:hyperlink w:history="1" r:id="rId3hbhj3mfgm71rnwei895q">
-        <w:r>
-          <w:rPr>
-            <w:rStyle w:val="Hyperlink"/>
-          </w:rPr>
-          <w:t xml:space="preserve">Neural Ordinary Differential Equations</w:t>
-        </w:r>
-      </w:hyperlink>
-      <w:r>
-        <w:rPr>
-          <w:color w:val="6B7280"/>
-        </w:rPr>
-        <w:t xml:space="preserve">  ·  Chen et al. · NeurIPS 2018</w:t>
-      </w:r>
-    </w:p>
-    <w:p>
-      <w:pPr>
-        <w:spacing w:after="120"/>
-        <w:ind w:left="720"/>
-      </w:pPr>
-      <w:r>
-        <w:rPr>
-          <w:sz w:val="21"/>
-          <w:szCs w:val="21"/>
-        </w:rPr>
-        <w:t xml:space="preserve">Same as the class reading. Read all of it, including the limitations section.</w:t>
-      </w:r>
-    </w:p>
-    <w:p>
-      <w:pPr>
-        <w:pStyle w:val="ListParagraph"/>
-        <w:keepNext/>
-        <w:keepLines/>
-        <w:numPr>
-          <w:ilvl w:val="0"/>
-          <w:numId w:val="2"/>
-        </w:numPr>
-        <w:spacing w:after="20"/>
-      </w:pPr>
-      <w:hyperlink w:history="1" r:id="rIdp4o0ghok1wjan3tjyiec4">
-        <w:r>
-          <w:rPr>
-            <w:rStyle w:val="Hyperlink"/>
-          </w:rPr>
-          <w:t xml:space="preserve">ANODE: Unconditionally Accurate Memory-Efficient Gradients for Neural ODEs</w:t>
-        </w:r>
-      </w:hyperlink>
-      <w:r>
-        <w:rPr>
-          <w:color w:val="6B7280"/>
-        </w:rPr>
-        <w:t xml:space="preserve">  ·  Gholami, Keutzer, Biros · IJCAI 2019</w:t>
-      </w:r>
-    </w:p>
-    <w:p>
-      <w:pPr>
-        <w:spacing w:after="120"/>
-        <w:ind w:left="720"/>
-      </w:pPr>
-      <w:r>
-        <w:rPr>
-          <w:sz w:val="21"/>
-          <w:szCs w:val="21"/>
-        </w:rPr>
-        <w:t xml:space="preserve">Shows when the adjoint gives wrong gradients. Backs up point 1 on the "Where It Breaks" slide.</w:t>
-      </w:r>
-    </w:p>
-    <w:p>
-      <w:pPr>
-        <w:pStyle w:val="Heading2"/>
-      </w:pPr>
-      <w:r>
-        <w:t xml:space="preserve">Stage 3. Neural SDEs</w:t>
-      </w:r>
-      <w:r>
-        <w:rPr>
-          <w:b w:val="false"/>
-          <w:bCs w:val="false"/>
-          <w:color w:val="6B7280"/>
-          <w:sz w:val="20"/>
-          <w:szCs w:val="20"/>
-        </w:rPr>
-        <w:t xml:space="preserve">   ~5 hr  ·  slides 10–12</w:t>
-      </w:r>
-    </w:p>
-    <w:p>
-      <w:pPr>
-        <w:pStyle w:val="ListParagraph"/>
-        <w:keepNext/>
-        <w:keepLines/>
-        <w:numPr>
-          <w:ilvl w:val="0"/>
-          <w:numId w:val="2"/>
-        </w:numPr>
-        <w:spacing w:after="20"/>
-      </w:pPr>
-      <w:hyperlink w:history="1" r:id="rIddy2vjbgxty_mhaeabyfbm">
+      <w:hyperlink w:history="1" r:id="rIdqgcruyywbdxrhqthjg5o0">
         <w:r>
           <w:rPr>
             <w:rStyle w:val="Hyperlink"/>
@@ -1220,7 +1314,7 @@
         <w:rPr>
           <w:color w:val="6B7280"/>
         </w:rPr>
-        <w:t xml:space="preserve">  ·  David Duvenaud · Microsoft Research talk</w:t>
+        <w:t xml:space="preserve">  ·  David Duvenaud · Microsoft Research</w:t>
       </w:r>
     </w:p>
     <w:p>
@@ -1247,12 +1341,12 @@
         </w:numPr>
         <w:spacing w:after="20"/>
       </w:pPr>
-      <w:hyperlink w:history="1" r:id="rIds4_so992jt_l6xpy6yvki">
+      <w:hyperlink w:history="1" r:id="rIdoxhrpahbi9l5cjx0ojdyc">
         <w:r>
           <w:rPr>
             <w:rStyle w:val="Hyperlink"/>
           </w:rPr>
-          <w:t xml:space="preserve">Scalable Gradients for Stochastic Differential Equations</w:t>
+          <w:t xml:space="preserve">Scalable Gradients for SDEs</w:t>
         </w:r>
       </w:hyperlink>
       <w:r>
@@ -1272,7 +1366,7 @@
           <w:sz w:val="21"/>
           <w:szCs w:val="21"/>
         </w:rPr>
-        <w:t xml:space="preserve">Class reading. Read fully; slide 10 is built on it.</w:t>
+        <w:t xml:space="preserve">Class reading. Slides 11 and 13 are built on it.</w:t>
       </w:r>
     </w:p>
     <w:p>
@@ -1286,7 +1380,7 @@
         </w:numPr>
         <w:spacing w:after="20"/>
       </w:pPr>
-      <w:hyperlink w:history="1" r:id="rIdtt0wbxbq3pah9pgalpp35">
+      <w:hyperlink w:history="1" r:id="rIdqz9ezhurqhlpyv08crtfw">
         <w:r>
           <w:rPr>
             <w:rStyle w:val="Hyperlink"/>
@@ -1311,7 +1405,7 @@
           <w:sz w:val="21"/>
           <w:szCs w:val="21"/>
         </w:rPr>
-        <w:t xml:space="preserve">The reversible Heun fix on slide 10, and the solver used in the code slide.</w:t>
+        <w:t xml:space="preserve">The exact reversible adjoint (slide 11) and Brownian Interval.</w:t>
       </w:r>
     </w:p>
     <w:p>
@@ -1325,7 +1419,65 @@
         </w:numPr>
         <w:spacing w:after="20"/>
       </w:pPr>
-      <w:hyperlink w:history="1" r:id="rId53hxmhq-iln1ravaqdruo">
+      <w:hyperlink w:history="1" r:id="rIdrktphbvz-9yqncxtb4qb3">
+        <w:r>
+          <w:rPr>
+            <w:rStyle w:val="Hyperlink"/>
+          </w:rPr>
+          <w:t xml:space="preserve">On Neural Differential Equations (PhD thesis)</w:t>
+        </w:r>
+      </w:hyperlink>
+      <w:r>
+        <w:rPr>
+          <w:color w:val="6B7280"/>
+        </w:rPr>
+        <w:t xml:space="preserve">  ·  Kidger · Oxford 2022</w:t>
+      </w:r>
+    </w:p>
+    <w:p>
+      <w:pPr>
+        <w:spacing w:after="120"/>
+        <w:ind w:left="720"/>
+      </w:pPr>
+      <w:r>
+        <w:rPr>
+          <w:sz w:val="21"/>
+          <w:szCs w:val="21"/>
+        </w:rPr>
+        <w:t xml:space="preserve">Best single reference. Read the neural SDE chapter and the chapter on numerical solutions and backpropagation.</w:t>
+      </w:r>
+    </w:p>
+    <w:p>
+      <w:pPr>
+        <w:pStyle w:val="Heading2"/>
+        <w:keepNext/>
+      </w:pPr>
+      <w:r>
+        <w:t xml:space="preserve">Stage 4. Training and diffusion</w:t>
+      </w:r>
+      <w:r>
+        <w:rPr>
+          <w:b w:val="false"/>
+          <w:bCs w:val="false"/>
+          <w:color w:val="6B7280"/>
+          <w:sz w:val="20"/>
+          <w:szCs w:val="20"/>
+        </w:rPr>
+        <w:t xml:space="preserve">   ~4 hr  ·  slides 13–15</w:t>
+      </w:r>
+    </w:p>
+    <w:p>
+      <w:pPr>
+        <w:pStyle w:val="ListParagraph"/>
+        <w:keepNext/>
+        <w:keepLines/>
+        <w:numPr>
+          <w:ilvl w:val="0"/>
+          <w:numId w:val="2"/>
+        </w:numPr>
+        <w:spacing w:after="20"/>
+      </w:pPr>
+      <w:hyperlink w:history="1" r:id="rIdjlm53gg_euouvz6nslxtv">
         <w:r>
           <w:rPr>
             <w:rStyle w:val="Hyperlink"/>
@@ -1350,7 +1502,7 @@
           <w:sz w:val="21"/>
           <w:szCs w:val="21"/>
         </w:rPr>
-        <w:t xml:space="preserve">Skim. Source for the SDE-GAN card on slide 12.</w:t>
+        <w:t xml:space="preserve">Skim. The SDE-GAN card on slide 14.</w:t>
       </w:r>
     </w:p>
     <w:p>
@@ -1364,64 +1516,7 @@
         </w:numPr>
         <w:spacing w:after="20"/>
       </w:pPr>
-      <w:hyperlink w:history="1" r:id="rIdtpngufaauxleibp6nvmcr">
-        <w:r>
-          <w:rPr>
-            <w:rStyle w:val="Hyperlink"/>
-          </w:rPr>
-          <w:t xml:space="preserve">On Neural Differential Equations (PhD thesis)</w:t>
-        </w:r>
-      </w:hyperlink>
-      <w:r>
-        <w:rPr>
-          <w:color w:val="6B7280"/>
-        </w:rPr>
-        <w:t xml:space="preserve">  ·  Kidger · Oxford 2022</w:t>
-      </w:r>
-    </w:p>
-    <w:p>
-      <w:pPr>
-        <w:spacing w:after="120"/>
-        <w:ind w:left="720"/>
-      </w:pPr>
-      <w:r>
-        <w:rPr>
-          <w:sz w:val="21"/>
-          <w:szCs w:val="21"/>
-        </w:rPr>
-        <w:t xml:space="preserve">The single best reference for the whole lecture. Read the neural SDE chapter and the chapter on numerical solutions and backpropagation; look up anything else as needed.</w:t>
-      </w:r>
-    </w:p>
-    <w:p>
-      <w:pPr>
-        <w:pStyle w:val="Heading2"/>
-      </w:pPr>
-      <w:r>
-        <w:t xml:space="preserve">Stage 4. The bridge to diffusion</w:t>
-      </w:r>
-      <w:r>
-        <w:rPr>
-          <w:b w:val="false"/>
-          <w:bCs w:val="false"/>
-          <w:color w:val="6B7280"/>
-          <w:sz w:val="20"/>
-          <w:szCs w:val="20"/>
-        </w:rPr>
-        <w:t xml:space="preserve">   ~3 hr  ·  slides 13</w:t>
-      </w:r>
-    </w:p>
-    <w:p>
-      <w:pPr>
-        <w:pStyle w:val="ListParagraph"/>
-        <w:keepNext/>
-        <w:keepLines/>
-        <w:numPr>
-          <w:ilvl w:val="0"/>
-          <w:numId w:val="2"/>
-        </w:numPr>
-        <w:spacing w:after="20"/>
-      </w:pPr>
-      <w:hyperlink w:history="1" r:id="rIdg7qvt6tsskit3q9bsojvj">
+      <w:hyperlink w:history="1" r:id="rId1gru35lz7l5lv8hrpngdq">
         <w:r>
           <w:rPr>
             <w:rStyle w:val="Hyperlink"/>
@@ -1446,7 +1541,7 @@
           <w:sz w:val="21"/>
           <w:szCs w:val="21"/>
         </w:rPr>
-        <w:t xml:space="preserve">The SDE view of diffusion from its author. Watch first.</w:t>
+        <w:t xml:space="preserve">The SDE view of diffusion from its author.</w:t>
       </w:r>
     </w:p>
     <w:p>
@@ -1460,7 +1555,7 @@
         </w:numPr>
         <w:spacing w:after="20"/>
       </w:pPr>
-      <w:hyperlink w:history="1" r:id="rId67tsa4xgkflh0hkcw4msw">
+      <w:hyperlink w:history="1" r:id="rIdq4xtluccurolwjo133ztj">
         <w:r>
           <w:rPr>
             <w:rStyle w:val="Hyperlink"/>
@@ -1485,7 +1580,7 @@
           <w:sz w:val="21"/>
           <w:szCs w:val="21"/>
         </w:rPr>
-        <w:t xml:space="preserve">The forward SDE, reverse SDE and probability-flow ODE on slide 13.</w:t>
+        <w:t xml:space="preserve">Forward SDE, reverse SDE, probability-flow ODE, denoising score matching.</w:t>
       </w:r>
     </w:p>
     <w:p>
@@ -1499,7 +1594,7 @@
         </w:numPr>
         <w:spacing w:after="20"/>
       </w:pPr>
-      <w:hyperlink w:history="1" r:id="rIdldipodojfjyb3ykojj4hm">
+      <w:hyperlink w:history="1" r:id="rId19i0din5kdpqpgrykbdxi">
         <w:r>
           <w:rPr>
             <w:rStyle w:val="Hyperlink"/>
@@ -1524,12 +1619,13 @@
           <w:sz w:val="21"/>
           <w:szCs w:val="21"/>
         </w:rPr>
-        <w:t xml:space="preserve">Builds diffusion and flow matching from ODEs and SDEs. Read the first chapters; ties slide 13 to flow matching and π0.</w:t>
+        <w:t xml:space="preserve">Builds diffusion and flow matching from ODEs and SDEs.</w:t>
       </w:r>
     </w:p>
     <w:p>
       <w:pPr>
         <w:pStyle w:val="Heading2"/>
+        <w:keepNext/>
       </w:pPr>
       <w:r>
         <w:t xml:space="preserve">Stage 5. Applications</w:t>
@@ -1542,7 +1638,7 @@
           <w:sz w:val="20"/>
           <w:szCs w:val="20"/>
         </w:rPr>
-        <w:t xml:space="preserve">   ~1.5 hr  ·  slides 14</w:t>
+        <w:t xml:space="preserve">   ~1.5 hr  ·  slides 17</w:t>
       </w:r>
     </w:p>
     <w:p>
@@ -1550,7 +1646,7 @@
         <w:spacing w:after="120"/>
       </w:pPr>
       <w:r>
-        <w:t xml:space="preserve">Read the abstract and look at the main figure of each. You only need one sentence per card, and the ability to answer one follow-up.</w:t>
+        <w:t xml:space="preserve">Abstract and main figure of each; one sentence per card, plus one follow-up answer.</w:t>
       </w:r>
     </w:p>
     <w:p>
@@ -1562,7 +1658,7 @@
         </w:numPr>
         <w:spacing w:after="60"/>
       </w:pPr>
-      <w:hyperlink w:history="1" r:id="rIdpxe3fsfrjcbbb7_abwyyk">
+      <w:hyperlink w:history="1" r:id="rIdg0vqecvz9uzbhcwjsdunm">
         <w:r>
           <w:rPr>
             <w:rStyle w:val="Hyperlink"/>
@@ -1586,7 +1682,7 @@
         </w:numPr>
         <w:spacing w:after="60"/>
       </w:pPr>
-      <w:hyperlink w:history="1" r:id="rIdkuchukithxfzwpruv0zrh">
+      <w:hyperlink w:history="1" r:id="rIdowxjotoxry3dbp9fcjjcd">
         <w:r>
           <w:rPr>
             <w:rStyle w:val="Hyperlink"/>
@@ -1610,7 +1706,7 @@
         </w:numPr>
         <w:spacing w:after="60"/>
       </w:pPr>
-      <w:hyperlink w:history="1" r:id="rIdqo_8nt1n0g2cminok-rvn">
+      <w:hyperlink w:history="1" r:id="rIdh2ganvujh5cwsvtvmvmte">
         <w:r>
           <w:rPr>
             <w:rStyle w:val="Hyperlink"/>
@@ -1634,7 +1730,7 @@
         </w:numPr>
         <w:spacing w:after="60"/>
       </w:pPr>
-      <w:hyperlink w:history="1" r:id="rIdonde4ltdgttl7tfflxskl">
+      <w:hyperlink w:history="1" r:id="rIdglzaogv7uepuioelfiq4n">
         <w:r>
           <w:rPr>
             <w:rStyle w:val="Hyperlink"/>
@@ -1658,7 +1754,7 @@
         </w:numPr>
         <w:spacing w:after="60"/>
       </w:pPr>
-      <w:hyperlink w:history="1" r:id="rIdytgsrwplw13v04iaixgnh">
+      <w:hyperlink w:history="1" r:id="rIdyzbgypbgqqtagpcpgc8hl">
         <w:r>
           <w:rPr>
             <w:rStyle w:val="Hyperlink"/>
@@ -1682,24 +1778,25 @@
         </w:numPr>
         <w:spacing w:after="60"/>
       </w:pPr>
-      <w:hyperlink w:history="1" r:id="rId_nhiqrcybk1l1lnjm7smu">
+      <w:hyperlink w:history="1" r:id="rIdtshq5-6bfiejt-7susb2z">
         <w:r>
           <w:rPr>
             <w:rStyle w:val="Hyperlink"/>
           </w:rPr>
-          <w:t xml:space="preserve">Infinitely Deep Bayesian Neural Networks with SDEs</w:t>
+          <w:t xml:space="preserve">Neural Controlled Differential Equations for Irregular Time Series</w:t>
         </w:r>
       </w:hyperlink>
       <w:r>
         <w:rPr>
           <w:color w:val="6B7280"/>
         </w:rPr>
-        <w:t xml:space="preserve">  ·  Xu, Chen, Li, Duvenaud · AISTATS 2022</w:t>
+        <w:t xml:space="preserve">  ·  Kidger et al. · NeurIPS 2020</w:t>
       </w:r>
     </w:p>
     <w:p>
       <w:pPr>
         <w:pStyle w:val="Heading2"/>
+        <w:keepNext/>
       </w:pPr>
       <w:r>
         <w:t xml:space="preserve">Stage 6. Hands-on</w:t>
@@ -1712,7 +1809,7 @@
           <w:sz w:val="20"/>
           <w:szCs w:val="20"/>
         </w:rPr>
-        <w:t xml:space="preserve">   ~1 hr  ·  slides 11</w:t>
+        <w:t xml:space="preserve">   ~2 hr  ·  slides 11, 12</w:t>
       </w:r>
     </w:p>
     <w:p>
@@ -1727,7 +1824,7 @@
       <w:r>
         <w:t xml:space="preserve">Run the </w:t>
       </w:r>
-      <w:hyperlink w:history="1" r:id="rId4fsb0oiyqwbwjf3-zunch">
+      <w:hyperlink w:history="1" r:id="rIdedfb2xzai9eifkelf5abo">
         <w:r>
           <w:rPr>
             <w:rStyle w:val="Hyperlink"/>
@@ -1736,7 +1833,7 @@
         </w:r>
       </w:hyperlink>
       <w:r>
-        <w:t xml:space="preserve"> from the docs.</w:t>
+        <w:t xml:space="preserve">.</w:t>
       </w:r>
     </w:p>
     <w:p>
@@ -1759,9 +1856,19 @@
         <w:t xml:space="preserve">lecture/neural_sde_demo.py</w:t>
       </w:r>
       <w:r>
+        <w:t xml:space="preserve"> and </w:t>
+      </w:r>
+      <w:r>
+        <w:rPr>
+          <w:b/>
+          <w:bCs/>
+        </w:rPr>
+        <w:t xml:space="preserve">experiments/adjoint_tradeoffs.py --quick</w:t>
+      </w:r>
+      <w:r>
         <w:t xml:space="preserve"> from the </w:t>
       </w:r>
-      <w:hyperlink w:history="1" r:id="rIdjxxqh1af2dag3g7vx27ei">
+      <w:hyperlink w:history="1" r:id="rIdgietu8szouzy4fol4nkb3">
         <w:r>
           <w:rPr>
             <w:rStyle w:val="Hyperlink"/>
@@ -1770,7 +1877,7 @@
         </w:r>
       </w:hyperlink>
       <w:r>
-        <w:t xml:space="preserve">. It computes the same gradient with the adjoint and with full backprop and prints the gap (about 3×10⁻⁶). Run it live after slide 11 if there's time. The repo's benchmark figure is good backup for the "Where It Breaks" slide.</w:t>
+        <w:t xml:space="preserve">. These produce the numbers on slide 12.</w:t>
       </w:r>
     </w:p>
     <w:p>
@@ -1783,7 +1890,7 @@
         <w:spacing w:after="60"/>
       </w:pPr>
       <w:r>
-        <w:t xml:space="preserve">Gotcha from testing it: parameters must be passed through </w:t>
+        <w:t xml:space="preserve">Gotcha: parameters must go through </w:t>
       </w:r>
       <w:r>
         <w:rPr>
@@ -1793,7 +1900,7 @@
         <w:t xml:space="preserve">args=</w:t>
       </w:r>
       <w:r>
-        <w:t xml:space="preserve">, not captured in a closure, or the adjoint can't differentiate them.</w:t>
+        <w:t xml:space="preserve">, not a closure, or BacksolveAdjoint can't differentiate them.</w:t>
       </w:r>
     </w:p>
     <w:p>
@@ -1801,11 +1908,392 @@
         <w:pStyle w:val="Heading1"/>
       </w:pPr>
       <w:r>
-        <w:t xml:space="preserve">Part 3. Questions to be ready for</w:t>
-      </w:r>
-    </w:p>
-    <w:p>
-      <w:pPr>
+        <w:t xml:space="preserve">Part 3. Every equation on the slides, in plain words</w:t>
+      </w:r>
+    </w:p>
+    <w:p>
+      <w:pPr>
+        <w:spacing w:after="160"/>
+      </w:pPr>
+      <w:r>
+        <w:rPr>
+          <w:i/>
+          <w:iCs/>
+          <w:color w:val="6B7280"/>
+          <w:sz w:val="20"/>
+          <w:szCs w:val="20"/>
+        </w:rPr>
+        <w:t xml:space="preserve">If you can say each of these out loud without looking, you can handle the slides.</w:t>
+      </w:r>
+    </w:p>
+    <w:p>
+      <w:pPr>
+        <w:keepNext/>
+        <w:spacing w:after="30" w:before="100"/>
+      </w:pPr>
+      <w:r>
+        <w:rPr>
+          <w:b/>
+          <w:bCs/>
+        </w:rPr>
+        <w:t xml:space="preserve">Slide 5 · dh/dt = f_θ(h, t)</w:t>
+      </w:r>
+    </w:p>
+    <w:p>
+      <w:pPr>
+        <w:spacing w:after="60"/>
+      </w:pPr>
+      <w:r>
+        <w:t xml:space="preserve">A network gives the velocity of the hidden state; a solver integrates it. A ResNet block h + f(h) is one Euler step of this with step size 1.</w:t>
+      </w:r>
+    </w:p>
+    <w:p>
+      <w:pPr>
+        <w:keepNext/>
+        <w:spacing w:after="30" w:before="100"/>
+      </w:pPr>
+      <w:r>
+        <w:rPr>
+          <w:b/>
+          <w:bCs/>
+        </w:rPr>
+        <w:t xml:space="preserve">Slide 6 · memory table</w:t>
+      </w:r>
+    </w:p>
+    <w:p>
+      <w:pPr>
+        <w:spacing w:after="60"/>
+      </w:pPr>
+      <w:r>
+        <w:t xml:space="preserve">Backprop stores every step (O(N)). Binomial checkpointing stores O(log N) states and recomputes the rest (O(N log N) work). The adjoint stores nothing from the forward pass (O(1) in N) and solves a backward system of size 2d + p: state, adjoint, parameter gradient.</w:t>
+      </w:r>
+    </w:p>
+    <w:p>
+      <w:pPr>
+        <w:keepNext/>
+        <w:spacing w:after="30" w:before="100"/>
+      </w:pPr>
+      <w:r>
+        <w:rPr>
+          <w:b/>
+          <w:bCs/>
+        </w:rPr>
+        <w:t xml:space="preserve">Slide 7 · ȧ = −aᵀ∂f/∂z, ȧ_θ = −aᵀ∂f/∂θ</w:t>
+      </w:r>
+    </w:p>
+    <w:p>
+      <w:pPr>
+        <w:spacing w:after="60"/>
+      </w:pPr>
+      <w:r>
+        <w:t xml:space="preserve">a(t) = ∂L/∂z(t), the sensitivity of the loss to the state at time t. Integrate backward from a(T) = ∂L/∂z(T); a_θ starts at 0 at time T and its value at time 0 is dL/dθ. Each term is a vector-Jacobian product: one reverse-mode call per solver stage.</w:t>
+      </w:r>
+    </w:p>
+    <w:p>
+      <w:pPr>
+        <w:keepNext/>
+        <w:spacing w:after="30" w:before="100"/>
+      </w:pPr>
+      <w:r>
+        <w:rPr>
+          <w:b/>
+          <w:bCs/>
+        </w:rPr>
+        <w:t xml:space="preserve">Slide 8 · Z_t = Z_0 + ∫μ ds + ∫σ dW</w:t>
+      </w:r>
+    </w:p>
+    <w:p>
+      <w:pPr>
+        <w:spacing w:after="60"/>
+      </w:pPr>
+      <w:r>
+        <w:t xml:space="preserve">An SDE is shorthand for this integral equation. The second integral is Itô: evaluate σ at the left end of each little interval.</w:t>
+      </w:r>
+    </w:p>
+    <w:p>
+      <w:pPr>
+        <w:keepNext/>
+        <w:spacing w:after="30" w:before="100"/>
+      </w:pPr>
+      <w:r>
+        <w:rPr>
+          <w:b/>
+          <w:bCs/>
+        </w:rPr>
+        <w:t xml:space="preserve">Slide 8 · W_t − W_s ~ N(0, (t−s)I), (dW)² = dt</w:t>
+      </w:r>
+    </w:p>
+    <w:p>
+      <w:pPr>
+        <w:spacing w:after="60"/>
+      </w:pPr>
+      <w:r>
+        <w:t xml:space="preserve">Brownian increments are independent Gaussians with variance equal to elapsed time. (dW)² = dt is why second-order terms survive.</w:t>
+      </w:r>
+    </w:p>
+    <w:p>
+      <w:pPr>
+        <w:keepNext/>
+        <w:spacing w:after="30" w:before="100"/>
+      </w:pPr>
+      <w:r>
+        <w:rPr>
+          <w:b/>
+          <w:bCs/>
+        </w:rPr>
+        <w:t xml:space="preserve">Slide 8 · Itô's lemma</w:t>
+      </w:r>
+    </w:p>
+    <w:p>
+      <w:pPr>
+        <w:spacing w:after="60"/>
+      </w:pPr>
+      <w:r>
+        <w:t xml:space="preserve">df(Z) = f′ dZ + ½ f″ σ² dt. The extra term comes from (dW)² = dt. Example: d log S picks up −½σ².</w:t>
+      </w:r>
+    </w:p>
+    <w:p>
+      <w:pPr>
+        <w:keepNext/>
+        <w:spacing w:after="30" w:before="100"/>
+      </w:pPr>
+      <w:r>
+        <w:rPr>
+          <w:b/>
+          <w:bCs/>
+        </w:rPr>
+        <w:t xml:space="preserve">Slide 8 · μ_Strat = μ_Itô − ½ Σ_j (∂σ_j/∂z) σ_j</w:t>
+      </w:r>
+    </w:p>
+    <w:p>
+      <w:pPr>
+        <w:spacing w:after="60"/>
+      </w:pPr>
+      <w:r>
+        <w:t xml:space="preserve">Same process written with midpoint (Stratonovich) integrals needs a different drift. Zero correction when σ doesn't depend on Z.</w:t>
+      </w:r>
+    </w:p>
+    <w:p>
+      <w:pPr>
+        <w:keepNext/>
+        <w:spacing w:after="30" w:before="100"/>
+      </w:pPr>
+      <w:r>
+        <w:rPr>
+          <w:b/>
+          <w:bCs/>
+        </w:rPr>
+        <w:t xml:space="preserve">Slide 8 · Euler–Maruyama orders</w:t>
+      </w:r>
+    </w:p>
+    <w:p>
+      <w:pPr>
+        <w:spacing w:after="60"/>
+      </w:pPr>
+      <w:r>
+        <w:t xml:space="preserve">Strong order ½: path error shrinks like √Δt. Weak order 1: error in expectations shrinks like Δt. Milstein adds a correction to get strong order 1.</w:t>
+      </w:r>
+    </w:p>
+    <w:p>
+      <w:pPr>
+        <w:keepNext/>
+        <w:spacing w:after="30" w:before="100"/>
+      </w:pPr>
+      <w:r>
+        <w:rPr>
+          <w:b/>
+          <w:bCs/>
+        </w:rPr>
+        <w:t xml:space="preserve">Slide 9 · dZ = κ(c) μ_θ dt + σ_θ dW</w:t>
+      </w:r>
+    </w:p>
+    <w:p>
+      <w:pPr>
+        <w:spacing w:after="60"/>
+      </w:pPr>
+      <w:r>
+        <w:t xml:space="preserve">Latent ripeness evolves with a learned rate scaled by a temperature factor, plus learned noise.</w:t>
+      </w:r>
+    </w:p>
+    <w:p>
+      <w:pPr>
+        <w:keepNext/>
+        <w:spacing w:after="30" w:before="100"/>
+      </w:pPr>
+      <w:r>
+        <w:rPr>
+          <w:b/>
+          <w:bCs/>
+        </w:rPr>
+        <w:t xml:space="preserve">Slide 9 · κ(c) = exp[−(E_a/R)(1/T_c − 1/T_ref)]</w:t>
+      </w:r>
+    </w:p>
+    <w:p>
+      <w:pPr>
+        <w:spacing w:after="60"/>
+      </w:pPr>
+      <w:r>
+        <w:t xml:space="preserve">Arrhenius: reaction rates rise exponentially with temperature. E_a = activation energy, R = gas constant, T in kelvin. κ = 1 at the reference temperature.</w:t>
+      </w:r>
+    </w:p>
+    <w:p>
+      <w:pPr>
+        <w:keepNext/>
+        <w:spacing w:after="30" w:before="100"/>
+      </w:pPr>
+      <w:r>
+        <w:rPr>
+          <w:b/>
+          <w:bCs/>
+        </w:rPr>
+        <w:t xml:space="preserve">Slide 9 · τ = inf{t : q(Z_t) ≥ b}</w:t>
+      </w:r>
+    </w:p>
+    <w:p>
+      <w:pPr>
+        <w:spacing w:after="60"/>
+      </w:pPr>
+      <w:r>
+        <w:t xml:space="preserve">Shelf life is the first time the ripeness score crosses the stage-4 threshold. We want P(τ ≤ t* | photos, storage).</w:t>
+      </w:r>
+    </w:p>
+    <w:p>
+      <w:pPr>
+        <w:keepNext/>
+        <w:spacing w:after="30" w:before="100"/>
+      </w:pPr>
+      <w:r>
+        <w:rPr>
+          <w:b/>
+          <w:bCs/>
+        </w:rPr>
+        <w:t xml:space="preserve">Slide 10 · pathwise vs score function</w:t>
+      </w:r>
+    </w:p>
+    <w:p>
+      <w:pPr>
+        <w:spacing w:after="60"/>
+      </w:pPr>
+      <w:r>
+        <w:t xml:space="preserve">Pathwise: write Z_T as a function of θ and fixed noise, differentiate inside the expectation (needs f differentiable). Score function: E[f · ∇ log p_θ], works for any f, high variance.</w:t>
+      </w:r>
+    </w:p>
+    <w:p>
+      <w:pPr>
+        <w:keepNext/>
+        <w:spacing w:after="30" w:before="100"/>
+      </w:pPr>
+      <w:r>
+        <w:rPr>
+          <w:b/>
+          <w:bCs/>
+        </w:rPr>
+        <w:t xml:space="preserve">Slide 11 · stochastic adjoint</w:t>
+      </w:r>
+    </w:p>
+    <w:p>
+      <w:pPr>
+        <w:spacing w:after="60"/>
+      </w:pPr>
+      <w:r>
+        <w:t xml:space="preserve">Same as slide 7 plus a term aᵀ ∂σ_j/∂z ∘ dW^j per noise channel, driven backward by the same Brownian path. μ here is the Stratonovich drift; convert an Itô model first.</w:t>
+      </w:r>
+    </w:p>
+    <w:p>
+      <w:pPr>
+        <w:keepNext/>
+        <w:spacing w:after="30" w:before="100"/>
+      </w:pPr>
+      <w:r>
+        <w:rPr>
+          <w:b/>
+          <w:bCs/>
+        </w:rPr>
+        <w:t xml:space="preserve">Slide 13 · prior and posterior SDEs</w:t>
+      </w:r>
+    </w:p>
+    <w:p>
+      <w:pPr>
+        <w:spacing w:after="60"/>
+      </w:pPr>
+      <w:r>
+        <w:t xml:space="preserve">Prior: dynamics that know only the storage condition (used to forecast). Posterior: same σ, but the drift also sees the photos (used to filter during training).</w:t>
+      </w:r>
+    </w:p>
+    <w:p>
+      <w:pPr>
+        <w:keepNext/>
+        <w:spacing w:after="30" w:before="100"/>
+      </w:pPr>
+      <w:r>
+        <w:rPr>
+          <w:b/>
+          <w:bCs/>
+        </w:rPr>
+        <w:t xml:space="preserve">Slide 13 · ELBO with ∫½‖u‖² dt, σu = h_φ − h_θ</w:t>
+      </w:r>
+    </w:p>
+    <w:p>
+      <w:pPr>
+        <w:spacing w:after="60"/>
+      </w:pPr>
+      <w:r>
+        <w:t xml:space="preserve">Expected log-likelihood of observed stages minus two KLs: one for the starting state, one for the whole path. Girsanov makes the path KL the integral of ½‖u‖², where u is the drift gap measured in units of σ. Add it as an extra state and integrate.</w:t>
+      </w:r>
+    </w:p>
+    <w:p>
+      <w:pPr>
+        <w:keepNext/>
+        <w:spacing w:after="30" w:before="100"/>
+      </w:pPr>
+      <w:r>
+        <w:rPr>
+          <w:b/>
+          <w:bCs/>
+        </w:rPr>
+        <w:t xml:space="preserve">Slide 15 · forward, reverse, probability-flow, score matching</w:t>
+      </w:r>
+    </w:p>
+    <w:p>
+      <w:pPr>
+        <w:spacing w:after="60"/>
+      </w:pPr>
+      <w:r>
+        <w:t xml:space="preserve">Forward: fixed noising SDE. Reverse: same SDE run backward needs the score ∇ log p_t, learned as s_θ. Probability-flow ODE: deterministic, same marginals if s_θ is exact. Training regresses s_θ onto the closed-form score of p(x_t | x_0): no solver needed.</w:t>
+      </w:r>
+    </w:p>
+    <w:p>
+      <w:pPr>
+        <w:keepNext/>
+        <w:spacing w:after="30" w:before="100"/>
+      </w:pPr>
+      <w:r>
+        <w:rPr>
+          <w:b/>
+          <w:bCs/>
+        </w:rPr>
+        <w:t xml:space="preserve">A5 · Brownian bridge</w:t>
+      </w:r>
+    </w:p>
+    <w:p>
+      <w:pPr>
+        <w:spacing w:after="60"/>
+      </w:pPr>
+      <w:r>
+        <w:t xml:space="preserve">Given W at two times, W in between is Gaussian: mean on the straight line, variance (s−u)(v−s)/(v−u). Used to regenerate W on demand and to compute the chance a path crossed b between steps: exp(−2(b−q_k)(b−q_{k+1})/(σ_q²Δt)).</w:t>
+      </w:r>
+    </w:p>
+    <w:p>
+      <w:pPr>
+        <w:pStyle w:val="Heading1"/>
+      </w:pPr>
+      <w:r>
+        <w:t xml:space="preserve">Part 4. Questions to be ready for</w:t>
+      </w:r>
+    </w:p>
+    <w:p>
+      <w:pPr>
+        <w:keepNext/>
         <w:spacing w:after="40" w:before="120"/>
       </w:pPr>
       <w:r>
@@ -1821,11 +2309,12 @@
         <w:spacing w:after="80"/>
       </w:pPr>
       <w:r>
-        <w:t xml:space="preserve">Not in general. It re-solves the trajectory backward, so it inherits solver error and can drift badly on stiff or chaotic dynamics. Reversible Heun with its matching discrete adjoint (Kidger et al. 2021, implemented in torchsde) is exact up to floating point. Diffrax's BacksolveAdjoint solves the continuous adjoint, so it stays approximate even with reversible Heun: in the repo it was off by about 1e-5, shrinking as steps increased.</w:t>
-      </w:r>
-    </w:p>
-    <w:p>
-      <w:pPr>
+        <w:t xml:space="preserve">No. It re-solves the trajectory backward, so it inherits solver error and can drift on stiff or chaotic dynamics (ANODE). Reversible Heun with its matching discrete adjoint (Kidger 2021, torchsde) is exact up to floating-point round-off. Diffrax's BacksolveAdjoint is the continuous adjoint, approximate even with reversible Heun: in the repo it was off by 7e-5 at 16 steps, 2e-6 at 512.</w:t>
+      </w:r>
+    </w:p>
+    <w:p>
+      <w:pPr>
+        <w:keepNext/>
         <w:spacing w:after="40" w:before="120"/>
       </w:pPr>
       <w:r>
@@ -1833,7 +2322,7 @@
           <w:b/>
           <w:bCs/>
         </w:rPr>
-        <w:t xml:space="preserve">How is this different from backprop through time?</w:t>
+        <w:t xml:space="preserve">Why did the adjoint use 154 MB if it's 'constant memory'?</w:t>
       </w:r>
     </w:p>
     <w:p>
@@ -1841,11 +2330,12 @@
         <w:spacing w:after="80"/>
       </w:pPr>
       <w:r>
-        <w:t xml:space="preserve">It's the same idea in continuous time: the adjoint is continuous BPTT. The difference is that you choose how to compute it, and the adjoint recomputes states instead of storing them.</w:t>
-      </w:r>
-    </w:p>
-    <w:p>
-      <w:pPr>
+        <w:t xml:space="preserve">Constant in the number of steps, yes. The method needs only 2d + p ≈ 110 KB; the rest is an implementation constant in Diffrax/XLA that grows with parameters and noise channels. Checkpointing was ~1 MB and exact.</w:t>
+      </w:r>
+    </w:p>
+    <w:p>
+      <w:pPr>
+        <w:keepNext/>
         <w:spacing w:after="40" w:before="120"/>
       </w:pPr>
       <w:r>
@@ -1853,7 +2343,7 @@
           <w:b/>
           <w:bCs/>
         </w:rPr>
-        <w:t xml:space="preserve">Why √Δt in Euler–Maruyama?</w:t>
+        <w:t xml:space="preserve">Strong vs. weak order?</w:t>
       </w:r>
     </w:p>
     <w:p>
@@ -1861,11 +2351,12 @@
         <w:spacing w:after="80"/>
       </w:pPr>
       <w:r>
-        <w:t xml:space="preserve">Brownian increments have variance Δt, so their standard deviation is √Δt. With Δt the noise would vanish as the grid is refined.</w:t>
-      </w:r>
-    </w:p>
-    <w:p>
-      <w:pPr>
+        <w:t xml:space="preserve">Strong: error of individual paths. Weak: error in expectations. Probabilities like P(τ ≤ t*) need weak accuracy; pathwise gradients care about strong.</w:t>
+      </w:r>
+    </w:p>
+    <w:p>
+      <w:pPr>
+        <w:keepNext/>
         <w:spacing w:after="40" w:before="120"/>
       </w:pPr>
       <w:r>
@@ -1873,7 +2364,7 @@
           <w:b/>
           <w:bCs/>
         </w:rPr>
-        <w:t xml:space="preserve">Why does Stratonovich matter for the adjoint?</w:t>
+        <w:t xml:space="preserve">Why Stratonovich for the adjoint?</w:t>
       </w:r>
     </w:p>
     <w:p>
@@ -1881,11 +2372,12 @@
         <w:spacing w:after="80"/>
       </w:pPr>
       <w:r>
-        <w:t xml:space="preserve">Stratonovich calculus follows the ordinary chain rule, so the backward SDE is clean. Itô SDEs must be converted with a drift correction first; skipping it gives a silently wrong gradient.</w:t>
-      </w:r>
-    </w:p>
-    <w:p>
-      <w:pPr>
+        <w:t xml:space="preserve">It obeys the ordinary chain rule, so the ODE adjoint carries over term by term. Itô models are converted first with the drift correction; using the Itô drift directly gives wrong gradients.</w:t>
+      </w:r>
+    </w:p>
+    <w:p>
+      <w:pPr>
+        <w:keepNext/>
         <w:spacing w:after="40" w:before="120"/>
       </w:pPr>
       <w:r>
@@ -1893,7 +2385,7 @@
           <w:b/>
           <w:bCs/>
         </w:rPr>
-        <w:t xml:space="preserve">Are diffusion models really trained like neural SDEs?</w:t>
+        <w:t xml:space="preserve">Why is the pathwise gradient of P(spoiled) zero?</w:t>
       </w:r>
     </w:p>
     <w:p>
@@ -1901,11 +2393,12 @@
         <w:spacing w:after="80"/>
       </w:pPr>
       <w:r>
-        <w:t xml:space="preserve">No, and say so. Diffusion training is simulation-free (denoising score matching); the SDE solver appears only at sampling. Li- and Kidger-style models do backprop through the solve.</w:t>
-      </w:r>
-    </w:p>
-    <w:p>
-      <w:pPr>
+        <w:t xml:space="preserve">For fixed noise, 'spoiled by t*' is a step function of θ: derivative zero almost everywhere. The expectation is smooth, so you can't swap ∇ and E. Fixes: sigmoid surrogate (biased), Brownian-bridge crossing probability (smooth per step), or score function (unbiased, noisy).</w:t>
+      </w:r>
+    </w:p>
+    <w:p>
+      <w:pPr>
+        <w:keepNext/>
         <w:spacing w:after="40" w:before="120"/>
       </w:pPr>
       <w:r>
@@ -1913,7 +2406,7 @@
           <w:b/>
           <w:bCs/>
         </w:rPr>
-        <w:t xml:space="preserve">Why not just use a discrete-time model?</w:t>
+        <w:t xml:space="preserve">Can you use the score function for parameters in σ?</w:t>
       </w:r>
     </w:p>
     <w:p>
@@ -1921,11 +2414,12 @@
         <w:spacing w:after="80"/>
       </w:pPr>
       <w:r>
-        <w:t xml:space="preserve">Continuous time handles irregularly sampled data natively, lets an adaptive solver choose the compute, and plugs directly into physical models written as differential equations.</w:t>
-      </w:r>
-    </w:p>
-    <w:p>
-      <w:pPr>
+        <w:t xml:space="preserve">Not in continuous time: changing σ changes quadratic variation, so path measures become mutually singular. On a discrete grid the Euler–Maruyama density exists, but the estimator's variance blows up as Δt → 0.</w:t>
+      </w:r>
+    </w:p>
+    <w:p>
+      <w:pPr>
+        <w:keepNext/>
         <w:spacing w:after="40" w:before="120"/>
       </w:pPr>
       <w:r>
@@ -1933,7 +2427,7 @@
           <w:b/>
           <w:bCs/>
         </w:rPr>
-        <w:t xml:space="preserve">What does the memory actually scale with?</w:t>
+        <w:t xml:space="preserve">Why must prior and posterior share σ?</w:t>
       </w:r>
     </w:p>
     <w:p>
@@ -1941,7 +2435,236 @@
         <w:spacing w:after="80"/>
       </w:pPr>
       <w:r>
-        <w:t xml:space="preserve">Full backprop stores every solver step: memory grows with the number of steps. The adjoint's memory is independent of the number of steps; it still scales with the state and parameter size.</w:t>
+        <w:t xml:space="preserve">Girsanov only changes drift. Different σσᵀ means different quadratic variation, mutually singular path measures, KL = ∞.</w:t>
+      </w:r>
+    </w:p>
+    <w:p>
+      <w:pPr>
+        <w:keepNext/>
+        <w:spacing w:after="40" w:before="120"/>
+      </w:pPr>
+      <w:r>
+        <w:rPr>
+          <w:b/>
+          <w:bCs/>
+        </w:rPr>
+        <w:t xml:space="preserve">Why Arrhenius?</w:t>
+      </w:r>
+    </w:p>
+    <w:p>
+      <w:pPr>
+        <w:spacing w:after="80"/>
+      </w:pPr>
+      <w:r>
+        <w:t xml:space="preserve">Two controlled temperatures (10 °C, 20 °C) can't train a free-form temperature dependence; Arrhenius is a one-parameter physical prior. Applying it only to drift is a choice; scaling diffusion by √κ is the alternative if temperature speeds up the whole clock.</w:t>
+      </w:r>
+    </w:p>
+    <w:p>
+      <w:pPr>
+        <w:keepNext/>
+        <w:spacing w:after="40" w:before="120"/>
+      </w:pPr>
+      <w:r>
+        <w:rPr>
+          <w:b/>
+          <w:bCs/>
+        </w:rPr>
+        <w:t xml:space="preserve">Are diffusion models trained like your latent SDE?</w:t>
+      </w:r>
+    </w:p>
+    <w:p>
+      <w:pPr>
+        <w:spacing w:after="80"/>
+      </w:pPr>
+      <w:r>
+        <w:t xml:space="preserve">No. Diffusion training is simulation-free (denoising score matching, closed-form p(x_t | x_0)); the solver only runs at sampling. Our model learns the dynamics, so it must backprop through the solve.</w:t>
+      </w:r>
+    </w:p>
+    <w:p>
+      <w:pPr>
+        <w:keepNext/>
+        <w:spacing w:after="40" w:before="120"/>
+      </w:pPr>
+      <w:r>
+        <w:rPr>
+          <w:b/>
+          <w:bCs/>
+        </w:rPr>
+        <w:t xml:space="preserve">How is the latent SDE's posterior conditioned on photos?</w:t>
+      </w:r>
+    </w:p>
+    <w:p>
+      <w:pPr>
+        <w:spacing w:after="80"/>
+      </w:pPr>
+      <w:r>
+        <w:t xml:space="preserve">Encode each photo, run a GRU or Transformer backward over the sequence to make a context vector per time, feed it to the posterior drift h_φ.</w:t>
+      </w:r>
+    </w:p>
+    <w:p>
+      <w:pPr>
+        <w:keepNext/>
+        <w:spacing w:after="40" w:before="120"/>
+      </w:pPr>
+      <w:r>
+        <w:rPr>
+          <w:b/>
+          <w:bCs/>
+        </w:rPr>
+        <w:t xml:space="preserve">What's a virtual Brownian tree?</w:t>
+      </w:r>
+    </w:p>
+    <w:p>
+      <w:pPr>
+        <w:spacing w:after="80"/>
+      </w:pPr>
+      <w:r>
+        <w:t xml:space="preserve">Regenerate W(s) on demand by recursive Brownian-bridge bisection from a fixed seed: O(1) memory, O(log 1/ε) per query, same answer every time.</w:t>
+      </w:r>
+    </w:p>
+    <w:p>
+      <w:pPr>
+        <w:keepNext/>
+        <w:spacing w:after="40" w:before="120"/>
+      </w:pPr>
+      <w:r>
+        <w:rPr>
+          <w:b/>
+          <w:bCs/>
+        </w:rPr>
+        <w:t xml:space="preserve">Identifiability?</w:t>
+      </w:r>
+    </w:p>
+    <w:p>
+      <w:pPr>
+        <w:spacing w:after="80"/>
+      </w:pPr>
+      <w:r>
+        <w:t xml:space="preserve">Reparameterizing the latent space leaves the likelihood unchanged, and fast drift + small noise can mimic slow drift + big noise under sparse observations. The ordinal ripeness head anchors one direction; test by recovering a known SDE on synthetic data.</w:t>
+      </w:r>
+    </w:p>
+    <w:p>
+      <w:pPr>
+        <w:keepNext/>
+        <w:spacing w:after="40" w:before="120"/>
+      </w:pPr>
+      <w:r>
+        <w:rPr>
+          <w:b/>
+          <w:bCs/>
+        </w:rPr>
+        <w:t xml:space="preserve">Why not a sequence model with a hazard head?</w:t>
+      </w:r>
+    </w:p>
+    <w:p>
+      <w:pPr>
+        <w:spacing w:after="80"/>
+      </w:pPr>
+      <w:r>
+        <w:t xml:space="preserve">It's a legitimate baseline (on the results slide). The SDE gives irregular times, uncertainty over futures and a physics-structured rate by construction.</w:t>
+      </w:r>
+    </w:p>
+    <w:p>
+      <w:pPr>
+        <w:pStyle w:val="Heading1"/>
+      </w:pPr>
+      <w:r>
+        <w:t xml:space="preserve">Part 5. Still to fill in</w:t>
+      </w:r>
+    </w:p>
+    <w:p>
+      <w:pPr>
+        <w:spacing w:after="160"/>
+      </w:pPr>
+      <w:r>
+        <w:rPr>
+          <w:i/>
+          <w:iCs/>
+          <w:color w:val="6B7280"/>
+          <w:sz w:val="20"/>
+          <w:szCs w:val="20"/>
+        </w:rPr>
+        <w:t xml:space="preserve">The running example's images and code don't exist yet. These spots in the deck are marked PLACEHOLDER.</w:t>
+      </w:r>
+    </w:p>
+    <w:p>
+      <w:pPr>
+        <w:pStyle w:val="ListParagraph"/>
+        <w:numPr>
+          <w:ilvl w:val="0"/>
+          <w:numId w:val="4"/>
+        </w:numPr>
+        <w:spacing w:after="60"/>
+      </w:pPr>
+      <w:r>
+        <w:rPr>
+          <w:b/>
+          <w:bCs/>
+        </w:rPr>
+        <w:t xml:space="preserve">Slide 2: </w:t>
+      </w:r>
+      <w:r>
+        <w:t xml:space="preserve">five photos of one avocado (same sample, days 0–8) from the dataset.</w:t>
+      </w:r>
+    </w:p>
+    <w:p>
+      <w:pPr>
+        <w:pStyle w:val="ListParagraph"/>
+        <w:numPr>
+          <w:ilvl w:val="0"/>
+          <w:numId w:val="4"/>
+        </w:numPr>
+        <w:spacing w:after="60"/>
+      </w:pPr>
+      <w:r>
+        <w:rPr>
+          <w:b/>
+          <w:bCs/>
+        </w:rPr>
+        <w:t xml:space="preserve">Slide 9: </w:t>
+      </w:r>
+      <w:r>
+        <w:t xml:space="preserve">the image encoder from your project, and one sentence on why it suits produce.</w:t>
+      </w:r>
+    </w:p>
+    <w:p>
+      <w:pPr>
+        <w:pStyle w:val="ListParagraph"/>
+        <w:numPr>
+          <w:ilvl w:val="0"/>
+          <w:numId w:val="4"/>
+        </w:numPr>
+        <w:spacing w:after="60"/>
+      </w:pPr>
+      <w:r>
+        <w:rPr>
+          <w:b/>
+          <w:bCs/>
+        </w:rPr>
+        <w:t xml:space="preserve">Slide 16: </w:t>
+      </w:r>
+      <w:r>
+        <w:t xml:space="preserve">forecast fan chart, shelf-life calibration (reliability diagram), baselines × metrics table (C-index, Brier score, NLL), and a one-line headline. Split train/test by fruit, not by photo.</w:t>
+      </w:r>
+    </w:p>
+    <w:p>
+      <w:pPr>
+        <w:pStyle w:val="ListParagraph"/>
+        <w:numPr>
+          <w:ilvl w:val="0"/>
+          <w:numId w:val="4"/>
+        </w:numPr>
+        <w:spacing w:after="60"/>
+      </w:pPr>
+      <w:r>
+        <w:rPr>
+          <w:b/>
+          <w:bCs/>
+        </w:rPr>
+        <w:t xml:space="preserve">If results aren't ready: </w:t>
+      </w:r>
+      <w:r>
+        <w:t xml:space="preserve">keep slide 16 as 'experiment in progress' and show the schematic fan chart instead.</w:t>
       </w:r>
     </w:p>
     <w:sectPr>

</xml_diff>

<commit_message>
Lecture v3: light theme, paper-based running example, appendix
- Running example now uses Xavier, Rodrigues & Silva, Foods 13:1150 (2024):
  their figures (CC BY 3.0, credited), tables, and baseline numbers
- New derived analyses: constant-drift reading of their regression,
  stage-quantization floor, Arrhenius fit (Ea ~ 50 kJ/mol), first-passage
  error ratios
- White background, color only for emphasis, tables over bullets
- 22 presented slides + appendix A1-A9 with derivations
- Reading guide updated to match; build scripts now tracked

Co-Authored-By: Claude Opus 5.5 <noreply@anthropic.com>
Claude-Session: https://claude.ai/code/session_01D9oC41NzS6vwYLC8b14vHG
</commit_message>
<xml_diff>
--- a/lecture/neural_sde_reading_guide.docx
+++ b/lecture/neural_sde_reading_guide.docx
@@ -46,7 +46,7 @@
         <w:rPr>
           <w:color w:val="6B7280"/>
         </w:rPr>
-        <w:t xml:space="preserve">   ·   Running example: avocado shelf life   ·   Nishad Wajge</w:t>
+        <w:t xml:space="preserve">   ·   Running example: 'Hass' avocado ripening (Xavier, Rodrigues &amp; Silva, Foods 2024)   ·   Nishad Wajge</w:t>
       </w:r>
     </w:p>
     <w:p>
@@ -54,7 +54,15 @@
         <w:spacing w:after="120"/>
       </w:pPr>
       <w:r>
-        <w:t xml:space="preserve">Part 1 is the reading list for the class, ready to post with the slides. Part 2 is your prep plan, ordered to match the deck. Part 3 explains every equation on the slides in plain words. Part 4 is the questions you should be able to answer cold. Part 5 lists what's still a placeholder.</w:t>
+        <w:t xml:space="preserve">Part 1 is the reading list for the class, ready to post with the slides. Part 2 is your prep plan, ordered to match the deck. Part 3 explains every equation on the slides in plain words. Part 4 is the questions you should be able to answer cold. Part 5 lists what's still to fill in.</w:t>
+      </w:r>
+    </w:p>
+    <w:p>
+      <w:pPr>
+        <w:spacing w:after="120"/>
+      </w:pPr>
+      <w:r>
+        <w:t xml:space="preserve">Deck layout: 22 presented slides plus appendix A1–A9 (derivations, solver table, benchmark setup, credits), which you don't present but should be able to open if asked. The running example uses the paper's own figures and tables (CC BY 3.0); every number derived from them (rates, Eₐ, first-passage ratios) is worked out in A4 and A5.</w:t>
       </w:r>
     </w:p>
     <w:p>
@@ -100,7 +108,7 @@
         <w:t xml:space="preserve">style and clarity 20%</w:t>
       </w:r>
       <w:r>
-        <w:t xml:space="preserve">. Length isn't stated; last year's schedule fit two or three talks per 75-minute class. The deck runs about 24 minutes plus 5 of discussion, and slides 14 and 17 can be skipped to fit 20.</w:t>
+        <w:t xml:space="preserve">. Length isn't stated; last year's schedule fit two or three talks per 75-minute class. The deck runs about 23 minutes plus 5 of discussion, and slides 7 and 20 can be skipped to fit 20.</w:t>
       </w:r>
     </w:p>
     <w:tbl>
@@ -602,7 +610,7 @@
         </w:numPr>
         <w:spacing w:after="20"/>
       </w:pPr>
-      <w:hyperlink w:history="1" r:id="rIdmovrdfehzeev-svxpl9ns">
+      <w:hyperlink w:history="1" r:id="rIdqf0oiffn27bktxhxyjavw">
         <w:r>
           <w:rPr>
             <w:rStyle w:val="Hyperlink"/>
@@ -641,7 +649,7 @@
         </w:numPr>
         <w:spacing w:after="20"/>
       </w:pPr>
-      <w:hyperlink w:history="1" r:id="rIdejihstkdgyabelbl8fbhs">
+      <w:hyperlink w:history="1" r:id="rId4zmdkvntcw_xf8g6edjn1">
         <w:r>
           <w:rPr>
             <w:rStyle w:val="Hyperlink"/>
@@ -666,7 +674,7 @@
           <w:sz w:val="21"/>
           <w:szCs w:val="21"/>
         </w:rPr>
-        <w:t xml:space="preserve">Read the stochastic adjoint, the virtual Brownian tree, and the latent SDE (ELBO via Girsanov). These are slides 11 and 13.</w:t>
+        <w:t xml:space="preserve">Read the stochastic adjoint, the virtual Brownian tree, and the latent SDE (ELBO via Girsanov). These are slides 15 and 17.</w:t>
       </w:r>
     </w:p>
     <w:p>
@@ -675,6 +683,54 @@
         <w:keepNext/>
       </w:pPr>
       <w:r>
+        <w:t xml:space="preserve">Running example (short, skim)</w:t>
+      </w:r>
+    </w:p>
+    <w:p>
+      <w:pPr>
+        <w:pStyle w:val="ListParagraph"/>
+        <w:keepNext/>
+        <w:keepLines/>
+        <w:numPr>
+          <w:ilvl w:val="0"/>
+          <w:numId w:val="2"/>
+        </w:numPr>
+        <w:spacing w:after="20"/>
+      </w:pPr>
+      <w:hyperlink w:history="1" r:id="rIdgxhmywjhifcqzokjysz0p">
+        <w:r>
+          <w:rPr>
+            <w:rStyle w:val="Hyperlink"/>
+          </w:rPr>
+          <w:t xml:space="preserve">Shelf-Life Management and Ripening Assessment of 'Hass' Avocado Using Deep Learning</w:t>
+        </w:r>
+      </w:hyperlink>
+      <w:r>
+        <w:rPr>
+          <w:color w:val="6B7280"/>
+        </w:rPr>
+        <w:t xml:space="preserve">  ·  Xavier, Rodrigues &amp; Silva · Foods 13(8):1150, 2024 · open access, CC BY</w:t>
+      </w:r>
+    </w:p>
+    <w:p>
+      <w:pPr>
+        <w:spacing w:after="120"/>
+        <w:ind w:left="720"/>
+      </w:pPr>
+      <w:r>
+        <w:rPr>
+          <w:sz w:val="21"/>
+          <w:szCs w:val="21"/>
+        </w:rPr>
+        <w:t xml:space="preserve">About 20 minutes. Read the abstract, Section 2 (storage groups, ripening index, the Days Left regression) and look at Figs. 1, 2, 6 and 11 and Tables 3, 4 and 6. Slides 2–6, 12, 13 and 19 use these directly.</w:t>
+      </w:r>
+    </w:p>
+    <w:p>
+      <w:pPr>
+        <w:pStyle w:val="Heading2"/>
+        <w:keepNext/>
+      </w:pPr>
+      <w:r>
         <w:t xml:space="preserve">Optional</w:t>
       </w:r>
     </w:p>
@@ -689,7 +745,7 @@
         </w:numPr>
         <w:spacing w:after="20"/>
       </w:pPr>
-      <w:hyperlink w:history="1" r:id="rIdrc3vffbui87xufyh-sj5b">
+      <w:hyperlink w:history="1" r:id="rId-fb2r9l6nnqd34oim2o8j">
         <w:r>
           <w:rPr>
             <w:rStyle w:val="Hyperlink"/>
@@ -714,7 +770,7 @@
           <w:sz w:val="21"/>
           <w:szCs w:val="21"/>
         </w:rPr>
-        <w:t xml:space="preserve">Sections on pathwise and score-function estimators. Background for slide 10.</w:t>
+        <w:t xml:space="preserve">Sections on pathwise and score-function estimators. Background for slide 14.</w:t>
       </w:r>
     </w:p>
     <w:p>
@@ -728,7 +784,7 @@
         </w:numPr>
         <w:spacing w:after="20"/>
       </w:pPr>
-      <w:hyperlink w:history="1" r:id="rIdta7o4s-wz_5xp9l8p-05t">
+      <w:hyperlink w:history="1" r:id="rId_zix3vl60ylytxlcyhsov">
         <w:r>
           <w:rPr>
             <w:rStyle w:val="Hyperlink"/>
@@ -753,7 +809,7 @@
           <w:sz w:val="21"/>
           <w:szCs w:val="21"/>
         </w:rPr>
-        <w:t xml:space="preserve">The SDE framework and the probability-flow ODE. Slide 15.</w:t>
+        <w:t xml:space="preserve">The SDE framework and the probability-flow ODE. Slide 18.</w:t>
       </w:r>
     </w:p>
     <w:p>
@@ -767,7 +823,7 @@
         </w:numPr>
         <w:spacing w:after="20"/>
       </w:pPr>
-      <w:hyperlink w:history="1" r:id="rIda98z4ihsfkr6w7uovnmt2">
+      <w:hyperlink w:history="1" r:id="rIdzcsb6zerfskdmn5jrpjwn">
         <w:r>
           <w:rPr>
             <w:rStyle w:val="Hyperlink"/>
@@ -797,15 +853,6 @@
     </w:p>
     <w:p>
       <w:pPr>
-        <w:pStyle w:val="Heading2"/>
-        <w:keepNext/>
-      </w:pPr>
-      <w:r>
-        <w:t xml:space="preserve">Running-example data</w:t>
-      </w:r>
-    </w:p>
-    <w:p>
-      <w:pPr>
         <w:pStyle w:val="ListParagraph"/>
         <w:keepNext/>
         <w:keepLines/>
@@ -815,7 +862,7 @@
         </w:numPr>
         <w:spacing w:after="20"/>
       </w:pPr>
-      <w:hyperlink w:history="1" r:id="rId9tvc3-cjjlddt_gm-modn">
+      <w:hyperlink w:history="1" r:id="rId40hzl6o1fqbqs14fftude">
         <w:r>
           <w:rPr>
             <w:rStyle w:val="Hyperlink"/>
@@ -840,7 +887,7 @@
           <w:sz w:val="21"/>
           <w:szCs w:val="21"/>
         </w:rPr>
-        <w:t xml:space="preserve">478 avocados photographed daily (14,710 images, two sides each), stored at 10 °C, 20 °C or ambient, labeled with a 5-stage ripening index; stage 4 is end of shelf life. Check the license on the page before posting images.</w:t>
+        <w:t xml:space="preserve">The images behind the paper, for anyone who wants to run the model. Check the license on the page before reusing images.</w:t>
       </w:r>
     </w:p>
     <w:p>
@@ -862,7 +909,7 @@
         <w:spacing w:after="80"/>
       </w:pPr>
       <w:r>
-        <w:t xml:space="preserve">Shelf life is a first-passage time. Smooth surrogate, Brownian-bridge correction, or score function: which would you train with, and why?</w:t>
+        <w:t xml:space="preserve">Shelf life is a first-passage time. Which estimator would you train P(τ ≤ t*) with: smooth surrogate, Brownian-bridge crossing, or score function? Why?</w:t>
       </w:r>
     </w:p>
     <w:p>
@@ -875,7 +922,7 @@
         <w:spacing w:after="80"/>
       </w:pPr>
       <w:r>
-        <w:t xml:space="preserve">Diffusion models fix σ; our model learns it. When is learning the noise worth the identifiability trouble?</w:t>
+        <w:t xml:space="preserve">Slide 13 suggests the noise partly scales with temperature. How would you test that properly on this data?</w:t>
       </w:r>
     </w:p>
     <w:p>
@@ -904,7 +951,7 @@
         <w:spacing w:after="120"/>
       </w:pPr>
       <w:r>
-        <w:t xml:space="preserve">About 22 hours over two weeks, in deck order. Where a stage lists a video, watch it before the paper.</w:t>
+        <w:t xml:space="preserve">About 23 hours over two weeks, in deck order. Where a stage lists a video, watch it before the paper.</w:t>
       </w:r>
     </w:p>
     <w:p>
@@ -923,7 +970,7 @@
           <w:sz w:val="20"/>
           <w:szCs w:val="20"/>
         </w:rPr>
-        <w:t xml:space="preserve">   ~4 hr  ·  slides 5–7, A1</w:t>
+        <w:t xml:space="preserve">   ~4 hr  ·  slides 7–9, A1</w:t>
       </w:r>
     </w:p>
     <w:p>
@@ -937,7 +984,7 @@
         </w:numPr>
         <w:spacing w:after="20"/>
       </w:pPr>
-      <w:hyperlink w:history="1" r:id="rId_nemc_qpypud0idaahjai">
+      <w:hyperlink w:history="1" r:id="rId6boey0p-ket4r3jnrsaht">
         <w:r>
           <w:rPr>
             <w:rStyle w:val="Hyperlink"/>
@@ -964,7 +1011,7 @@
         </w:rPr>
         <w:t xml:space="preserve">Best hands-on intro to the adjoint for people who know autodiff. </w:t>
       </w:r>
-      <w:hyperlink w:history="1" r:id="rIdmylirpooo8zkix5gfyzs3">
+      <w:hyperlink w:history="1" r:id="rIdpzbzdus1dbqeaxdl5cip3">
         <w:r>
           <w:rPr>
             <w:rStyle w:val="Hyperlink"/>
@@ -991,7 +1038,7 @@
         </w:numPr>
         <w:spacing w:after="20"/>
       </w:pPr>
-      <w:hyperlink w:history="1" r:id="rIdgcnoitspj-gcscinewhys">
+      <w:hyperlink w:history="1" r:id="rIdslfrifs47-nfvkpsogiwr">
         <w:r>
           <w:rPr>
             <w:rStyle w:val="Hyperlink"/>
@@ -1030,7 +1077,7 @@
         </w:numPr>
         <w:spacing w:after="20"/>
       </w:pPr>
-      <w:hyperlink w:history="1" r:id="rIdztnbmcaazhnt97nutcb8n">
+      <w:hyperlink w:history="1" r:id="rId5kumbgowcecsn7vhqlb4w">
         <w:r>
           <w:rPr>
             <w:rStyle w:val="Hyperlink"/>
@@ -1055,7 +1102,7 @@
           <w:sz w:val="21"/>
           <w:szCs w:val="21"/>
         </w:rPr>
-        <w:t xml:space="preserve">Class reading. Read the adjoint appendix too: it's the derivation on backup A1.</w:t>
+        <w:t xml:space="preserve">Class reading. Read the adjoint appendix too: it's the derivation in appendix A1.</w:t>
       </w:r>
     </w:p>
     <w:p>
@@ -1069,7 +1116,7 @@
         </w:numPr>
         <w:spacing w:after="20"/>
       </w:pPr>
-      <w:hyperlink w:history="1" r:id="rIdu3irsjqm6ctifjib2vl5i">
+      <w:hyperlink w:history="1" r:id="rId-uskvxwmhy1gortpa0xyb">
         <w:r>
           <w:rPr>
             <w:rStyle w:val="Hyperlink"/>
@@ -1094,7 +1141,7 @@
           <w:sz w:val="21"/>
           <w:szCs w:val="21"/>
         </w:rPr>
-        <w:t xml:space="preserve">The deterministic version of the avocado model (slide 5) and the clinical-data baseline.</w:t>
+        <w:t xml:space="preserve">The deterministic version of the avocado model (the Latent ODE column on slides 6 and 19).</w:t>
       </w:r>
     </w:p>
     <w:p>
@@ -1108,7 +1155,7 @@
         </w:numPr>
         <w:spacing w:after="20"/>
       </w:pPr>
-      <w:hyperlink w:history="1" r:id="rId_gngvtrp6yjedlsnbp8lm">
+      <w:hyperlink w:history="1" r:id="rIdodwmk4eszznuohyj-qn7s">
         <w:r>
           <w:rPr>
             <w:rStyle w:val="Hyperlink"/>
@@ -1133,7 +1180,7 @@
           <w:sz w:val="21"/>
           <w:szCs w:val="21"/>
         </w:rPr>
-        <w:t xml:space="preserve">When the adjoint gives wrong gradients (slide 18, point 1).</w:t>
+        <w:t xml:space="preserve">When the adjoint gives wrong gradients (slide 21, first row).</w:t>
       </w:r>
     </w:p>
     <w:p>
@@ -1142,7 +1189,7 @@
         <w:keepNext/>
       </w:pPr>
       <w:r>
-        <w:t xml:space="preserve">Stage 2. Stochastic calculus</w:t>
+        <w:t xml:space="preserve">Stage 2. Stochastic calculus and the avocado model</w:t>
       </w:r>
       <w:r>
         <w:rPr>
@@ -1152,7 +1199,7 @@
           <w:sz w:val="20"/>
           <w:szCs w:val="20"/>
         </w:rPr>
-        <w:t xml:space="preserve">   ~5 hr  ·  slides 8, A2, A4</w:t>
+        <w:t xml:space="preserve">   ~5.5 hr  ·  slides 10–13, A2, A4, A5, A7</w:t>
       </w:r>
     </w:p>
     <w:p>
@@ -1166,7 +1213,7 @@
         </w:numPr>
         <w:spacing w:after="20"/>
       </w:pPr>
-      <w:hyperlink w:history="1" r:id="rIdhna1etr7fe4qvuwq5nidf">
+      <w:hyperlink w:history="1" r:id="rIdzm7yhrxvkqnttmhbg8lxd">
         <w:r>
           <w:rPr>
             <w:rStyle w:val="Hyperlink"/>
@@ -1191,7 +1238,7 @@
           <w:sz w:val="21"/>
           <w:szCs w:val="21"/>
         </w:rPr>
-        <w:t xml:space="preserve">Start here. Euler–Maruyama, strong vs. weak convergence, Itô vs. Stratonovich, Milstein, with runnable code. Covers slide 8 and backup A4.</w:t>
+        <w:t xml:space="preserve">Start here. Euler–Maruyama, strong vs. weak convergence, Itô vs. Stratonovich, Milstein, with runnable code. Covers slide 10 and the solver table in A7.</w:t>
       </w:r>
     </w:p>
     <w:p>
@@ -1205,7 +1252,7 @@
         </w:numPr>
         <w:spacing w:after="20"/>
       </w:pPr>
-      <w:hyperlink w:history="1" r:id="rIdzqwnb80gt4keibikamuye">
+      <w:hyperlink w:history="1" r:id="rIditneggkt_st76cee5alyh">
         <w:r>
           <w:rPr>
             <w:rStyle w:val="Hyperlink"/>
@@ -1230,7 +1277,85 @@
           <w:sz w:val="21"/>
           <w:szCs w:val="21"/>
         </w:rPr>
-        <w:t xml:space="preserve">Read the Itô calculus chapter (Itô's lemma, Itô vs. Stratonovich) and the numerical-simulation chapter; look up Girsanov's theorem for backup A3.</w:t>
+        <w:t xml:space="preserve">Read the Itô calculus chapter (Itô's lemma, Itô vs. Stratonovich) and the numerical-simulation chapter; look up Girsanov's theorem for A3.</w:t>
+      </w:r>
+    </w:p>
+    <w:p>
+      <w:pPr>
+        <w:pStyle w:val="ListParagraph"/>
+        <w:keepNext/>
+        <w:keepLines/>
+        <w:numPr>
+          <w:ilvl w:val="0"/>
+          <w:numId w:val="2"/>
+        </w:numPr>
+        <w:spacing w:after="20"/>
+      </w:pPr>
+      <w:hyperlink w:history="1" r:id="rId_1dgx6hiud0klcd43udns">
+        <w:r>
+          <w:rPr>
+            <w:rStyle w:val="Hyperlink"/>
+          </w:rPr>
+          <w:t xml:space="preserve">Inverse Gaussian distribution</w:t>
+        </w:r>
+      </w:hyperlink>
+      <w:r>
+        <w:rPr>
+          <w:color w:val="6B7280"/>
+        </w:rPr>
+        <w:t xml:space="preserve">  ·  Reference page</w:t>
+      </w:r>
+    </w:p>
+    <w:p>
+      <w:pPr>
+        <w:spacing w:after="120"/>
+        <w:ind w:left="720"/>
+      </w:pPr>
+      <w:r>
+        <w:rPr>
+          <w:sz w:val="21"/>
+          <w:szCs w:val="21"/>
+        </w:rPr>
+        <w:t xml:space="preserve">The first-passage time of drifted Brownian motion. Know mean L/v and variance Lσ²/v³: slide 13 and A4 are built on them.</w:t>
+      </w:r>
+    </w:p>
+    <w:p>
+      <w:pPr>
+        <w:pStyle w:val="ListParagraph"/>
+        <w:keepNext/>
+        <w:keepLines/>
+        <w:numPr>
+          <w:ilvl w:val="0"/>
+          <w:numId w:val="2"/>
+        </w:numPr>
+        <w:spacing w:after="20"/>
+      </w:pPr>
+      <w:hyperlink w:history="1" r:id="rIde5qddwu3stht_o8dx0v1s">
+        <w:r>
+          <w:rPr>
+            <w:rStyle w:val="Hyperlink"/>
+          </w:rPr>
+          <w:t xml:space="preserve">Arrhenius equation and Q10</w:t>
+        </w:r>
+      </w:hyperlink>
+      <w:r>
+        <w:rPr>
+          <w:color w:val="6B7280"/>
+        </w:rPr>
+        <w:t xml:space="preserve">  ·  Reference page</w:t>
+      </w:r>
+    </w:p>
+    <w:p>
+      <w:pPr>
+        <w:spacing w:after="120"/>
+        <w:ind w:left="720"/>
+      </w:pPr>
+      <w:r>
+        <w:rPr>
+          <w:sz w:val="21"/>
+          <w:szCs w:val="21"/>
+        </w:rPr>
+        <w:t xml:space="preserve">Enough to explain how two storage temperatures pin the activation energy (slide 12, A5).</w:t>
       </w:r>
     </w:p>
     <w:p>
@@ -1249,7 +1374,7 @@
           <w:sz w:val="20"/>
           <w:szCs w:val="20"/>
         </w:rPr>
-        <w:t xml:space="preserve">   ~5 hr  ·  slides 9–12, A5</w:t>
+        <w:t xml:space="preserve">   ~5 hr  ·  slides 14–16, A6, A8</w:t>
       </w:r>
     </w:p>
     <w:p>
@@ -1263,7 +1388,7 @@
         </w:numPr>
         <w:spacing w:after="20"/>
       </w:pPr>
-      <w:hyperlink w:history="1" r:id="rIdnnuyijgcbbrtef_s7vziy">
+      <w:hyperlink w:history="1" r:id="rId4c4anspfroyhykjxbra_f">
         <w:r>
           <w:rPr>
             <w:rStyle w:val="Hyperlink"/>
@@ -1288,7 +1413,7 @@
           <w:sz w:val="21"/>
           <w:szCs w:val="21"/>
         </w:rPr>
-        <w:t xml:space="preserve">Pathwise vs. score function, and why pathwise fails on discontinuous objectives. Slide 10.</w:t>
+        <w:t xml:space="preserve">Pathwise vs. score function, and why pathwise fails on discontinuous objectives. Slide 14.</w:t>
       </w:r>
     </w:p>
     <w:p>
@@ -1302,7 +1427,7 @@
         </w:numPr>
         <w:spacing w:after="20"/>
       </w:pPr>
-      <w:hyperlink w:history="1" r:id="rIdqgcruyywbdxrhqthjg5o0">
+      <w:hyperlink w:history="1" r:id="rIdfg69p-htf_utnotu_2sks">
         <w:r>
           <w:rPr>
             <w:rStyle w:val="Hyperlink"/>
@@ -1341,7 +1466,7 @@
         </w:numPr>
         <w:spacing w:after="20"/>
       </w:pPr>
-      <w:hyperlink w:history="1" r:id="rIdoxhrpahbi9l5cjx0ojdyc">
+      <w:hyperlink w:history="1" r:id="rIdelwr3kxnsfp9x4h5sper3">
         <w:r>
           <w:rPr>
             <w:rStyle w:val="Hyperlink"/>
@@ -1366,7 +1491,7 @@
           <w:sz w:val="21"/>
           <w:szCs w:val="21"/>
         </w:rPr>
-        <w:t xml:space="preserve">Class reading. Slides 11 and 13 are built on it.</w:t>
+        <w:t xml:space="preserve">Class reading. Slides 15 and 17 are built on it.</w:t>
       </w:r>
     </w:p>
     <w:p>
@@ -1380,7 +1505,7 @@
         </w:numPr>
         <w:spacing w:after="20"/>
       </w:pPr>
-      <w:hyperlink w:history="1" r:id="rIdqz9ezhurqhlpyv08crtfw">
+      <w:hyperlink w:history="1" r:id="rIdkhz0jbgnbuegbe8qj7t57">
         <w:r>
           <w:rPr>
             <w:rStyle w:val="Hyperlink"/>
@@ -1405,7 +1530,7 @@
           <w:sz w:val="21"/>
           <w:szCs w:val="21"/>
         </w:rPr>
-        <w:t xml:space="preserve">The exact reversible adjoint (slide 11) and Brownian Interval.</w:t>
+        <w:t xml:space="preserve">The exact reversible adjoint and the Brownian Interval (slide 15).</w:t>
       </w:r>
     </w:p>
     <w:p>
@@ -1419,7 +1544,7 @@
         </w:numPr>
         <w:spacing w:after="20"/>
       </w:pPr>
-      <w:hyperlink w:history="1" r:id="rIdrktphbvz-9yqncxtb4qb3">
+      <w:hyperlink w:history="1" r:id="rIdm9-48oliejlhy55syjklj">
         <w:r>
           <w:rPr>
             <w:rStyle w:val="Hyperlink"/>
@@ -1463,7 +1588,7 @@
           <w:sz w:val="20"/>
           <w:szCs w:val="20"/>
         </w:rPr>
-        <w:t xml:space="preserve">   ~4 hr  ·  slides 13–15</w:t>
+        <w:t xml:space="preserve">   ~4 hr  ·  slides 17–18, A3</w:t>
       </w:r>
     </w:p>
     <w:p>
@@ -1477,7 +1602,7 @@
         </w:numPr>
         <w:spacing w:after="20"/>
       </w:pPr>
-      <w:hyperlink w:history="1" r:id="rIdjlm53gg_euouvz6nslxtv">
+      <w:hyperlink w:history="1" r:id="rIdphzdbtn4bnxlxtmmzda0u">
         <w:r>
           <w:rPr>
             <w:rStyle w:val="Hyperlink"/>
@@ -1502,7 +1627,7 @@
           <w:sz w:val="21"/>
           <w:szCs w:val="21"/>
         </w:rPr>
-        <w:t xml:space="preserve">Skim. The SDE-GAN card on slide 14.</w:t>
+        <w:t xml:space="preserve">Skim. The alternative to the ELBO, in case someone asks how else to train an SDE.</w:t>
       </w:r>
     </w:p>
     <w:p>
@@ -1516,7 +1641,7 @@
         </w:numPr>
         <w:spacing w:after="20"/>
       </w:pPr>
-      <w:hyperlink w:history="1" r:id="rId1gru35lz7l5lv8hrpngdq">
+      <w:hyperlink w:history="1" r:id="rIdw2ubm_oyc8xdfxm_sy7ec">
         <w:r>
           <w:rPr>
             <w:rStyle w:val="Hyperlink"/>
@@ -1555,7 +1680,7 @@
         </w:numPr>
         <w:spacing w:after="20"/>
       </w:pPr>
-      <w:hyperlink w:history="1" r:id="rIdq4xtluccurolwjo133ztj">
+      <w:hyperlink w:history="1" r:id="rIdjmzfht6ukj63l4ctjkl3e">
         <w:r>
           <w:rPr>
             <w:rStyle w:val="Hyperlink"/>
@@ -1594,7 +1719,7 @@
         </w:numPr>
         <w:spacing w:after="20"/>
       </w:pPr>
-      <w:hyperlink w:history="1" r:id="rId19i0din5kdpqpgrykbdxi">
+      <w:hyperlink w:history="1" r:id="rId6w7fx2ue-hphmsarp5xg9">
         <w:r>
           <w:rPr>
             <w:rStyle w:val="Hyperlink"/>
@@ -1638,7 +1763,7 @@
           <w:sz w:val="20"/>
           <w:szCs w:val="20"/>
         </w:rPr>
-        <w:t xml:space="preserve">   ~1.5 hr  ·  slides 17</w:t>
+        <w:t xml:space="preserve">   ~1.5 hr  ·  slides 20</w:t>
       </w:r>
     </w:p>
     <w:p>
@@ -1646,7 +1771,7 @@
         <w:spacing w:after="120"/>
       </w:pPr>
       <w:r>
-        <w:t xml:space="preserve">Abstract and main figure of each; one sentence per card, plus one follow-up answer.</w:t>
+        <w:t xml:space="preserve">Abstract and main figure of each; one sentence per table row, plus one follow-up answer.</w:t>
       </w:r>
     </w:p>
     <w:p>
@@ -1658,7 +1783,7 @@
         </w:numPr>
         <w:spacing w:after="60"/>
       </w:pPr>
-      <w:hyperlink w:history="1" r:id="rIdg0vqecvz9uzbhcwjsdunm">
+      <w:hyperlink w:history="1" r:id="rId2kzx1lip-fi0tyqkj10sb">
         <w:r>
           <w:rPr>
             <w:rStyle w:val="Hyperlink"/>
@@ -1682,7 +1807,7 @@
         </w:numPr>
         <w:spacing w:after="60"/>
       </w:pPr>
-      <w:hyperlink w:history="1" r:id="rIdowxjotoxry3dbp9fcjjcd">
+      <w:hyperlink w:history="1" r:id="rIdjybmhuisy3nmpw1hg5-tp">
         <w:r>
           <w:rPr>
             <w:rStyle w:val="Hyperlink"/>
@@ -1706,7 +1831,7 @@
         </w:numPr>
         <w:spacing w:after="60"/>
       </w:pPr>
-      <w:hyperlink w:history="1" r:id="rIdh2ganvujh5cwsvtvmvmte">
+      <w:hyperlink w:history="1" r:id="rIdhha9gi-gy0giou71xlr4q">
         <w:r>
           <w:rPr>
             <w:rStyle w:val="Hyperlink"/>
@@ -1730,7 +1855,7 @@
         </w:numPr>
         <w:spacing w:after="60"/>
       </w:pPr>
-      <w:hyperlink w:history="1" r:id="rIdglzaogv7uepuioelfiq4n">
+      <w:hyperlink w:history="1" r:id="rIdk1xly3hietx0zq1l_veu9">
         <w:r>
           <w:rPr>
             <w:rStyle w:val="Hyperlink"/>
@@ -1754,7 +1879,7 @@
         </w:numPr>
         <w:spacing w:after="60"/>
       </w:pPr>
-      <w:hyperlink w:history="1" r:id="rIdyzbgypbgqqtagpcpgc8hl">
+      <w:hyperlink w:history="1" r:id="rIduvz1kadhyolbnbczctbot">
         <w:r>
           <w:rPr>
             <w:rStyle w:val="Hyperlink"/>
@@ -1778,7 +1903,7 @@
         </w:numPr>
         <w:spacing w:after="60"/>
       </w:pPr>
-      <w:hyperlink w:history="1" r:id="rIdtshq5-6bfiejt-7susb2z">
+      <w:hyperlink w:history="1" r:id="rIdbxbynazkqu32sarvul4fv">
         <w:r>
           <w:rPr>
             <w:rStyle w:val="Hyperlink"/>
@@ -1809,7 +1934,7 @@
           <w:sz w:val="20"/>
           <w:szCs w:val="20"/>
         </w:rPr>
-        <w:t xml:space="preserve">   ~2 hr  ·  slides 11, 12</w:t>
+        <w:t xml:space="preserve">   ~2 hr  ·  slides 16, A8</w:t>
       </w:r>
     </w:p>
     <w:p>
@@ -1824,7 +1949,7 @@
       <w:r>
         <w:t xml:space="preserve">Run the </w:t>
       </w:r>
-      <w:hyperlink w:history="1" r:id="rIdedfb2xzai9eifkelf5abo">
+      <w:hyperlink w:history="1" r:id="rIdf6jxg05ahxbthkgph9aiy">
         <w:r>
           <w:rPr>
             <w:rStyle w:val="Hyperlink"/>
@@ -1868,7 +1993,7 @@
       <w:r>
         <w:t xml:space="preserve"> from the </w:t>
       </w:r>
-      <w:hyperlink w:history="1" r:id="rIdgietu8szouzy4fol4nkb3">
+      <w:hyperlink w:history="1" r:id="rIdd33hdrxzu72blycau5t98">
         <w:r>
           <w:rPr>
             <w:rStyle w:val="Hyperlink"/>
@@ -1877,7 +2002,20 @@
         </w:r>
       </w:hyperlink>
       <w:r>
-        <w:t xml:space="preserve">. These produce the numbers on slide 12.</w:t>
+        <w:t xml:space="preserve">. These produce the numbers on slide 16.</w:t>
+      </w:r>
+    </w:p>
+    <w:p>
+      <w:pPr>
+        <w:pStyle w:val="ListParagraph"/>
+        <w:numPr>
+          <w:ilvl w:val="0"/>
+          <w:numId w:val="4"/>
+        </w:numPr>
+        <w:spacing w:after="60"/>
+      </w:pPr>
+      <w:r>
+        <w:t xml:space="preserve">Recompute slide 12 and 13 yourself from Table 4 and Table 6 of the paper (10 lines of Python). If you can reproduce 2.07, 50.4 kJ/mol, 2.99 and 2.33, you can defend them.</w:t>
       </w:r>
     </w:p>
     <w:p>
@@ -1936,15 +2074,15 @@
           <w:b/>
           <w:bCs/>
         </w:rPr>
-        <w:t xml:space="preserve">Slide 5 · dh/dt = f_θ(h, t)</w:t>
-      </w:r>
-    </w:p>
-    <w:p>
-      <w:pPr>
-        <w:spacing w:after="60"/>
-      </w:pPr>
-      <w:r>
-        <w:t xml:space="preserve">A network gives the velocity of the hidden state; a solver integrates it. A ResNet block h + f(h) is one Euler step of this with step size 1.</w:t>
+        <w:t xml:space="preserve">Slide 4 · Days Left = α_g(s − 5)  ⇒  ds/dt ≈ v_g = 1/|α_g|</w:t>
+      </w:r>
+    </w:p>
+    <w:p>
+      <w:pPr>
+        <w:spacing w:after="60"/>
+      </w:pPr>
+      <w:r>
+        <w:t xml:space="preserve">The paper's per-group regression says each stage takes |α| days, so stage advances at about 1/|α| stages per day: a constant-drift ODE with no noise. 0.228 /day at 10 °C, 0.473 at 20 °C, 0.518 ambient. The inversion is approximate (slopes differ by a factor R² ≈ 0.96; stage is ordinal).</w:t>
       </w:r>
     </w:p>
     <w:p>
@@ -1957,7 +2095,49 @@
           <w:b/>
           <w:bCs/>
         </w:rPr>
-        <w:t xml:space="preserve">Slide 6 · memory table</w:t>
+        <w:t xml:space="preserve">Slide 5 · quantization floor |α|/4</w:t>
+      </w:r>
+    </w:p>
+    <w:p>
+      <w:pPr>
+        <w:spacing w:after="60"/>
+      </w:pPr>
+      <w:r>
+        <w:t xml:space="preserve">A stage lasts |α| days and one label can't say where inside it the fruit is. If the position is uniform over a window of width w, the best point guess is off by w/4 on average. That floor is 1.10, 0.53 and 0.48 days, i.e. 65%, 72% and 91% of the observed error.</w:t>
+      </w:r>
+    </w:p>
+    <w:p>
+      <w:pPr>
+        <w:keepNext/>
+        <w:spacing w:after="30" w:before="100"/>
+      </w:pPr>
+      <w:r>
+        <w:rPr>
+          <w:b/>
+          <w:bCs/>
+        </w:rPr>
+        <w:t xml:space="preserve">Slide 7 · dh/dt = f_θ(h, t)</w:t>
+      </w:r>
+    </w:p>
+    <w:p>
+      <w:pPr>
+        <w:spacing w:after="60"/>
+      </w:pPr>
+      <w:r>
+        <w:t xml:space="preserve">A network gives the velocity of the hidden state; a solver integrates it. A ResNet block h + f(h) is one Euler step of this with step size 1. The paper's model is the special case f = v_g, a constant.</w:t>
+      </w:r>
+    </w:p>
+    <w:p>
+      <w:pPr>
+        <w:keepNext/>
+        <w:spacing w:after="30" w:before="100"/>
+      </w:pPr>
+      <w:r>
+        <w:rPr>
+          <w:b/>
+          <w:bCs/>
+        </w:rPr>
+        <w:t xml:space="preserve">Slide 8 · memory table</w:t>
       </w:r>
     </w:p>
     <w:p>
@@ -1978,15 +2158,15 @@
           <w:b/>
           <w:bCs/>
         </w:rPr>
-        <w:t xml:space="preserve">Slide 7 · ȧ = −aᵀ∂f/∂z, ȧ_θ = −aᵀ∂f/∂θ</w:t>
-      </w:r>
-    </w:p>
-    <w:p>
-      <w:pPr>
-        <w:spacing w:after="60"/>
-      </w:pPr>
-      <w:r>
-        <w:t xml:space="preserve">a(t) = ∂L/∂z(t), the sensitivity of the loss to the state at time t. Integrate backward from a(T) = ∂L/∂z(T); a_θ starts at 0 at time T and its value at time 0 is dL/dθ. Each term is a vector-Jacobian product: one reverse-mode call per solver stage.</w:t>
+        <w:t xml:space="preserve">Slide 9 · ȧ = −aᵀ∂f/∂z, ȧ_θ = −aᵀ∂f/∂θ</w:t>
+      </w:r>
+    </w:p>
+    <w:p>
+      <w:pPr>
+        <w:spacing w:after="60"/>
+      </w:pPr>
+      <w:r>
+        <w:t xml:space="preserve">a(t) = ∂L/∂z(t), the sensitivity of the loss to the state at time t. Integrate backward from a(T) = ∂L/∂z(T); a_θ starts at 0 at time T and its value at time 0 is dL/dθ. Each term is a vector-Jacobian product: one reverse-mode call per solver stage. Derivation in A1.</w:t>
       </w:r>
     </w:p>
     <w:p>
@@ -1999,7 +2179,7 @@
           <w:b/>
           <w:bCs/>
         </w:rPr>
-        <w:t xml:space="preserve">Slide 8 · Z_t = Z_0 + ∫μ ds + ∫σ dW</w:t>
+        <w:t xml:space="preserve">Slide 10 · Z_t = Z_0 + ∫μ ds + ∫σ dW</w:t>
       </w:r>
     </w:p>
     <w:p>
@@ -2020,7 +2200,7 @@
           <w:b/>
           <w:bCs/>
         </w:rPr>
-        <w:t xml:space="preserve">Slide 8 · W_t − W_s ~ N(0, (t−s)I), (dW)² = dt</w:t>
+        <w:t xml:space="preserve">Slide 10 · W_t − W_s ~ N(0, (t−s)I), (dW)² = dt</w:t>
       </w:r>
     </w:p>
     <w:p>
@@ -2041,7 +2221,7 @@
           <w:b/>
           <w:bCs/>
         </w:rPr>
-        <w:t xml:space="preserve">Slide 8 · Itô's lemma</w:t>
+        <w:t xml:space="preserve">Slide 10 · Itô's lemma</w:t>
       </w:r>
     </w:p>
     <w:p>
@@ -2062,7 +2242,7 @@
           <w:b/>
           <w:bCs/>
         </w:rPr>
-        <w:t xml:space="preserve">Slide 8 · μ_Strat = μ_Itô − ½ Σ_j (∂σ_j/∂z) σ_j</w:t>
+        <w:t xml:space="preserve">Slide 10 · μ_Strat = μ_Itô − ½ Σ_j (∂σ_j/∂z) σ_j</w:t>
       </w:r>
     </w:p>
     <w:p>
@@ -2083,15 +2263,15 @@
           <w:b/>
           <w:bCs/>
         </w:rPr>
-        <w:t xml:space="preserve">Slide 8 · Euler–Maruyama orders</w:t>
-      </w:r>
-    </w:p>
-    <w:p>
-      <w:pPr>
-        <w:spacing w:after="60"/>
-      </w:pPr>
-      <w:r>
-        <w:t xml:space="preserve">Strong order ½: path error shrinks like √Δt. Weak order 1: error in expectations shrinks like Δt. Milstein adds a correction to get strong order 1.</w:t>
+        <w:t xml:space="preserve">Slide 10 · solver orders</w:t>
+      </w:r>
+    </w:p>
+    <w:p>
+      <w:pPr>
+        <w:spacing w:after="60"/>
+      </w:pPr>
+      <w:r>
+        <w:t xml:space="preserve">Euler–Maruyama: strong ½ (path error ~ √Δt), weak 1 (error in expectations ~ Δt). Milstein adds a correction for strong order 1. Reversible Heun is Stratonovich and algebraically reversible, which is what makes an exact adjoint possible. Full table in A7.</w:t>
       </w:r>
     </w:p>
     <w:p>
@@ -2104,15 +2284,15 @@
           <w:b/>
           <w:bCs/>
         </w:rPr>
-        <w:t xml:space="preserve">Slide 9 · dZ = κ(c) μ_θ dt + σ_θ dW</w:t>
-      </w:r>
-    </w:p>
-    <w:p>
-      <w:pPr>
-        <w:spacing w:after="60"/>
-      </w:pPr>
-      <w:r>
-        <w:t xml:space="preserve">Latent ripeness evolves with a learned rate scaled by a temperature factor, plus learned noise.</w:t>
+        <w:t xml:space="preserve">Slide 11 · dZ = κ(c) μ_θ dt + σ_θ dW</w:t>
+      </w:r>
+    </w:p>
+    <w:p>
+      <w:pPr>
+        <w:spacing w:after="60"/>
+      </w:pPr>
+      <w:r>
+        <w:t xml:space="preserve">Latent ripeness evolves with a learned rate scaled by a temperature factor, plus learned noise for fruit-to-fruit and day-to-day variability.</w:t>
       </w:r>
     </w:p>
     <w:p>
@@ -2125,15 +2305,15 @@
           <w:b/>
           <w:bCs/>
         </w:rPr>
-        <w:t xml:space="preserve">Slide 9 · κ(c) = exp[−(E_a/R)(1/T_c − 1/T_ref)]</w:t>
-      </w:r>
-    </w:p>
-    <w:p>
-      <w:pPr>
-        <w:spacing w:after="60"/>
-      </w:pPr>
-      <w:r>
-        <w:t xml:space="preserve">Arrhenius: reaction rates rise exponentially with temperature. E_a = activation energy, R = gas constant, T in kelvin. κ = 1 at the reference temperature.</w:t>
+        <w:t xml:space="preserve">Slide 11 · κ(c) = exp[−(E_a/R)(1/T_c − 1/T_ref)]</w:t>
+      </w:r>
+    </w:p>
+    <w:p>
+      <w:pPr>
+        <w:spacing w:after="60"/>
+      </w:pPr>
+      <w:r>
+        <w:t xml:space="preserve">Arrhenius: reaction rates rise exponentially with temperature. E_a = activation energy, R = 8.314 J/(mol·K), T in kelvin. κ = 1 at the reference temperature.</w:t>
       </w:r>
     </w:p>
     <w:p>
@@ -2146,15 +2326,15 @@
           <w:b/>
           <w:bCs/>
         </w:rPr>
-        <w:t xml:space="preserve">Slide 9 · τ = inf{t : q(Z_t) ≥ b}</w:t>
-      </w:r>
-    </w:p>
-    <w:p>
-      <w:pPr>
-        <w:spacing w:after="60"/>
-      </w:pPr>
-      <w:r>
-        <w:t xml:space="preserve">Shelf life is the first time the ripeness score crosses the stage-4 threshold. We want P(τ ≤ t* | photos, storage).</w:t>
+        <w:t xml:space="preserve">Slide 11 · p(y ≤ k | Z_t) = sigmoid(c_k − q(Z_t))</w:t>
+      </w:r>
+    </w:p>
+    <w:p>
+      <w:pPr>
+        <w:spacing w:after="60"/>
+      </w:pPr>
+      <w:r>
+        <w:t xml:space="preserve">Ordinal (cumulative-logit) head. q(Z) is a scalar ripeness score; the cut points c_1 &lt; … &lt; c_4 split it into stages 1–5. Higher q, later stage. The cut c_4 is the shelf-life barrier b.</w:t>
       </w:r>
     </w:p>
     <w:p>
@@ -2167,15 +2347,15 @@
           <w:b/>
           <w:bCs/>
         </w:rPr>
-        <w:t xml:space="preserve">Slide 10 · pathwise vs score function</w:t>
-      </w:r>
-    </w:p>
-    <w:p>
-      <w:pPr>
-        <w:spacing w:after="60"/>
-      </w:pPr>
-      <w:r>
-        <w:t xml:space="preserve">Pathwise: write Z_T as a function of θ and fixed noise, differentiate inside the expectation (needs f differentiable). Score function: E[f · ∇ log p_θ], works for any f, high variance.</w:t>
+        <w:t xml:space="preserve">Slide 11 · τ = inf{t : q(Z_t) ≥ b}</w:t>
+      </w:r>
+    </w:p>
+    <w:p>
+      <w:pPr>
+        <w:spacing w:after="60"/>
+      </w:pPr>
+      <w:r>
+        <w:t xml:space="preserve">Shelf life is the first time the ripeness score crosses into stage 5. We want P(τ ≤ t* | images so far, storage).</w:t>
       </w:r>
     </w:p>
     <w:p>
@@ -2188,15 +2368,15 @@
           <w:b/>
           <w:bCs/>
         </w:rPr>
-        <w:t xml:space="preserve">Slide 11 · stochastic adjoint</w:t>
-      </w:r>
-    </w:p>
-    <w:p>
-      <w:pPr>
-        <w:spacing w:after="60"/>
-      </w:pPr>
-      <w:r>
-        <w:t xml:space="preserve">Same as slide 7 plus a term aᵀ ∂σ_j/∂z ∘ dW^j per noise channel, driven backward by the same Brownian path. μ here is the Stratonovich drift; convert an Itô model first.</w:t>
+        <w:t xml:space="preserve">Slide 12 · E_a = R ln(v₂₀/v₁₀) / (1/T₁₀ − 1/T₂₀)</w:t>
+      </w:r>
+    </w:p>
+    <w:p>
+      <w:pPr>
+        <w:spacing w:after="60"/>
+      </w:pPr>
+      <w:r>
+        <w:t xml:space="preserve">Two temperatures pin the activation energy exactly: Q₁₀ = v₂₀/v₁₀ = 2.07 gives E_a ≈ 50.4 kJ/mol. Predicting ambient (18.7 °C): 0.431 /day, 2.32 days per stage. Observed 1.93: ambient ripens ~20% faster than temperature explains (would need 21.3 °C). Worked in A5.</w:t>
       </w:r>
     </w:p>
     <w:p>
@@ -2209,15 +2389,15 @@
           <w:b/>
           <w:bCs/>
         </w:rPr>
-        <w:t xml:space="preserve">Slide 13 · prior and posterior SDEs</w:t>
-      </w:r>
-    </w:p>
-    <w:p>
-      <w:pPr>
-        <w:spacing w:after="60"/>
-      </w:pPr>
-      <w:r>
-        <w:t xml:space="preserve">Prior: dynamics that know only the storage condition (used to forecast). Posterior: same σ, but the drift also sees the photos (used to filter during training).</w:t>
+        <w:t xml:space="preserve">Slide 13 · E τ = L/v, sd(τ) = √(Lσ²/v³)</w:t>
+      </w:r>
+    </w:p>
+    <w:p>
+      <w:pPr>
+        <w:spacing w:after="60"/>
+      </w:pPr>
+      <w:r>
+        <w:t xml:space="preserve">First-passage time of drifted Brownian motion to a barrier at distance L is inverse Gaussian. Faster drift → earlier and less spread-out crossing.</w:t>
       </w:r>
     </w:p>
     <w:p>
@@ -2230,15 +2410,15 @@
           <w:b/>
           <w:bCs/>
         </w:rPr>
-        <w:t xml:space="preserve">Slide 13 · ELBO with ∫½‖u‖² dt, σu = h_φ − h_θ</w:t>
-      </w:r>
-    </w:p>
-    <w:p>
-      <w:pPr>
-        <w:spacing w:after="60"/>
-      </w:pPr>
-      <w:r>
-        <w:t xml:space="preserve">Expected log-likelihood of observed stages minus two KLs: one for the starting state, one for the whole path. Girsanov makes the path KL the integral of ½‖u‖², where u is the drift gap measured in units of σ. Add it as an extra state and integrate.</w:t>
+        <w:t xml:space="preserve">Slide 13 · ratio formulas</w:t>
+      </w:r>
+    </w:p>
+    <w:p>
+      <w:pPr>
+        <w:spacing w:after="60"/>
+      </w:pPr>
+      <w:r>
+        <w:t xml:space="preserve">Same distance L in two groups. If σ is the same everywhere, sd ratio = (v₂₀/v₁₀)^{3/2} = 2.99. If temperature speeds up the whole clock (σ² ∝ v), ratio = v₂₀/v₁₀ = 2.07. Stage quantization alone also gives 2.07. Observed MAE ratio: 2.33, so there is extra spread at 10 °C beyond quantization, but three numbers can't pin down σ(T).</w:t>
       </w:r>
     </w:p>
     <w:p>
@@ -2251,7 +2431,91 @@
           <w:b/>
           <w:bCs/>
         </w:rPr>
-        <w:t xml:space="preserve">Slide 15 · forward, reverse, probability-flow, score matching</w:t>
+        <w:t xml:space="preserve">Slide 14 · pathwise vs score function</w:t>
+      </w:r>
+    </w:p>
+    <w:p>
+      <w:pPr>
+        <w:spacing w:after="60"/>
+      </w:pPr>
+      <w:r>
+        <w:t xml:space="preserve">Pathwise: write Z_T as a function of θ and fixed noise, differentiate inside the expectation (needs f differentiable). Score function: E[f · ∇ log p_θ], works for any f, high variance. For 1{τ ≤ t*} pathwise gives exactly zero.</w:t>
+      </w:r>
+    </w:p>
+    <w:p>
+      <w:pPr>
+        <w:keepNext/>
+        <w:spacing w:after="30" w:before="100"/>
+      </w:pPr>
+      <w:r>
+        <w:rPr>
+          <w:b/>
+          <w:bCs/>
+        </w:rPr>
+        <w:t xml:space="preserve">Slide 15 · stochastic adjoint</w:t>
+      </w:r>
+    </w:p>
+    <w:p>
+      <w:pPr>
+        <w:spacing w:after="60"/>
+      </w:pPr>
+      <w:r>
+        <w:t xml:space="preserve">Same as slide 9 plus a term aᵀ ∂σ_j/∂z ∘ dW^j per noise channel, driven backward by the same Brownian path. μ here is the Stratonovich drift; convert an Itô model first (A2).</w:t>
+      </w:r>
+    </w:p>
+    <w:p>
+      <w:pPr>
+        <w:keepNext/>
+        <w:spacing w:after="30" w:before="100"/>
+      </w:pPr>
+      <w:r>
+        <w:rPr>
+          <w:b/>
+          <w:bCs/>
+        </w:rPr>
+        <w:t xml:space="preserve">Slide 17 · prior and posterior SDEs</w:t>
+      </w:r>
+    </w:p>
+    <w:p>
+      <w:pPr>
+        <w:spacing w:after="60"/>
+      </w:pPr>
+      <w:r>
+        <w:t xml:space="preserve">Prior: dynamics that know only the storage condition (used to forecast). Posterior: same σ, but the drift also sees the images (used to filter during training).</w:t>
+      </w:r>
+    </w:p>
+    <w:p>
+      <w:pPr>
+        <w:keepNext/>
+        <w:spacing w:after="30" w:before="100"/>
+      </w:pPr>
+      <w:r>
+        <w:rPr>
+          <w:b/>
+          <w:bCs/>
+        </w:rPr>
+        <w:t xml:space="preserve">Slide 17 · ELBO with ∫½‖u‖² dt, σu = h_φ − h_θ</w:t>
+      </w:r>
+    </w:p>
+    <w:p>
+      <w:pPr>
+        <w:spacing w:after="60"/>
+      </w:pPr>
+      <w:r>
+        <w:t xml:space="preserve">Expected log-likelihood of observed stage labels minus two KLs: one for the starting state, one for the whole path. Girsanov makes the path KL the integral of ½‖u‖², where u is the drift gap measured in units of σ. Add it as an extra state and integrate. Derivation in A3.</w:t>
+      </w:r>
+    </w:p>
+    <w:p>
+      <w:pPr>
+        <w:keepNext/>
+        <w:spacing w:after="30" w:before="100"/>
+      </w:pPr>
+      <w:r>
+        <w:rPr>
+          <w:b/>
+          <w:bCs/>
+        </w:rPr>
+        <w:t xml:space="preserve">Slide 18 · forward, reverse, probability-flow, score matching</w:t>
       </w:r>
     </w:p>
     <w:p>
@@ -2272,7 +2536,28 @@
           <w:b/>
           <w:bCs/>
         </w:rPr>
-        <w:t xml:space="preserve">A5 · Brownian bridge</w:t>
+        <w:t xml:space="preserve">Slide 19 · CRPS(F, y) = ∫(F(t) − 1{y ≤ t})² dt</w:t>
+      </w:r>
+    </w:p>
+    <w:p>
+      <w:pPr>
+        <w:spacing w:after="60"/>
+      </w:pPr>
+      <w:r>
+        <w:t xml:space="preserve">Scores a whole predictive distribution of τ against the true day y. Lower is better, and it's a proper scoring rule. For a point forecast it equals the absolute error, so the paper's baseline CRPS is its MAE (1.04 days overall).</w:t>
+      </w:r>
+    </w:p>
+    <w:p>
+      <w:pPr>
+        <w:keepNext/>
+        <w:spacing w:after="30" w:before="100"/>
+      </w:pPr>
+      <w:r>
+        <w:rPr>
+          <w:b/>
+          <w:bCs/>
+        </w:rPr>
+        <w:t xml:space="preserve">A6 · Brownian bridge</w:t>
       </w:r>
     </w:p>
     <w:p>
@@ -2456,7 +2741,7 @@
         <w:spacing w:after="80"/>
       </w:pPr>
       <w:r>
-        <w:t xml:space="preserve">Two controlled temperatures (10 °C, 20 °C) can't train a free-form temperature dependence; Arrhenius is a one-parameter physical prior. Applying it only to drift is a choice; scaling diffusion by √κ is the alternative if temperature speeds up the whole clock.</w:t>
+        <w:t xml:space="preserve">Two controlled temperatures (10 °C, 20 °C) can't train a free-form temperature dependence; Arrhenius is a one-parameter physical prior (slide 12: E_a ≈ 50 kJ/mol). Applying it only to drift is a choice; scaling diffusion by √κ is the alternative if temperature speeds up the whole clock.</w:t>
       </w:r>
     </w:p>
     <w:p>
@@ -2540,7 +2825,7 @@
         <w:spacing w:after="80"/>
       </w:pPr>
       <w:r>
-        <w:t xml:space="preserve">Reparameterizing the latent space leaves the likelihood unchanged, and fast drift + small noise can mimic slow drift + big noise under sparse observations. The ordinal ripeness head anchors one direction; test by recovering a known SDE on synthetic data.</w:t>
+        <w:t xml:space="preserve">Reparameterizing the latent space leaves the likelihood unchanged, and fast drift + small noise can mimic slow drift + big noise under sparse observations. The ordinal head anchors the ripeness direction q; test by recovering a known SDE on synthetic data.</w:t>
       </w:r>
     </w:p>
     <w:p>
@@ -2553,6 +2838,132 @@
           <w:b/>
           <w:bCs/>
         </w:rPr>
+        <w:t xml:space="preserve">Isn't the paper's regression already good (R² ≈ 0.96)?</w:t>
+      </w:r>
+    </w:p>
+    <w:p>
+      <w:pPr>
+        <w:spacing w:after="80"/>
+      </w:pPr>
+      <w:r>
+        <w:t xml:space="preserve">R² measures the fit of the mean days-left per stage. The decision (sell, discount, discard by Friday) needs the spread around the mean, and Fig. 6's error bars are ±2–3 days at 10 °C.</w:t>
+      </w:r>
+    </w:p>
+    <w:p>
+      <w:pPr>
+        <w:keepNext/>
+        <w:spacing w:after="40" w:before="120"/>
+      </w:pPr>
+      <w:r>
+        <w:rPr>
+          <w:b/>
+          <w:bCs/>
+        </w:rPr>
+        <w:t xml:space="preserve">Why is ambient 20% faster than Arrhenius predicts?</w:t>
+      </w:r>
+    </w:p>
+    <w:p>
+      <w:pPr>
+        <w:spacing w:after="80"/>
+      </w:pPr>
+      <w:r>
+        <w:t xml:space="preserve">Not temperature fluctuation: with sd 1.2 °C the Jensen effect is under 1%. Likely uncontrolled humidity (not logged for Tamb) and other covariates. That's the argument for drift = κ(c) × learned residual rather than pure Arrhenius.</w:t>
+      </w:r>
+    </w:p>
+    <w:p>
+      <w:pPr>
+        <w:keepNext/>
+        <w:spacing w:after="40" w:before="120"/>
+      </w:pPr>
+      <w:r>
+        <w:rPr>
+          <w:b/>
+          <w:bCs/>
+        </w:rPr>
+        <w:t xml:space="preserve">Is two temperatures enough to fit Arrhenius?</w:t>
+      </w:r>
+    </w:p>
+    <w:p>
+      <w:pPr>
+        <w:spacing w:after="80"/>
+      </w:pPr>
+      <w:r>
+        <w:t xml:space="preserve">It determines E_a exactly but can't test the functional form, so I use it as a prior, not a law.</w:t>
+      </w:r>
+    </w:p>
+    <w:p>
+      <w:pPr>
+        <w:keepNext/>
+        <w:spacing w:after="40" w:before="120"/>
+      </w:pPr>
+      <w:r>
+        <w:rPr>
+          <w:b/>
+          <w:bCs/>
+        </w:rPr>
+        <w:t xml:space="preserve">Doesn't slide 13 prove there's diffusion?</w:t>
+      </w:r>
+    </w:p>
+    <w:p>
+      <w:pPr>
+        <w:spacing w:after="80"/>
+      </w:pPr>
+      <w:r>
+        <w:t xml:space="preserve">No. Quantization alone predicts 2.07; observed is 2.33. That excess is consistent with extra randomness at 10 °C, but it's three numbers, MAE stands in for sd, and labels are human. It's a sanity check on the shape of the model.</w:t>
+      </w:r>
+    </w:p>
+    <w:p>
+      <w:pPr>
+        <w:keepNext/>
+        <w:spacing w:after="40" w:before="120"/>
+      </w:pPr>
+      <w:r>
+        <w:rPr>
+          <w:b/>
+          <w:bCs/>
+        </w:rPr>
+        <w:t xml:space="preserve">Could a latent ODE produce spread too?</w:t>
+      </w:r>
+    </w:p>
+    <w:p>
+      <w:pPr>
+        <w:spacing w:after="80"/>
+      </w:pPr>
+      <w:r>
+        <w:t xml:space="preserve">Yes, via an uncertain initial state or per-fruit rate, and that spread grows linearly with horizon. But it collapses as images accumulate. The SDE adds noise that keeps arriving (sd ∝ √h). Fig. 6's per-stage sds could distinguish the two.</w:t>
+      </w:r>
+    </w:p>
+    <w:p>
+      <w:pPr>
+        <w:keepNext/>
+        <w:spacing w:after="40" w:before="120"/>
+      </w:pPr>
+      <w:r>
+        <w:rPr>
+          <w:b/>
+          <w:bCs/>
+        </w:rPr>
+        <w:t xml:space="preserve">Is the paper's baseline fair to compare against?</w:t>
+      </w:r>
+    </w:p>
+    <w:p>
+      <w:pPr>
+        <w:spacing w:after="80"/>
+      </w:pPr>
+      <w:r>
+        <w:t xml:space="preserve">Mostly. Caveats: the paper doesn't say whether Table 6 is test-only or whether α was fit on all fruit, and 'by sample' keeps the better of two sides. When reproducing, refit α on training fruit only.</w:t>
+      </w:r>
+    </w:p>
+    <w:p>
+      <w:pPr>
+        <w:keepNext/>
+        <w:spacing w:after="40" w:before="120"/>
+      </w:pPr>
+      <w:r>
+        <w:rPr>
+          <w:b/>
+          <w:bCs/>
+        </w:rPr>
         <w:t xml:space="preserve">Why not a sequence model with a hazard head?</w:t>
       </w:r>
     </w:p>
@@ -2561,7 +2972,7 @@
         <w:spacing w:after="80"/>
       </w:pPr>
       <w:r>
-        <w:t xml:space="preserve">It's a legitimate baseline (on the results slide). The SDE gives irregular times, uncertainty over futures and a physics-structured rate by construction.</w:t>
+        <w:t xml:space="preserve">It's a legitimate baseline (slide 6 column; add it to slide 19). The SDE gives irregular times, uncertainty over futures and a physics-structured rate by construction.</w:t>
       </w:r>
     </w:p>
     <w:p>
@@ -2584,7 +2995,7 @@
           <w:sz w:val="20"/>
           <w:szCs w:val="20"/>
         </w:rPr>
-        <w:t xml:space="preserve">The running example's images and code don't exist yet. These spots in the deck are marked PLACEHOLDER.</w:t>
+        <w:t xml:space="preserve">The running example now uses the paper's own figures and tables, so the only open items are your experiment's results.</w:t>
       </w:r>
     </w:p>
     <w:p>
@@ -2601,10 +3012,10 @@
           <w:b/>
           <w:bCs/>
         </w:rPr>
-        <w:t xml:space="preserve">Slide 2: </w:t>
-      </w:r>
-      <w:r>
-        <w:t xml:space="preserve">five photos of one avocado (same sample, days 0–8) from the dataset.</w:t>
+        <w:t xml:space="preserve">Slide 19: </w:t>
+      </w:r>
+      <w:r>
+        <w:t xml:space="preserve">the TBD cells for the latent ODE and latent SDE (MAE per group, CRPS, 80% interval coverage). Use the paper's 70/15/15 by-fruit split, refit α on training fruit, and report the median of τ for MAE.</w:t>
       </w:r>
     </w:p>
     <w:p>
@@ -2621,10 +3032,10 @@
           <w:b/>
           <w:bCs/>
         </w:rPr>
-        <w:t xml:space="preserve">Slide 9: </w:t>
-      </w:r>
-      <w:r>
-        <w:t xml:space="preserve">the image encoder from your project, and one sentence on why it suits produce.</w:t>
+        <w:t xml:space="preserve">Optional: </w:t>
+      </w:r>
+      <w:r>
+        <w:t xml:space="preserve">add a sequence-model baseline column (GRU with time gaps and a hazard head), and the per-stage sd check from Fig. 6 (does spread grow like √h or like h?).</w:t>
       </w:r>
     </w:p>
     <w:p>
@@ -2641,10 +3052,10 @@
           <w:b/>
           <w:bCs/>
         </w:rPr>
-        <w:t xml:space="preserve">Slide 16: </w:t>
-      </w:r>
-      <w:r>
-        <w:t xml:space="preserve">forecast fan chart, shelf-life calibration (reliability diagram), baselines × metrics table (C-index, Brier score, NLL), and a one-line headline. Split train/test by fruit, not by photo.</w:t>
+        <w:t xml:space="preserve">If results aren't ready: </w:t>
+      </w:r>
+      <w:r>
+        <w:t xml:space="preserve">present slide 19 as the experimental plan; the baseline column is real.</w:t>
       </w:r>
     </w:p>
     <w:p>
@@ -2661,10 +3072,10 @@
           <w:b/>
           <w:bCs/>
         </w:rPr>
-        <w:t xml:space="preserve">If results aren't ready: </w:t>
-      </w:r>
-      <w:r>
-        <w:t xml:space="preserve">keep slide 16 as 'experiment in progress' and show the schematic fan chart instead.</w:t>
+        <w:t xml:space="preserve">Figures: </w:t>
+      </w:r>
+      <w:r>
+        <w:t xml:space="preserve">the paper's figures are CC BY 3.0 and credited on each slide (cropped panels say so). The originals are in your Downloads folder.</w:t>
       </w:r>
     </w:p>
     <w:sectPr>

</xml_diff>

<commit_message>
Lecture v4: fit the 25-minute slot
- Retimed to 20:00 talk + 5:00 discussion with rehearsal checkpoints
- New minimal title slide; added a takeaways slide
- Moved the evaluation slide to appendix A9 (published data only)
- Every slide line is one line and at most 14 words
- Added a practice script PDF (slides beside speaker notes)
- Reading guide: one-week fast prep path

Co-Authored-By: Claude Opus 5.5 <noreply@anthropic.com>
Claude-Session: https://claude.ai/code/session_01D9oC41NzS6vwYLC8b14vHG
</commit_message>
<xml_diff>
--- a/lecture/neural_sde_reading_guide.docx
+++ b/lecture/neural_sde_reading_guide.docx
@@ -54,7 +54,7 @@
         <w:spacing w:after="120"/>
       </w:pPr>
       <w:r>
-        <w:t xml:space="preserve">Part 1 is the reading list for the class, ready to post with the slides. Part 2 is your prep plan, ordered to match the deck. Part 3 explains every equation on the slides in plain words. Part 4 is the questions you should be able to answer cold. Part 5 lists what's still to fill in.</w:t>
+        <w:t xml:space="preserve">Part 1 is the reading list for the class, ready to post with the slides. Part 2 is your prep plan, ordered to match the deck. Part 3 explains every equation on the slides in plain words. Part 4 is the questions you should be able to answer cold. Part 5 covers what's deliberately left out.</w:t>
       </w:r>
     </w:p>
     <w:p>
@@ -62,7 +62,7 @@
         <w:spacing w:after="120"/>
       </w:pPr>
       <w:r>
-        <w:t xml:space="preserve">Deck layout: 22 presented slides plus appendix A1–A9 (derivations, solver table, benchmark setup, credits), which you don't present but should be able to open if asked. The running example uses the paper's own figures and tables (CC BY 3.0); every number derived from them (rates, Eₐ, first-passage ratios) is worked out in A4 and A5.</w:t>
+        <w:t xml:space="preserve">Deck layout: 22 presented slides plus appendix A1–A10 (derivations, solver table, benchmark setup, evaluation protocol, credits), which you don't present but should be able to open if asked. The running example uses the paper's own figures and tables (CC BY 3.0); every number derived from them (rates, Eₐ, first-passage ratios) is worked out in A4 and A5.</w:t>
       </w:r>
     </w:p>
     <w:p>
@@ -108,7 +108,7 @@
         <w:t xml:space="preserve">style and clarity 20%</w:t>
       </w:r>
       <w:r>
-        <w:t xml:space="preserve">. Length isn't stated; last year's schedule fit two or three talks per 75-minute class. The deck runs about 23 minutes plus 5 of discussion, and slides 7 and 20 can be skipped to fit 20.</w:t>
+        <w:t xml:space="preserve">. Length isn't stated; last year's schedule fit two or three talks per 75-minute class. Each student lecture gets 25 minutes. The deck is timed to exactly that: 20:00 of talk, then 5:00 of discussion, hard stop at 25:00. If you fall behind, skip slides 7 and 19 (about 70 seconds).</w:t>
       </w:r>
     </w:p>
     <w:tbl>
@@ -420,7 +420,7 @@
           </w:tcPr>
           <w:p>
             <w:r>
-              <w:t xml:space="preserve">Send the .pptx, placeholders and all; say the results slide is in progress.</w:t>
+              <w:t xml:space="preserve">Send the .pptx, placeholders and all; the running example uses published data only.</w:t>
             </w:r>
           </w:p>
         </w:tc>
@@ -610,7 +610,7 @@
         </w:numPr>
         <w:spacing w:after="20"/>
       </w:pPr>
-      <w:hyperlink w:history="1" r:id="rIdqf0oiffn27bktxhxyjavw">
+      <w:hyperlink w:history="1" r:id="rIduzlchn5s5pjaoyytmhuup">
         <w:r>
           <w:rPr>
             <w:rStyle w:val="Hyperlink"/>
@@ -649,7 +649,7 @@
         </w:numPr>
         <w:spacing w:after="20"/>
       </w:pPr>
-      <w:hyperlink w:history="1" r:id="rId4zmdkvntcw_xf8g6edjn1">
+      <w:hyperlink w:history="1" r:id="rIdppdjw1z7e4om2rvtuz-th">
         <w:r>
           <w:rPr>
             <w:rStyle w:val="Hyperlink"/>
@@ -697,7 +697,7 @@
         </w:numPr>
         <w:spacing w:after="20"/>
       </w:pPr>
-      <w:hyperlink w:history="1" r:id="rIdgxhmywjhifcqzokjysz0p">
+      <w:hyperlink w:history="1" r:id="rIdysmnw62kj4c59uy1haa2b">
         <w:r>
           <w:rPr>
             <w:rStyle w:val="Hyperlink"/>
@@ -722,7 +722,7 @@
           <w:sz w:val="21"/>
           <w:szCs w:val="21"/>
         </w:rPr>
-        <w:t xml:space="preserve">About 20 minutes. Read the abstract, Section 2 (storage groups, ripening index, the Days Left regression) and look at Figs. 1, 2, 6 and 11 and Tables 3, 4 and 6. Slides 2–6, 12, 13 and 19 use these directly.</w:t>
+        <w:t xml:space="preserve">About 20 minutes. Read the abstract, Section 2 (storage groups, ripening index, the Days Left regression) and look at Figs. 1, 2, 6 and 11 and Tables 3, 4 and 6. Slides 2–6, 12 and 13 use these directly.</w:t>
       </w:r>
     </w:p>
     <w:p>
@@ -745,7 +745,7 @@
         </w:numPr>
         <w:spacing w:after="20"/>
       </w:pPr>
-      <w:hyperlink w:history="1" r:id="rId-fb2r9l6nnqd34oim2o8j">
+      <w:hyperlink w:history="1" r:id="rIdaqhnqbepzywjaqcs1cg5n">
         <w:r>
           <w:rPr>
             <w:rStyle w:val="Hyperlink"/>
@@ -784,7 +784,7 @@
         </w:numPr>
         <w:spacing w:after="20"/>
       </w:pPr>
-      <w:hyperlink w:history="1" r:id="rId_zix3vl60ylytxlcyhsov">
+      <w:hyperlink w:history="1" r:id="rId4rkfzctyeqrca-vlaqgek">
         <w:r>
           <w:rPr>
             <w:rStyle w:val="Hyperlink"/>
@@ -823,7 +823,7 @@
         </w:numPr>
         <w:spacing w:after="20"/>
       </w:pPr>
-      <w:hyperlink w:history="1" r:id="rIdzcsb6zerfskdmn5jrpjwn">
+      <w:hyperlink w:history="1" r:id="rIdj6b7leo1j-98n_tkixlg9">
         <w:r>
           <w:rPr>
             <w:rStyle w:val="Hyperlink"/>
@@ -862,7 +862,7 @@
         </w:numPr>
         <w:spacing w:after="20"/>
       </w:pPr>
-      <w:hyperlink w:history="1" r:id="rId40hzl6o1fqbqs14fftude">
+      <w:hyperlink w:history="1" r:id="rIdr7jw4qoagsoi202a6a_az">
         <w:r>
           <w:rPr>
             <w:rStyle w:val="Hyperlink"/>
@@ -948,10 +948,1086 @@
     </w:p>
     <w:p>
       <w:pPr>
+        <w:pStyle w:val="Heading2"/>
+        <w:keepNext/>
+      </w:pPr>
+      <w:r>
+        <w:t xml:space="preserve">If you only have a week: the fast path (~9 hours)</w:t>
+      </w:r>
+    </w:p>
+    <w:p>
+      <w:pPr>
+        <w:spacing w:after="160"/>
+      </w:pPr>
+      <w:r>
+        <w:rPr>
+          <w:i/>
+          <w:iCs/>
+          <w:color w:val="6B7280"/>
+          <w:sz w:val="20"/>
+          <w:szCs w:val="20"/>
+        </w:rPr>
+        <w:t xml:space="preserve">Do these in order. Each one covers specific slides; the full plan below goes deeper.</w:t>
+      </w:r>
+    </w:p>
+    <w:tbl>
+      <w:tblPr>
+        <w:tblW w:type="dxa" w:w="9360"/>
+        <w:tblBorders>
+          <w:top w:val="single" w:color="auto" w:sz="4"/>
+          <w:left w:val="single" w:color="auto" w:sz="4"/>
+          <w:bottom w:val="single" w:color="auto" w:sz="4"/>
+          <w:right w:val="single" w:color="auto" w:sz="4"/>
+          <w:insideH w:val="single" w:color="auto" w:sz="4"/>
+          <w:insideV w:val="single" w:color="auto" w:sz="4"/>
+        </w:tblBorders>
+      </w:tblPr>
+      <w:tblGrid>
+        <w:gridCol w:w="3700"/>
+        <w:gridCol w:w="1000"/>
+        <w:gridCol w:w="1500"/>
+        <w:gridCol w:w="3160"/>
+      </w:tblGrid>
+      <w:tr>
+        <w:trPr>
+          <w:tblHeader/>
+        </w:trPr>
+        <w:tc>
+          <w:tcPr>
+            <w:tcW w:type="dxa" w:w="3700"/>
+            <w:tcBorders>
+              <w:top w:val="single" w:color="D1D5DB" w:sz="4"/>
+              <w:left w:val="single" w:color="D1D5DB" w:sz="4"/>
+              <w:bottom w:val="single" w:color="D1D5DB" w:sz="4"/>
+              <w:right w:val="single" w:color="D1D5DB" w:sz="4"/>
+            </w:tcBorders>
+            <w:shd w:fill="1F2328" w:color="auto" w:val="clear"/>
+            <w:tcMar>
+              <w:top w:type="dxa" w:w="80"/>
+              <w:left w:type="dxa" w:w="120"/>
+              <w:bottom w:type="dxa" w:w="80"/>
+              <w:right w:type="dxa" w:w="120"/>
+            </w:tcMar>
+          </w:tcPr>
+          <w:p>
+            <w:r>
+              <w:rPr>
+                <w:b/>
+                <w:bCs/>
+                <w:color w:val="FFFFFF"/>
+              </w:rPr>
+              <w:t xml:space="preserve">Read or watch</w:t>
+            </w:r>
+          </w:p>
+        </w:tc>
+        <w:tc>
+          <w:tcPr>
+            <w:tcW w:type="dxa" w:w="1000"/>
+            <w:tcBorders>
+              <w:top w:val="single" w:color="D1D5DB" w:sz="4"/>
+              <w:left w:val="single" w:color="D1D5DB" w:sz="4"/>
+              <w:bottom w:val="single" w:color="D1D5DB" w:sz="4"/>
+              <w:right w:val="single" w:color="D1D5DB" w:sz="4"/>
+            </w:tcBorders>
+            <w:shd w:fill="1F2328" w:color="auto" w:val="clear"/>
+            <w:tcMar>
+              <w:top w:type="dxa" w:w="80"/>
+              <w:left w:type="dxa" w:w="120"/>
+              <w:bottom w:type="dxa" w:w="80"/>
+              <w:right w:type="dxa" w:w="120"/>
+            </w:tcMar>
+          </w:tcPr>
+          <w:p>
+            <w:r>
+              <w:rPr>
+                <w:b/>
+                <w:bCs/>
+                <w:color w:val="FFFFFF"/>
+              </w:rPr>
+              <w:t xml:space="preserve">Time</w:t>
+            </w:r>
+          </w:p>
+        </w:tc>
+        <w:tc>
+          <w:tcPr>
+            <w:tcW w:type="dxa" w:w="1500"/>
+            <w:tcBorders>
+              <w:top w:val="single" w:color="D1D5DB" w:sz="4"/>
+              <w:left w:val="single" w:color="D1D5DB" w:sz="4"/>
+              <w:bottom w:val="single" w:color="D1D5DB" w:sz="4"/>
+              <w:right w:val="single" w:color="D1D5DB" w:sz="4"/>
+            </w:tcBorders>
+            <w:shd w:fill="1F2328" w:color="auto" w:val="clear"/>
+            <w:tcMar>
+              <w:top w:type="dxa" w:w="80"/>
+              <w:left w:type="dxa" w:w="120"/>
+              <w:bottom w:type="dxa" w:w="80"/>
+              <w:right w:type="dxa" w:w="120"/>
+            </w:tcMar>
+          </w:tcPr>
+          <w:p>
+            <w:r>
+              <w:rPr>
+                <w:b/>
+                <w:bCs/>
+                <w:color w:val="FFFFFF"/>
+              </w:rPr>
+              <w:t xml:space="preserve">Slides</w:t>
+            </w:r>
+          </w:p>
+        </w:tc>
+        <w:tc>
+          <w:tcPr>
+            <w:tcW w:type="dxa" w:w="3160"/>
+            <w:tcBorders>
+              <w:top w:val="single" w:color="D1D5DB" w:sz="4"/>
+              <w:left w:val="single" w:color="D1D5DB" w:sz="4"/>
+              <w:bottom w:val="single" w:color="D1D5DB" w:sz="4"/>
+              <w:right w:val="single" w:color="D1D5DB" w:sz="4"/>
+            </w:tcBorders>
+            <w:shd w:fill="1F2328" w:color="auto" w:val="clear"/>
+            <w:tcMar>
+              <w:top w:type="dxa" w:w="80"/>
+              <w:left w:type="dxa" w:w="120"/>
+              <w:bottom w:type="dxa" w:w="80"/>
+              <w:right w:type="dxa" w:w="120"/>
+            </w:tcMar>
+          </w:tcPr>
+          <w:p>
+            <w:r>
+              <w:rPr>
+                <w:b/>
+                <w:bCs/>
+                <w:color w:val="FFFFFF"/>
+              </w:rPr>
+              <w:t xml:space="preserve">Why</w:t>
+            </w:r>
+          </w:p>
+        </w:tc>
+      </w:tr>
+      <w:tr>
+        <w:tc>
+          <w:tcPr>
+            <w:tcW w:type="dxa" w:w="3700"/>
+            <w:tcBorders>
+              <w:top w:val="single" w:color="D1D5DB" w:sz="4"/>
+              <w:left w:val="single" w:color="D1D5DB" w:sz="4"/>
+              <w:bottom w:val="single" w:color="D1D5DB" w:sz="4"/>
+              <w:right w:val="single" w:color="D1D5DB" w:sz="4"/>
+            </w:tcBorders>
+            <w:tcMar>
+              <w:top w:type="dxa" w:w="80"/>
+              <w:left w:type="dxa" w:w="120"/>
+              <w:bottom w:type="dxa" w:w="80"/>
+              <w:right w:type="dxa" w:w="120"/>
+            </w:tcMar>
+          </w:tcPr>
+          <w:p>
+            <w:hyperlink w:history="1" r:id="rIdwzq5x9sq50j5nahewk0lv">
+              <w:r>
+                <w:rPr>
+                  <w:rStyle w:val="Hyperlink"/>
+                </w:rPr>
+                <w:t xml:space="preserve">Xavier et al. 2024, Foods (avocado paper)</w:t>
+              </w:r>
+            </w:hyperlink>
+          </w:p>
+        </w:tc>
+        <w:tc>
+          <w:tcPr>
+            <w:tcW w:type="dxa" w:w="1000"/>
+            <w:tcBorders>
+              <w:top w:val="single" w:color="D1D5DB" w:sz="4"/>
+              <w:left w:val="single" w:color="D1D5DB" w:sz="4"/>
+              <w:bottom w:val="single" w:color="D1D5DB" w:sz="4"/>
+              <w:right w:val="single" w:color="D1D5DB" w:sz="4"/>
+            </w:tcBorders>
+            <w:tcMar>
+              <w:top w:type="dxa" w:w="80"/>
+              <w:left w:type="dxa" w:w="120"/>
+              <w:bottom w:type="dxa" w:w="80"/>
+              <w:right w:type="dxa" w:w="120"/>
+            </w:tcMar>
+          </w:tcPr>
+          <w:p>
+            <w:r>
+              <w:t xml:space="preserve">20 min</w:t>
+            </w:r>
+          </w:p>
+        </w:tc>
+        <w:tc>
+          <w:tcPr>
+            <w:tcW w:type="dxa" w:w="1500"/>
+            <w:tcBorders>
+              <w:top w:val="single" w:color="D1D5DB" w:sz="4"/>
+              <w:left w:val="single" w:color="D1D5DB" w:sz="4"/>
+              <w:bottom w:val="single" w:color="D1D5DB" w:sz="4"/>
+              <w:right w:val="single" w:color="D1D5DB" w:sz="4"/>
+            </w:tcBorders>
+            <w:tcMar>
+              <w:top w:type="dxa" w:w="80"/>
+              <w:left w:type="dxa" w:w="120"/>
+              <w:bottom w:type="dxa" w:w="80"/>
+              <w:right w:type="dxa" w:w="120"/>
+            </w:tcMar>
+          </w:tcPr>
+          <w:p>
+            <w:r>
+              <w:t xml:space="preserve">2–6, 12, 13</w:t>
+            </w:r>
+          </w:p>
+        </w:tc>
+        <w:tc>
+          <w:tcPr>
+            <w:tcW w:type="dxa" w:w="3160"/>
+            <w:tcBorders>
+              <w:top w:val="single" w:color="D1D5DB" w:sz="4"/>
+              <w:left w:val="single" w:color="D1D5DB" w:sz="4"/>
+              <w:bottom w:val="single" w:color="D1D5DB" w:sz="4"/>
+              <w:right w:val="single" w:color="D1D5DB" w:sz="4"/>
+            </w:tcBorders>
+            <w:tcMar>
+              <w:top w:type="dxa" w:w="80"/>
+              <w:left w:type="dxa" w:w="120"/>
+              <w:bottom w:type="dxa" w:w="80"/>
+              <w:right w:type="dxa" w:w="120"/>
+            </w:tcMar>
+          </w:tcPr>
+          <w:p>
+            <w:r>
+              <w:t xml:space="preserve">Every number in the running example comes from Tables 4 and 6.</w:t>
+            </w:r>
+          </w:p>
+        </w:tc>
+      </w:tr>
+      <w:tr>
+        <w:tc>
+          <w:tcPr>
+            <w:tcW w:type="dxa" w:w="3700"/>
+            <w:tcBorders>
+              <w:top w:val="single" w:color="D1D5DB" w:sz="4"/>
+              <w:left w:val="single" w:color="D1D5DB" w:sz="4"/>
+              <w:bottom w:val="single" w:color="D1D5DB" w:sz="4"/>
+              <w:right w:val="single" w:color="D1D5DB" w:sz="4"/>
+            </w:tcBorders>
+            <w:tcMar>
+              <w:top w:type="dxa" w:w="80"/>
+              <w:left w:type="dxa" w:w="120"/>
+              <w:bottom w:type="dxa" w:w="80"/>
+              <w:right w:type="dxa" w:w="120"/>
+            </w:tcMar>
+          </w:tcPr>
+          <w:p>
+            <w:hyperlink w:history="1" r:id="rIdepd5zyhnc9x2y0rrepqkn">
+              <w:r>
+                <w:rPr>
+                  <w:rStyle w:val="Hyperlink"/>
+                </w:rPr>
+                <w:t xml:space="preserve">Video: Duvenaud, Latent SDEs</w:t>
+              </w:r>
+            </w:hyperlink>
+          </w:p>
+        </w:tc>
+        <w:tc>
+          <w:tcPr>
+            <w:tcW w:type="dxa" w:w="1000"/>
+            <w:tcBorders>
+              <w:top w:val="single" w:color="D1D5DB" w:sz="4"/>
+              <w:left w:val="single" w:color="D1D5DB" w:sz="4"/>
+              <w:bottom w:val="single" w:color="D1D5DB" w:sz="4"/>
+              <w:right w:val="single" w:color="D1D5DB" w:sz="4"/>
+            </w:tcBorders>
+            <w:tcMar>
+              <w:top w:type="dxa" w:w="80"/>
+              <w:left w:type="dxa" w:w="120"/>
+              <w:bottom w:type="dxa" w:w="80"/>
+              <w:right w:type="dxa" w:w="120"/>
+            </w:tcMar>
+          </w:tcPr>
+          <w:p>
+            <w:r>
+              <w:t xml:space="preserve">1 hr</w:t>
+            </w:r>
+          </w:p>
+        </w:tc>
+        <w:tc>
+          <w:tcPr>
+            <w:tcW w:type="dxa" w:w="1500"/>
+            <w:tcBorders>
+              <w:top w:val="single" w:color="D1D5DB" w:sz="4"/>
+              <w:left w:val="single" w:color="D1D5DB" w:sz="4"/>
+              <w:bottom w:val="single" w:color="D1D5DB" w:sz="4"/>
+              <w:right w:val="single" w:color="D1D5DB" w:sz="4"/>
+            </w:tcBorders>
+            <w:tcMar>
+              <w:top w:type="dxa" w:w="80"/>
+              <w:left w:type="dxa" w:w="120"/>
+              <w:bottom w:type="dxa" w:w="80"/>
+              <w:right w:type="dxa" w:w="120"/>
+            </w:tcMar>
+          </w:tcPr>
+          <w:p>
+            <w:r>
+              <w:t xml:space="preserve">15, 17</w:t>
+            </w:r>
+          </w:p>
+        </w:tc>
+        <w:tc>
+          <w:tcPr>
+            <w:tcW w:type="dxa" w:w="3160"/>
+            <w:tcBorders>
+              <w:top w:val="single" w:color="D1D5DB" w:sz="4"/>
+              <w:left w:val="single" w:color="D1D5DB" w:sz="4"/>
+              <w:bottom w:val="single" w:color="D1D5DB" w:sz="4"/>
+              <w:right w:val="single" w:color="D1D5DB" w:sz="4"/>
+            </w:tcBorders>
+            <w:tcMar>
+              <w:top w:type="dxa" w:w="80"/>
+              <w:left w:type="dxa" w:w="120"/>
+              <w:bottom w:type="dxa" w:w="80"/>
+              <w:right w:type="dxa" w:w="120"/>
+            </w:tcMar>
+          </w:tcPr>
+          <w:p>
+            <w:r>
+              <w:t xml:space="preserve">The stochastic adjoint and latent SDE, from the author.</w:t>
+            </w:r>
+          </w:p>
+        </w:tc>
+      </w:tr>
+      <w:tr>
+        <w:tc>
+          <w:tcPr>
+            <w:tcW w:type="dxa" w:w="3700"/>
+            <w:tcBorders>
+              <w:top w:val="single" w:color="D1D5DB" w:sz="4"/>
+              <w:left w:val="single" w:color="D1D5DB" w:sz="4"/>
+              <w:bottom w:val="single" w:color="D1D5DB" w:sz="4"/>
+              <w:right w:val="single" w:color="D1D5DB" w:sz="4"/>
+            </w:tcBorders>
+            <w:tcMar>
+              <w:top w:type="dxa" w:w="80"/>
+              <w:left w:type="dxa" w:w="120"/>
+              <w:bottom w:type="dxa" w:w="80"/>
+              <w:right w:type="dxa" w:w="120"/>
+            </w:tcMar>
+          </w:tcPr>
+          <w:p>
+            <w:hyperlink w:history="1" r:id="rIdztw5f-jhdw1midzaobety">
+              <w:r>
+                <w:rPr>
+                  <w:rStyle w:val="Hyperlink"/>
+                </w:rPr>
+                <w:t xml:space="preserve">Chen et al. 2018, Neural ODEs</w:t>
+              </w:r>
+            </w:hyperlink>
+          </w:p>
+        </w:tc>
+        <w:tc>
+          <w:tcPr>
+            <w:tcW w:type="dxa" w:w="1000"/>
+            <w:tcBorders>
+              <w:top w:val="single" w:color="D1D5DB" w:sz="4"/>
+              <w:left w:val="single" w:color="D1D5DB" w:sz="4"/>
+              <w:bottom w:val="single" w:color="D1D5DB" w:sz="4"/>
+              <w:right w:val="single" w:color="D1D5DB" w:sz="4"/>
+            </w:tcBorders>
+            <w:tcMar>
+              <w:top w:type="dxa" w:w="80"/>
+              <w:left w:type="dxa" w:w="120"/>
+              <w:bottom w:type="dxa" w:w="80"/>
+              <w:right w:type="dxa" w:w="120"/>
+            </w:tcMar>
+          </w:tcPr>
+          <w:p>
+            <w:r>
+              <w:t xml:space="preserve">1 hr</w:t>
+            </w:r>
+          </w:p>
+        </w:tc>
+        <w:tc>
+          <w:tcPr>
+            <w:tcW w:type="dxa" w:w="1500"/>
+            <w:tcBorders>
+              <w:top w:val="single" w:color="D1D5DB" w:sz="4"/>
+              <w:left w:val="single" w:color="D1D5DB" w:sz="4"/>
+              <w:bottom w:val="single" w:color="D1D5DB" w:sz="4"/>
+              <w:right w:val="single" w:color="D1D5DB" w:sz="4"/>
+            </w:tcBorders>
+            <w:tcMar>
+              <w:top w:type="dxa" w:w="80"/>
+              <w:left w:type="dxa" w:w="120"/>
+              <w:bottom w:type="dxa" w:w="80"/>
+              <w:right w:type="dxa" w:w="120"/>
+            </w:tcMar>
+          </w:tcPr>
+          <w:p>
+            <w:r>
+              <w:t xml:space="preserve">7–9</w:t>
+            </w:r>
+          </w:p>
+        </w:tc>
+        <w:tc>
+          <w:tcPr>
+            <w:tcW w:type="dxa" w:w="3160"/>
+            <w:tcBorders>
+              <w:top w:val="single" w:color="D1D5DB" w:sz="4"/>
+              <w:left w:val="single" w:color="D1D5DB" w:sz="4"/>
+              <w:bottom w:val="single" w:color="D1D5DB" w:sz="4"/>
+              <w:right w:val="single" w:color="D1D5DB" w:sz="4"/>
+            </w:tcBorders>
+            <w:tcMar>
+              <w:top w:type="dxa" w:w="80"/>
+              <w:left w:type="dxa" w:w="120"/>
+              <w:bottom w:type="dxa" w:w="80"/>
+              <w:right w:type="dxa" w:w="120"/>
+            </w:tcMar>
+          </w:tcPr>
+          <w:p>
+            <w:r>
+              <w:t xml:space="preserve">Sections 1–3 and the adjoint appendix (A1).</w:t>
+            </w:r>
+          </w:p>
+        </w:tc>
+      </w:tr>
+      <w:tr>
+        <w:tc>
+          <w:tcPr>
+            <w:tcW w:type="dxa" w:w="3700"/>
+            <w:tcBorders>
+              <w:top w:val="single" w:color="D1D5DB" w:sz="4"/>
+              <w:left w:val="single" w:color="D1D5DB" w:sz="4"/>
+              <w:bottom w:val="single" w:color="D1D5DB" w:sz="4"/>
+              <w:right w:val="single" w:color="D1D5DB" w:sz="4"/>
+            </w:tcBorders>
+            <w:tcMar>
+              <w:top w:type="dxa" w:w="80"/>
+              <w:left w:type="dxa" w:w="120"/>
+              <w:bottom w:type="dxa" w:w="80"/>
+              <w:right w:type="dxa" w:w="120"/>
+            </w:tcMar>
+          </w:tcPr>
+          <w:p>
+            <w:hyperlink w:history="1" r:id="rIdao9xocgm_f5n3idwtztjq">
+              <w:r>
+                <w:rPr>
+                  <w:rStyle w:val="Hyperlink"/>
+                </w:rPr>
+                <w:t xml:space="preserve">Higham 2001, SDE simulation</w:t>
+              </w:r>
+            </w:hyperlink>
+          </w:p>
+        </w:tc>
+        <w:tc>
+          <w:tcPr>
+            <w:tcW w:type="dxa" w:w="1000"/>
+            <w:tcBorders>
+              <w:top w:val="single" w:color="D1D5DB" w:sz="4"/>
+              <w:left w:val="single" w:color="D1D5DB" w:sz="4"/>
+              <w:bottom w:val="single" w:color="D1D5DB" w:sz="4"/>
+              <w:right w:val="single" w:color="D1D5DB" w:sz="4"/>
+            </w:tcBorders>
+            <w:tcMar>
+              <w:top w:type="dxa" w:w="80"/>
+              <w:left w:type="dxa" w:w="120"/>
+              <w:bottom w:type="dxa" w:w="80"/>
+              <w:right w:type="dxa" w:w="120"/>
+            </w:tcMar>
+          </w:tcPr>
+          <w:p>
+            <w:r>
+              <w:t xml:space="preserve">1 hr</w:t>
+            </w:r>
+          </w:p>
+        </w:tc>
+        <w:tc>
+          <w:tcPr>
+            <w:tcW w:type="dxa" w:w="1500"/>
+            <w:tcBorders>
+              <w:top w:val="single" w:color="D1D5DB" w:sz="4"/>
+              <w:left w:val="single" w:color="D1D5DB" w:sz="4"/>
+              <w:bottom w:val="single" w:color="D1D5DB" w:sz="4"/>
+              <w:right w:val="single" w:color="D1D5DB" w:sz="4"/>
+            </w:tcBorders>
+            <w:tcMar>
+              <w:top w:type="dxa" w:w="80"/>
+              <w:left w:type="dxa" w:w="120"/>
+              <w:bottom w:type="dxa" w:w="80"/>
+              <w:right w:type="dxa" w:w="120"/>
+            </w:tcMar>
+          </w:tcPr>
+          <w:p>
+            <w:r>
+              <w:t xml:space="preserve">10, A7</w:t>
+            </w:r>
+          </w:p>
+        </w:tc>
+        <w:tc>
+          <w:tcPr>
+            <w:tcW w:type="dxa" w:w="3160"/>
+            <w:tcBorders>
+              <w:top w:val="single" w:color="D1D5DB" w:sz="4"/>
+              <w:left w:val="single" w:color="D1D5DB" w:sz="4"/>
+              <w:bottom w:val="single" w:color="D1D5DB" w:sz="4"/>
+              <w:right w:val="single" w:color="D1D5DB" w:sz="4"/>
+            </w:tcBorders>
+            <w:tcMar>
+              <w:top w:type="dxa" w:w="80"/>
+              <w:left w:type="dxa" w:w="120"/>
+              <w:bottom w:type="dxa" w:w="80"/>
+              <w:right w:type="dxa" w:w="120"/>
+            </w:tcMar>
+          </w:tcPr>
+          <w:p>
+            <w:r>
+              <w:t xml:space="preserve">Itô, Euler–Maruyama, strong vs. weak order, with code.</w:t>
+            </w:r>
+          </w:p>
+        </w:tc>
+      </w:tr>
+      <w:tr>
+        <w:tc>
+          <w:tcPr>
+            <w:tcW w:type="dxa" w:w="3700"/>
+            <w:tcBorders>
+              <w:top w:val="single" w:color="D1D5DB" w:sz="4"/>
+              <w:left w:val="single" w:color="D1D5DB" w:sz="4"/>
+              <w:bottom w:val="single" w:color="D1D5DB" w:sz="4"/>
+              <w:right w:val="single" w:color="D1D5DB" w:sz="4"/>
+            </w:tcBorders>
+            <w:tcMar>
+              <w:top w:type="dxa" w:w="80"/>
+              <w:left w:type="dxa" w:w="120"/>
+              <w:bottom w:type="dxa" w:w="80"/>
+              <w:right w:type="dxa" w:w="120"/>
+            </w:tcMar>
+          </w:tcPr>
+          <w:p>
+            <w:hyperlink w:history="1" r:id="rIdr4meodt4hzsjq4a-58cy3">
+              <w:r>
+                <w:rPr>
+                  <w:rStyle w:val="Hyperlink"/>
+                </w:rPr>
+                <w:t xml:space="preserve">Li et al. 2020, Scalable Gradients for SDEs</w:t>
+              </w:r>
+            </w:hyperlink>
+          </w:p>
+        </w:tc>
+        <w:tc>
+          <w:tcPr>
+            <w:tcW w:type="dxa" w:w="1000"/>
+            <w:tcBorders>
+              <w:top w:val="single" w:color="D1D5DB" w:sz="4"/>
+              <w:left w:val="single" w:color="D1D5DB" w:sz="4"/>
+              <w:bottom w:val="single" w:color="D1D5DB" w:sz="4"/>
+              <w:right w:val="single" w:color="D1D5DB" w:sz="4"/>
+            </w:tcBorders>
+            <w:tcMar>
+              <w:top w:type="dxa" w:w="80"/>
+              <w:left w:type="dxa" w:w="120"/>
+              <w:bottom w:type="dxa" w:w="80"/>
+              <w:right w:type="dxa" w:w="120"/>
+            </w:tcMar>
+          </w:tcPr>
+          <w:p>
+            <w:r>
+              <w:t xml:space="preserve">1.5 hr</w:t>
+            </w:r>
+          </w:p>
+        </w:tc>
+        <w:tc>
+          <w:tcPr>
+            <w:tcW w:type="dxa" w:w="1500"/>
+            <w:tcBorders>
+              <w:top w:val="single" w:color="D1D5DB" w:sz="4"/>
+              <w:left w:val="single" w:color="D1D5DB" w:sz="4"/>
+              <w:bottom w:val="single" w:color="D1D5DB" w:sz="4"/>
+              <w:right w:val="single" w:color="D1D5DB" w:sz="4"/>
+            </w:tcBorders>
+            <w:tcMar>
+              <w:top w:type="dxa" w:w="80"/>
+              <w:left w:type="dxa" w:w="120"/>
+              <w:bottom w:type="dxa" w:w="80"/>
+              <w:right w:type="dxa" w:w="120"/>
+            </w:tcMar>
+          </w:tcPr>
+          <w:p>
+            <w:r>
+              <w:t xml:space="preserve">15, 17, A3</w:t>
+            </w:r>
+          </w:p>
+        </w:tc>
+        <w:tc>
+          <w:tcPr>
+            <w:tcW w:type="dxa" w:w="3160"/>
+            <w:tcBorders>
+              <w:top w:val="single" w:color="D1D5DB" w:sz="4"/>
+              <w:left w:val="single" w:color="D1D5DB" w:sz="4"/>
+              <w:bottom w:val="single" w:color="D1D5DB" w:sz="4"/>
+              <w:right w:val="single" w:color="D1D5DB" w:sz="4"/>
+            </w:tcBorders>
+            <w:tcMar>
+              <w:top w:type="dxa" w:w="80"/>
+              <w:left w:type="dxa" w:w="120"/>
+              <w:bottom w:type="dxa" w:w="80"/>
+              <w:right w:type="dxa" w:w="120"/>
+            </w:tcMar>
+          </w:tcPr>
+          <w:p>
+            <w:r>
+              <w:t xml:space="preserve">Class reading: adjoint, Brownian tree, ELBO.</w:t>
+            </w:r>
+          </w:p>
+        </w:tc>
+      </w:tr>
+      <w:tr>
+        <w:tc>
+          <w:tcPr>
+            <w:tcW w:type="dxa" w:w="3700"/>
+            <w:tcBorders>
+              <w:top w:val="single" w:color="D1D5DB" w:sz="4"/>
+              <w:left w:val="single" w:color="D1D5DB" w:sz="4"/>
+              <w:bottom w:val="single" w:color="D1D5DB" w:sz="4"/>
+              <w:right w:val="single" w:color="D1D5DB" w:sz="4"/>
+            </w:tcBorders>
+            <w:tcMar>
+              <w:top w:type="dxa" w:w="80"/>
+              <w:left w:type="dxa" w:w="120"/>
+              <w:bottom w:type="dxa" w:w="80"/>
+              <w:right w:type="dxa" w:w="120"/>
+            </w:tcMar>
+          </w:tcPr>
+          <w:p>
+            <w:hyperlink w:history="1" r:id="rIdeu8rtvdwswg-vyolxc247">
+              <w:r>
+                <w:rPr>
+                  <w:rStyle w:val="Hyperlink"/>
+                </w:rPr>
+                <w:t xml:space="preserve">Mohamed et al. 2020, MC gradients</w:t>
+              </w:r>
+            </w:hyperlink>
+          </w:p>
+        </w:tc>
+        <w:tc>
+          <w:tcPr>
+            <w:tcW w:type="dxa" w:w="1000"/>
+            <w:tcBorders>
+              <w:top w:val="single" w:color="D1D5DB" w:sz="4"/>
+              <w:left w:val="single" w:color="D1D5DB" w:sz="4"/>
+              <w:bottom w:val="single" w:color="D1D5DB" w:sz="4"/>
+              <w:right w:val="single" w:color="D1D5DB" w:sz="4"/>
+            </w:tcBorders>
+            <w:tcMar>
+              <w:top w:type="dxa" w:w="80"/>
+              <w:left w:type="dxa" w:w="120"/>
+              <w:bottom w:type="dxa" w:w="80"/>
+              <w:right w:type="dxa" w:w="120"/>
+            </w:tcMar>
+          </w:tcPr>
+          <w:p>
+            <w:r>
+              <w:t xml:space="preserve">45 min</w:t>
+            </w:r>
+          </w:p>
+        </w:tc>
+        <w:tc>
+          <w:tcPr>
+            <w:tcW w:type="dxa" w:w="1500"/>
+            <w:tcBorders>
+              <w:top w:val="single" w:color="D1D5DB" w:sz="4"/>
+              <w:left w:val="single" w:color="D1D5DB" w:sz="4"/>
+              <w:bottom w:val="single" w:color="D1D5DB" w:sz="4"/>
+              <w:right w:val="single" w:color="D1D5DB" w:sz="4"/>
+            </w:tcBorders>
+            <w:tcMar>
+              <w:top w:type="dxa" w:w="80"/>
+              <w:left w:type="dxa" w:w="120"/>
+              <w:bottom w:type="dxa" w:w="80"/>
+              <w:right w:type="dxa" w:w="120"/>
+            </w:tcMar>
+          </w:tcPr>
+          <w:p>
+            <w:r>
+              <w:t xml:space="preserve">14</w:t>
+            </w:r>
+          </w:p>
+        </w:tc>
+        <w:tc>
+          <w:tcPr>
+            <w:tcW w:type="dxa" w:w="3160"/>
+            <w:tcBorders>
+              <w:top w:val="single" w:color="D1D5DB" w:sz="4"/>
+              <w:left w:val="single" w:color="D1D5DB" w:sz="4"/>
+              <w:bottom w:val="single" w:color="D1D5DB" w:sz="4"/>
+              <w:right w:val="single" w:color="D1D5DB" w:sz="4"/>
+            </w:tcBorders>
+            <w:tcMar>
+              <w:top w:type="dxa" w:w="80"/>
+              <w:left w:type="dxa" w:w="120"/>
+              <w:bottom w:type="dxa" w:w="80"/>
+              <w:right w:type="dxa" w:w="120"/>
+            </w:tcMar>
+          </w:tcPr>
+          <w:p>
+            <w:r>
+              <w:t xml:space="preserve">Pathwise vs. score function; why pathwise fails on steps.</w:t>
+            </w:r>
+          </w:p>
+        </w:tc>
+      </w:tr>
+      <w:tr>
+        <w:tc>
+          <w:tcPr>
+            <w:tcW w:type="dxa" w:w="3700"/>
+            <w:tcBorders>
+              <w:top w:val="single" w:color="D1D5DB" w:sz="4"/>
+              <w:left w:val="single" w:color="D1D5DB" w:sz="4"/>
+              <w:bottom w:val="single" w:color="D1D5DB" w:sz="4"/>
+              <w:right w:val="single" w:color="D1D5DB" w:sz="4"/>
+            </w:tcBorders>
+            <w:tcMar>
+              <w:top w:type="dxa" w:w="80"/>
+              <w:left w:type="dxa" w:w="120"/>
+              <w:bottom w:type="dxa" w:w="80"/>
+              <w:right w:type="dxa" w:w="120"/>
+            </w:tcMar>
+          </w:tcPr>
+          <w:p>
+            <w:hyperlink w:history="1" r:id="rIdzkrbqz286p0thdwjh13jt">
+              <w:r>
+                <w:rPr>
+                  <w:rStyle w:val="Hyperlink"/>
+                </w:rPr>
+                <w:t xml:space="preserve">Video: Yang Song, score-based models</w:t>
+              </w:r>
+            </w:hyperlink>
+          </w:p>
+        </w:tc>
+        <w:tc>
+          <w:tcPr>
+            <w:tcW w:type="dxa" w:w="1000"/>
+            <w:tcBorders>
+              <w:top w:val="single" w:color="D1D5DB" w:sz="4"/>
+              <w:left w:val="single" w:color="D1D5DB" w:sz="4"/>
+              <w:bottom w:val="single" w:color="D1D5DB" w:sz="4"/>
+              <w:right w:val="single" w:color="D1D5DB" w:sz="4"/>
+            </w:tcBorders>
+            <w:tcMar>
+              <w:top w:type="dxa" w:w="80"/>
+              <w:left w:type="dxa" w:w="120"/>
+              <w:bottom w:type="dxa" w:w="80"/>
+              <w:right w:type="dxa" w:w="120"/>
+            </w:tcMar>
+          </w:tcPr>
+          <w:p>
+            <w:r>
+              <w:t xml:space="preserve">1 hr</w:t>
+            </w:r>
+          </w:p>
+        </w:tc>
+        <w:tc>
+          <w:tcPr>
+            <w:tcW w:type="dxa" w:w="1500"/>
+            <w:tcBorders>
+              <w:top w:val="single" w:color="D1D5DB" w:sz="4"/>
+              <w:left w:val="single" w:color="D1D5DB" w:sz="4"/>
+              <w:bottom w:val="single" w:color="D1D5DB" w:sz="4"/>
+              <w:right w:val="single" w:color="D1D5DB" w:sz="4"/>
+            </w:tcBorders>
+            <w:tcMar>
+              <w:top w:type="dxa" w:w="80"/>
+              <w:left w:type="dxa" w:w="120"/>
+              <w:bottom w:type="dxa" w:w="80"/>
+              <w:right w:type="dxa" w:w="120"/>
+            </w:tcMar>
+          </w:tcPr>
+          <w:p>
+            <w:r>
+              <w:t xml:space="preserve">18</w:t>
+            </w:r>
+          </w:p>
+        </w:tc>
+        <w:tc>
+          <w:tcPr>
+            <w:tcW w:type="dxa" w:w="3160"/>
+            <w:tcBorders>
+              <w:top w:val="single" w:color="D1D5DB" w:sz="4"/>
+              <w:left w:val="single" w:color="D1D5DB" w:sz="4"/>
+              <w:bottom w:val="single" w:color="D1D5DB" w:sz="4"/>
+              <w:right w:val="single" w:color="D1D5DB" w:sz="4"/>
+            </w:tcBorders>
+            <w:tcMar>
+              <w:top w:type="dxa" w:w="80"/>
+              <w:left w:type="dxa" w:w="120"/>
+              <w:bottom w:type="dxa" w:w="80"/>
+              <w:right w:type="dxa" w:w="120"/>
+            </w:tcMar>
+          </w:tcPr>
+          <w:p>
+            <w:r>
+              <w:t xml:space="preserve">Diffusion models as SDEs.</w:t>
+            </w:r>
+          </w:p>
+        </w:tc>
+      </w:tr>
+      <w:tr>
+        <w:tc>
+          <w:tcPr>
+            <w:tcW w:type="dxa" w:w="3700"/>
+            <w:tcBorders>
+              <w:top w:val="single" w:color="D1D5DB" w:sz="4"/>
+              <w:left w:val="single" w:color="D1D5DB" w:sz="4"/>
+              <w:bottom w:val="single" w:color="D1D5DB" w:sz="4"/>
+              <w:right w:val="single" w:color="D1D5DB" w:sz="4"/>
+            </w:tcBorders>
+            <w:tcMar>
+              <w:top w:type="dxa" w:w="80"/>
+              <w:left w:type="dxa" w:w="120"/>
+              <w:bottom w:type="dxa" w:w="80"/>
+              <w:right w:type="dxa" w:w="120"/>
+            </w:tcMar>
+          </w:tcPr>
+          <w:p>
+            <w:hyperlink w:history="1" r:id="rIdlde91y9gmqmo_cph8tdez">
+              <w:r>
+                <w:rPr>
+                  <w:rStyle w:val="Hyperlink"/>
+                </w:rPr>
+                <w:t xml:space="preserve">Kidger thesis, neural SDE chapters</w:t>
+              </w:r>
+            </w:hyperlink>
+          </w:p>
+        </w:tc>
+        <w:tc>
+          <w:tcPr>
+            <w:tcW w:type="dxa" w:w="1000"/>
+            <w:tcBorders>
+              <w:top w:val="single" w:color="D1D5DB" w:sz="4"/>
+              <w:left w:val="single" w:color="D1D5DB" w:sz="4"/>
+              <w:bottom w:val="single" w:color="D1D5DB" w:sz="4"/>
+              <w:right w:val="single" w:color="D1D5DB" w:sz="4"/>
+            </w:tcBorders>
+            <w:tcMar>
+              <w:top w:type="dxa" w:w="80"/>
+              <w:left w:type="dxa" w:w="120"/>
+              <w:bottom w:type="dxa" w:w="80"/>
+              <w:right w:type="dxa" w:w="120"/>
+            </w:tcMar>
+          </w:tcPr>
+          <w:p>
+            <w:r>
+              <w:t xml:space="preserve">1.5 hr</w:t>
+            </w:r>
+          </w:p>
+        </w:tc>
+        <w:tc>
+          <w:tcPr>
+            <w:tcW w:type="dxa" w:w="1500"/>
+            <w:tcBorders>
+              <w:top w:val="single" w:color="D1D5DB" w:sz="4"/>
+              <w:left w:val="single" w:color="D1D5DB" w:sz="4"/>
+              <w:bottom w:val="single" w:color="D1D5DB" w:sz="4"/>
+              <w:right w:val="single" w:color="D1D5DB" w:sz="4"/>
+            </w:tcBorders>
+            <w:tcMar>
+              <w:top w:type="dxa" w:w="80"/>
+              <w:left w:type="dxa" w:w="120"/>
+              <w:bottom w:type="dxa" w:w="80"/>
+              <w:right w:type="dxa" w:w="120"/>
+            </w:tcMar>
+          </w:tcPr>
+          <w:p>
+            <w:r>
+              <w:t xml:space="preserve">15, 16, 20</w:t>
+            </w:r>
+          </w:p>
+        </w:tc>
+        <w:tc>
+          <w:tcPr>
+            <w:tcW w:type="dxa" w:w="3160"/>
+            <w:tcBorders>
+              <w:top w:val="single" w:color="D1D5DB" w:sz="4"/>
+              <w:left w:val="single" w:color="D1D5DB" w:sz="4"/>
+              <w:bottom w:val="single" w:color="D1D5DB" w:sz="4"/>
+              <w:right w:val="single" w:color="D1D5DB" w:sz="4"/>
+            </w:tcBorders>
+            <w:tcMar>
+              <w:top w:type="dxa" w:w="80"/>
+              <w:left w:type="dxa" w:w="120"/>
+              <w:bottom w:type="dxa" w:w="80"/>
+              <w:right w:type="dxa" w:w="120"/>
+            </w:tcMar>
+          </w:tcPr>
+          <w:p>
+            <w:r>
+              <w:t xml:space="preserve">Reversible Heun, exact adjoints, practical advice.</w:t>
+            </w:r>
+          </w:p>
+        </w:tc>
+      </w:tr>
+      <w:tr>
+        <w:tc>
+          <w:tcPr>
+            <w:tcW w:type="dxa" w:w="3700"/>
+            <w:tcBorders>
+              <w:top w:val="single" w:color="D1D5DB" w:sz="4"/>
+              <w:left w:val="single" w:color="D1D5DB" w:sz="4"/>
+              <w:bottom w:val="single" w:color="D1D5DB" w:sz="4"/>
+              <w:right w:val="single" w:color="D1D5DB" w:sz="4"/>
+            </w:tcBorders>
+            <w:tcMar>
+              <w:top w:type="dxa" w:w="80"/>
+              <w:left w:type="dxa" w:w="120"/>
+              <w:bottom w:type="dxa" w:w="80"/>
+              <w:right w:type="dxa" w:w="120"/>
+            </w:tcMar>
+          </w:tcPr>
+          <w:p>
+            <w:r>
+              <w:rPr>
+                <w:b/>
+                <w:bCs/>
+              </w:rPr>
+              <w:t xml:space="preserve">Rehearse 3 full runs with a timer</w:t>
+            </w:r>
+          </w:p>
+        </w:tc>
+        <w:tc>
+          <w:tcPr>
+            <w:tcW w:type="dxa" w:w="1000"/>
+            <w:tcBorders>
+              <w:top w:val="single" w:color="D1D5DB" w:sz="4"/>
+              <w:left w:val="single" w:color="D1D5DB" w:sz="4"/>
+              <w:bottom w:val="single" w:color="D1D5DB" w:sz="4"/>
+              <w:right w:val="single" w:color="D1D5DB" w:sz="4"/>
+            </w:tcBorders>
+            <w:tcMar>
+              <w:top w:type="dxa" w:w="80"/>
+              <w:left w:type="dxa" w:w="120"/>
+              <w:bottom w:type="dxa" w:w="80"/>
+              <w:right w:type="dxa" w:w="120"/>
+            </w:tcMar>
+          </w:tcPr>
+          <w:p>
+            <w:r>
+              <w:t xml:space="preserve">1.5 hr</w:t>
+            </w:r>
+          </w:p>
+        </w:tc>
+        <w:tc>
+          <w:tcPr>
+            <w:tcW w:type="dxa" w:w="1500"/>
+            <w:tcBorders>
+              <w:top w:val="single" w:color="D1D5DB" w:sz="4"/>
+              <w:left w:val="single" w:color="D1D5DB" w:sz="4"/>
+              <w:bottom w:val="single" w:color="D1D5DB" w:sz="4"/>
+              <w:right w:val="single" w:color="D1D5DB" w:sz="4"/>
+            </w:tcBorders>
+            <w:tcMar>
+              <w:top w:type="dxa" w:w="80"/>
+              <w:left w:type="dxa" w:w="120"/>
+              <w:bottom w:type="dxa" w:w="80"/>
+              <w:right w:type="dxa" w:w="120"/>
+            </w:tcMar>
+          </w:tcPr>
+          <w:p>
+            <w:r>
+              <w:t xml:space="preserve">all</w:t>
+            </w:r>
+          </w:p>
+        </w:tc>
+        <w:tc>
+          <w:tcPr>
+            <w:tcW w:type="dxa" w:w="3160"/>
+            <w:tcBorders>
+              <w:top w:val="single" w:color="D1D5DB" w:sz="4"/>
+              <w:left w:val="single" w:color="D1D5DB" w:sz="4"/>
+              <w:bottom w:val="single" w:color="D1D5DB" w:sz="4"/>
+              <w:right w:val="single" w:color="D1D5DB" w:sz="4"/>
+            </w:tcBorders>
+            <w:tcMar>
+              <w:top w:type="dxa" w:w="80"/>
+              <w:left w:type="dxa" w:w="120"/>
+              <w:bottom w:type="dxa" w:w="80"/>
+              <w:right w:type="dxa" w:w="120"/>
+            </w:tcMar>
+          </w:tcPr>
+          <w:p>
+            <w:r>
+              <w:t xml:space="preserve">Use the practice script; hit the checkpoints.</w:t>
+            </w:r>
+          </w:p>
+        </w:tc>
+      </w:tr>
+    </w:tbl>
+    <w:p>
+      <w:pPr>
         <w:spacing w:after="120"/>
       </w:pPr>
-      <w:r>
-        <w:t xml:space="preserve">About 23 hours over two weeks, in deck order. Where a stage lists a video, watch it before the paper.</w:t>
+    </w:p>
+    <w:p>
+      <w:pPr>
+        <w:pStyle w:val="Heading2"/>
+        <w:keepNext/>
+      </w:pPr>
+      <w:r>
+        <w:t xml:space="preserve">Rehearsal checkpoints</w:t>
+      </w:r>
+    </w:p>
+    <w:p>
+      <w:pPr>
+        <w:pStyle w:val="ListParagraph"/>
+        <w:numPr>
+          <w:ilvl w:val="0"/>
+          <w:numId w:val="4"/>
+        </w:numPr>
+        <w:spacing w:after="60"/>
+      </w:pPr>
+      <w:r>
+        <w:t xml:space="preserve">Slide 9 by 6:00, slide 14 by 12:15, slide 20 by 18:30, discussion by 20:00.</w:t>
+      </w:r>
+    </w:p>
+    <w:p>
+      <w:pPr>
+        <w:pStyle w:val="ListParagraph"/>
+        <w:numPr>
+          <w:ilvl w:val="0"/>
+          <w:numId w:val="4"/>
+        </w:numPr>
+        <w:spacing w:after="60"/>
+      </w:pPr>
+      <w:r>
+        <w:t xml:space="preserve">You can't see notes while presenting: each slide's bottom line is your cue for its main point.</w:t>
+      </w:r>
+    </w:p>
+    <w:p>
+      <w:pPr>
+        <w:pStyle w:val="ListParagraph"/>
+        <w:numPr>
+          <w:ilvl w:val="0"/>
+          <w:numId w:val="4"/>
+        </w:numPr>
+        <w:spacing w:after="60"/>
+      </w:pPr>
+      <w:r>
+        <w:t xml:space="preserve">Behind by more than a minute at slide 14? Skip slide 19 and shorten slide 16 to its takeaway.</w:t>
+      </w:r>
+    </w:p>
+    <w:p>
+      <w:pPr>
+        <w:pStyle w:val="Heading2"/>
+        <w:keepNext/>
+      </w:pPr>
+      <w:r>
+        <w:t xml:space="preserve">Full plan</w:t>
+      </w:r>
+    </w:p>
+    <w:p>
+      <w:pPr>
+        <w:spacing w:after="120"/>
+      </w:pPr>
+      <w:r>
+        <w:t xml:space="preserve">About 23 hours if you have two weeks, in deck order. Where a stage lists a video, watch it before the paper.</w:t>
       </w:r>
     </w:p>
     <w:p>
@@ -984,7 +2060,7 @@
         </w:numPr>
         <w:spacing w:after="20"/>
       </w:pPr>
-      <w:hyperlink w:history="1" r:id="rId6boey0p-ket4r3jnrsaht">
+      <w:hyperlink w:history="1" r:id="rIdb4ugnxujzhrpdlypubvg1">
         <w:r>
           <w:rPr>
             <w:rStyle w:val="Hyperlink"/>
@@ -1011,7 +2087,7 @@
         </w:rPr>
         <w:t xml:space="preserve">Best hands-on intro to the adjoint for people who know autodiff. </w:t>
       </w:r>
-      <w:hyperlink w:history="1" r:id="rIdpzbzdus1dbqeaxdl5cip3">
+      <w:hyperlink w:history="1" r:id="rId_5njdmyumwjvzt0n0nhvn">
         <w:r>
           <w:rPr>
             <w:rStyle w:val="Hyperlink"/>
@@ -1038,7 +2114,7 @@
         </w:numPr>
         <w:spacing w:after="20"/>
       </w:pPr>
-      <w:hyperlink w:history="1" r:id="rIdslfrifs47-nfvkpsogiwr">
+      <w:hyperlink w:history="1" r:id="rIdrbzvwhic_kibpvupqkdol">
         <w:r>
           <w:rPr>
             <w:rStyle w:val="Hyperlink"/>
@@ -1077,7 +2153,7 @@
         </w:numPr>
         <w:spacing w:after="20"/>
       </w:pPr>
-      <w:hyperlink w:history="1" r:id="rId5kumbgowcecsn7vhqlb4w">
+      <w:hyperlink w:history="1" r:id="rIdipavrhhzworqyrejnbpmc">
         <w:r>
           <w:rPr>
             <w:rStyle w:val="Hyperlink"/>
@@ -1116,7 +2192,7 @@
         </w:numPr>
         <w:spacing w:after="20"/>
       </w:pPr>
-      <w:hyperlink w:history="1" r:id="rId-uskvxwmhy1gortpa0xyb">
+      <w:hyperlink w:history="1" r:id="rId5iffgsvhjr3g9yljykxqi">
         <w:r>
           <w:rPr>
             <w:rStyle w:val="Hyperlink"/>
@@ -1141,7 +2217,7 @@
           <w:sz w:val="21"/>
           <w:szCs w:val="21"/>
         </w:rPr>
-        <w:t xml:space="preserve">The deterministic version of the avocado model (the Latent ODE column on slides 6 and 19).</w:t>
+        <w:t xml:space="preserve">The deterministic version of the avocado model (the Latent ODE column on slide 6).</w:t>
       </w:r>
     </w:p>
     <w:p>
@@ -1155,7 +2231,7 @@
         </w:numPr>
         <w:spacing w:after="20"/>
       </w:pPr>
-      <w:hyperlink w:history="1" r:id="rIdodwmk4eszznuohyj-qn7s">
+      <w:hyperlink w:history="1" r:id="rId16tkui7qtkvddp_emyt_w">
         <w:r>
           <w:rPr>
             <w:rStyle w:val="Hyperlink"/>
@@ -1180,7 +2256,7 @@
           <w:sz w:val="21"/>
           <w:szCs w:val="21"/>
         </w:rPr>
-        <w:t xml:space="preserve">When the adjoint gives wrong gradients (slide 21, first row).</w:t>
+        <w:t xml:space="preserve">When the adjoint gives wrong gradients (slide 20, first row).</w:t>
       </w:r>
     </w:p>
     <w:p>
@@ -1213,7 +2289,7 @@
         </w:numPr>
         <w:spacing w:after="20"/>
       </w:pPr>
-      <w:hyperlink w:history="1" r:id="rIdzm7yhrxvkqnttmhbg8lxd">
+      <w:hyperlink w:history="1" r:id="rIdzhhr6ioy2lyj3xjwieheu">
         <w:r>
           <w:rPr>
             <w:rStyle w:val="Hyperlink"/>
@@ -1252,7 +2328,7 @@
         </w:numPr>
         <w:spacing w:after="20"/>
       </w:pPr>
-      <w:hyperlink w:history="1" r:id="rIditneggkt_st76cee5alyh">
+      <w:hyperlink w:history="1" r:id="rIdxpe5lvrj7w2eynjndlmct">
         <w:r>
           <w:rPr>
             <w:rStyle w:val="Hyperlink"/>
@@ -1291,7 +2367,7 @@
         </w:numPr>
         <w:spacing w:after="20"/>
       </w:pPr>
-      <w:hyperlink w:history="1" r:id="rId_1dgx6hiud0klcd43udns">
+      <w:hyperlink w:history="1" r:id="rIduur7kx8nln2n0hpilrdj-">
         <w:r>
           <w:rPr>
             <w:rStyle w:val="Hyperlink"/>
@@ -1330,7 +2406,7 @@
         </w:numPr>
         <w:spacing w:after="20"/>
       </w:pPr>
-      <w:hyperlink w:history="1" r:id="rIde5qddwu3stht_o8dx0v1s">
+      <w:hyperlink w:history="1" r:id="rId_vzj5bl9zqdsbuhvtjnnd">
         <w:r>
           <w:rPr>
             <w:rStyle w:val="Hyperlink"/>
@@ -1388,7 +2464,7 @@
         </w:numPr>
         <w:spacing w:after="20"/>
       </w:pPr>
-      <w:hyperlink w:history="1" r:id="rId4c4anspfroyhykjxbra_f">
+      <w:hyperlink w:history="1" r:id="rIdamymbcxe8ft0qkkyurteh">
         <w:r>
           <w:rPr>
             <w:rStyle w:val="Hyperlink"/>
@@ -1427,7 +2503,7 @@
         </w:numPr>
         <w:spacing w:after="20"/>
       </w:pPr>
-      <w:hyperlink w:history="1" r:id="rIdfg69p-htf_utnotu_2sks">
+      <w:hyperlink w:history="1" r:id="rIdvrahtasrtiwh9mbtpg_oa">
         <w:r>
           <w:rPr>
             <w:rStyle w:val="Hyperlink"/>
@@ -1466,7 +2542,7 @@
         </w:numPr>
         <w:spacing w:after="20"/>
       </w:pPr>
-      <w:hyperlink w:history="1" r:id="rIdelwr3kxnsfp9x4h5sper3">
+      <w:hyperlink w:history="1" r:id="rIdiza4nvc2o99at2-jtiuk1">
         <w:r>
           <w:rPr>
             <w:rStyle w:val="Hyperlink"/>
@@ -1505,7 +2581,7 @@
         </w:numPr>
         <w:spacing w:after="20"/>
       </w:pPr>
-      <w:hyperlink w:history="1" r:id="rIdkhz0jbgnbuegbe8qj7t57">
+      <w:hyperlink w:history="1" r:id="rIdcf249intejpiwnqhfyj6o">
         <w:r>
           <w:rPr>
             <w:rStyle w:val="Hyperlink"/>
@@ -1544,7 +2620,7 @@
         </w:numPr>
         <w:spacing w:after="20"/>
       </w:pPr>
-      <w:hyperlink w:history="1" r:id="rIdm9-48oliejlhy55syjklj">
+      <w:hyperlink w:history="1" r:id="rIdht2iosuu5pidwk7erj1a7">
         <w:r>
           <w:rPr>
             <w:rStyle w:val="Hyperlink"/>
@@ -1602,7 +2678,7 @@
         </w:numPr>
         <w:spacing w:after="20"/>
       </w:pPr>
-      <w:hyperlink w:history="1" r:id="rIdphzdbtn4bnxlxtmmzda0u">
+      <w:hyperlink w:history="1" r:id="rIdw2027qkzzzwxm8rb039pu">
         <w:r>
           <w:rPr>
             <w:rStyle w:val="Hyperlink"/>
@@ -1641,7 +2717,7 @@
         </w:numPr>
         <w:spacing w:after="20"/>
       </w:pPr>
-      <w:hyperlink w:history="1" r:id="rIdw2ubm_oyc8xdfxm_sy7ec">
+      <w:hyperlink w:history="1" r:id="rIdvnflsjugi3iajys8kfglp">
         <w:r>
           <w:rPr>
             <w:rStyle w:val="Hyperlink"/>
@@ -1680,7 +2756,7 @@
         </w:numPr>
         <w:spacing w:after="20"/>
       </w:pPr>
-      <w:hyperlink w:history="1" r:id="rIdjmzfht6ukj63l4ctjkl3e">
+      <w:hyperlink w:history="1" r:id="rIdfpb8kwqox3ey_u6wbyfv-">
         <w:r>
           <w:rPr>
             <w:rStyle w:val="Hyperlink"/>
@@ -1719,7 +2795,7 @@
         </w:numPr>
         <w:spacing w:after="20"/>
       </w:pPr>
-      <w:hyperlink w:history="1" r:id="rId6w7fx2ue-hphmsarp5xg9">
+      <w:hyperlink w:history="1" r:id="rIduam79eudja4poka_yjbmc">
         <w:r>
           <w:rPr>
             <w:rStyle w:val="Hyperlink"/>
@@ -1763,7 +2839,7 @@
           <w:sz w:val="20"/>
           <w:szCs w:val="20"/>
         </w:rPr>
-        <w:t xml:space="preserve">   ~1.5 hr  ·  slides 20</w:t>
+        <w:t xml:space="preserve">   ~1.5 hr  ·  slides 19</w:t>
       </w:r>
     </w:p>
     <w:p>
@@ -1783,7 +2859,7 @@
         </w:numPr>
         <w:spacing w:after="60"/>
       </w:pPr>
-      <w:hyperlink w:history="1" r:id="rId2kzx1lip-fi0tyqkj10sb">
+      <w:hyperlink w:history="1" r:id="rIdm1rib24xsf-chqaw9sun8">
         <w:r>
           <w:rPr>
             <w:rStyle w:val="Hyperlink"/>
@@ -1807,7 +2883,7 @@
         </w:numPr>
         <w:spacing w:after="60"/>
       </w:pPr>
-      <w:hyperlink w:history="1" r:id="rIdjybmhuisy3nmpw1hg5-tp">
+      <w:hyperlink w:history="1" r:id="rId46w7ptkxxmcnbcnp0kd35">
         <w:r>
           <w:rPr>
             <w:rStyle w:val="Hyperlink"/>
@@ -1831,7 +2907,7 @@
         </w:numPr>
         <w:spacing w:after="60"/>
       </w:pPr>
-      <w:hyperlink w:history="1" r:id="rIdhha9gi-gy0giou71xlr4q">
+      <w:hyperlink w:history="1" r:id="rIdvunx8hk4stschw97ix6ta">
         <w:r>
           <w:rPr>
             <w:rStyle w:val="Hyperlink"/>
@@ -1855,7 +2931,7 @@
         </w:numPr>
         <w:spacing w:after="60"/>
       </w:pPr>
-      <w:hyperlink w:history="1" r:id="rIdk1xly3hietx0zq1l_veu9">
+      <w:hyperlink w:history="1" r:id="rIdrxyxt2nvzgfabvbsqtpqs">
         <w:r>
           <w:rPr>
             <w:rStyle w:val="Hyperlink"/>
@@ -1879,7 +2955,7 @@
         </w:numPr>
         <w:spacing w:after="60"/>
       </w:pPr>
-      <w:hyperlink w:history="1" r:id="rIduvz1kadhyolbnbczctbot">
+      <w:hyperlink w:history="1" r:id="rIdqy4knz4doygfrh02mwxva">
         <w:r>
           <w:rPr>
             <w:rStyle w:val="Hyperlink"/>
@@ -1903,7 +2979,7 @@
         </w:numPr>
         <w:spacing w:after="60"/>
       </w:pPr>
-      <w:hyperlink w:history="1" r:id="rIdbxbynazkqu32sarvul4fv">
+      <w:hyperlink w:history="1" r:id="rIdcstpxdus4lfscxc36_ssn">
         <w:r>
           <w:rPr>
             <w:rStyle w:val="Hyperlink"/>
@@ -1949,7 +3025,7 @@
       <w:r>
         <w:t xml:space="preserve">Run the </w:t>
       </w:r>
-      <w:hyperlink w:history="1" r:id="rIdf6jxg05ahxbthkgph9aiy">
+      <w:hyperlink w:history="1" r:id="rIdiukyhqhbxpuy6rxjttovz">
         <w:r>
           <w:rPr>
             <w:rStyle w:val="Hyperlink"/>
@@ -1993,7 +3069,7 @@
       <w:r>
         <w:t xml:space="preserve"> from the </w:t>
       </w:r>
-      <w:hyperlink w:history="1" r:id="rIdd33hdrxzu72blycau5t98">
+      <w:hyperlink w:history="1" r:id="rId8x1lcgvzepdpfrn8xbkrg">
         <w:r>
           <w:rPr>
             <w:rStyle w:val="Hyperlink"/>
@@ -2536,7 +3612,7 @@
           <w:b/>
           <w:bCs/>
         </w:rPr>
-        <w:t xml:space="preserve">Slide 19 · CRPS(F, y) = ∫(F(t) − 1{y ≤ t})² dt</w:t>
+        <w:t xml:space="preserve">A9 · CRPS(F, y) = ∫(F(t) − 1{y ≤ t})² dt</w:t>
       </w:r>
     </w:p>
     <w:p>
@@ -2972,7 +4048,7 @@
         <w:spacing w:after="80"/>
       </w:pPr>
       <w:r>
-        <w:t xml:space="preserve">It's a legitimate baseline (slide 6 column; add it to slide 19). The SDE gives irregular times, uncertainty over futures and a physics-structured rate by construction.</w:t>
+        <w:t xml:space="preserve">It's a legitimate baseline (slide 6 column). The SDE gives irregular times, uncertainty over futures and a physics-structured rate by construction.</w:t>
       </w:r>
     </w:p>
     <w:p>
@@ -2980,7 +4056,7 @@
         <w:pStyle w:val="Heading1"/>
       </w:pPr>
       <w:r>
-        <w:t xml:space="preserve">Part 5. Still to fill in</w:t>
+        <w:t xml:space="preserve">Part 5. What's not in the talk</w:t>
       </w:r>
     </w:p>
     <w:p>
@@ -2995,7 +4071,7 @@
           <w:sz w:val="20"/>
           <w:szCs w:val="20"/>
         </w:rPr>
-        <w:t xml:space="preserve">The running example now uses the paper's own figures and tables, so the only open items are your experiment's results.</w:t>
+        <w:t xml:space="preserve">The talk uses only the paper's published data. Nothing on the slides depends on new experiments.</w:t>
       </w:r>
     </w:p>
     <w:p>
@@ -3012,10 +4088,10 @@
           <w:b/>
           <w:bCs/>
         </w:rPr>
-        <w:t xml:space="preserve">Slide 19: </w:t>
-      </w:r>
-      <w:r>
-        <w:t xml:space="preserve">the TBD cells for the latent ODE and latent SDE (MAE per group, CRPS, 80% interval coverage). Use the paper's 70/15/15 by-fruit split, refit α on training fruit, and report the median of τ for MAE.</w:t>
+        <w:t xml:space="preserve">No results slide: </w:t>
+      </w:r>
+      <w:r>
+        <w:t xml:space="preserve">the evaluation plan moved to appendix A9 (baseline numbers from the paper, how a latent SDE would be scored). Open it only if asked.</w:t>
       </w:r>
     </w:p>
     <w:p>
@@ -3032,30 +4108,10 @@
           <w:b/>
           <w:bCs/>
         </w:rPr>
-        <w:t xml:space="preserve">Optional: </w:t>
-      </w:r>
-      <w:r>
-        <w:t xml:space="preserve">add a sequence-model baseline column (GRU with time gaps and a hazard head), and the per-stage sd check from Fig. 6 (does spread grow like √h or like h?).</w:t>
-      </w:r>
-    </w:p>
-    <w:p>
-      <w:pPr>
-        <w:pStyle w:val="ListParagraph"/>
-        <w:numPr>
-          <w:ilvl w:val="0"/>
-          <w:numId w:val="4"/>
-        </w:numPr>
-        <w:spacing w:after="60"/>
-      </w:pPr>
-      <w:r>
-        <w:rPr>
-          <w:b/>
-          <w:bCs/>
-        </w:rPr>
-        <w:t xml:space="preserve">If results aren't ready: </w:t>
-      </w:r>
-      <w:r>
-        <w:t xml:space="preserve">present slide 19 as the experimental plan; the baseline column is real.</w:t>
+        <w:t xml:space="preserve">If asked whether you ran the model: </w:t>
+      </w:r>
+      <w:r>
+        <w:t xml:space="preserve">say no; this lecture analyzes the paper's data with the neural-SDE lens, and your semester project is where you'll fit it.</w:t>
       </w:r>
     </w:p>
     <w:p>

</xml_diff>